<commit_message>
en vrai j'ai eu la flemme
</commit_message>
<xml_diff>
--- a/milestones/Steaming_Dev_Gossip_Design_Process_Book.docx
+++ b/milestones/Steaming_Dev_Gossip_Design_Process_Book.docx
@@ -15,7 +15,6 @@
       <w:r>
         <w:rPr>
           <w:rFonts w:ascii="Impact" w:hAnsi="Impact"/>
-          <w:noProof/>
           <w:color w:val="121214"/>
           <w:sz w:val="56"/>
         </w:rPr>
@@ -478,7 +477,16 @@
         <w:t>7</w:t>
       </w:r>
       <w:r>
-        <w:t xml:space="preserve"> / UI COMPONENT MAPPING</w:t>
+        <w:t xml:space="preserve"> / UI </w:t>
+      </w:r>
+      <w:r>
+        <w:t>Component</w:t>
+      </w:r>
+      <w:r>
+        <w:t xml:space="preserve"> </w:t>
+      </w:r>
+      <w:r>
+        <w:t>Mapping</w:t>
       </w:r>
     </w:p>
     <w:p>
@@ -501,6 +509,8 @@
         <w:ind w:left="360"/>
         <w:rPr>
           <w:rFonts w:ascii="TT Octosquares Trial" w:hAnsi="TT Octosquares Trial"/>
+          <w:b/>
+          <w:color w:val="A855F7"/>
         </w:rPr>
       </w:pPr>
       <w:r>
@@ -538,6 +548,33 @@
       </w:pPr>
       <w:r>
         <w:rPr>
+          <w:rFonts w:ascii="TT Octosquares Trial" w:hAnsi="TT Octosquares Trial"/>
+        </w:rPr>
+        <w:t>This visualisation gathers</w:t>
+      </w:r>
+      <w:r>
+        <w:rPr>
+          <w:rFonts w:ascii="TT Octosquares Trial" w:hAnsi="TT Octosquares Trial"/>
+        </w:rPr>
+        <w:t xml:space="preserve"> all relevant information about a single game. We have focused on data that helps bring together the identity of a game. In order to compare its popularity against similar games, the user can select as many filters as they want (including developers, publishers, genres and tags). A dropdown ranks by </w:t>
+      </w:r>
+      <w:r>
+        <w:rPr>
+          <w:rFonts w:ascii="TT Octosquares Trial" w:hAnsi="TT Octosquares Trial"/>
+        </w:rPr>
+        <w:t>peak CCU the first 50 games that have the same subset of filters.</w:t>
+      </w:r>
+    </w:p>
+    <w:p>
+      <w:pPr>
+        <w:spacing w:after="80"/>
+        <w:ind w:left="360"/>
+        <w:rPr>
+          <w:rFonts w:ascii="TT Octosquares Trial" w:hAnsi="TT Octosquares Trial"/>
+        </w:rPr>
+      </w:pPr>
+      <w:r>
+        <w:rPr>
           <w:rFonts w:ascii="Times New Roman" w:hAnsi="Times New Roman" w:cs="Times New Roman"/>
           <w:b/>
           <w:color w:val="A855F7"/>
@@ -558,7 +595,73 @@
           <w:b/>
           <w:color w:val="A855F7"/>
         </w:rPr>
-        <w:t>Game/Genre Comparisons:</w:t>
+        <w:t>Top Ranking</w:t>
+      </w:r>
+      <w:r>
+        <w:rPr>
+          <w:rFonts w:ascii="TT Octosquares Trial" w:hAnsi="TT Octosquares Trial"/>
+          <w:b/>
+          <w:color w:val="A855F7"/>
+        </w:rPr>
+        <w:t>:</w:t>
+      </w:r>
+    </w:p>
+    <w:p>
+      <w:pPr>
+        <w:spacing w:after="80"/>
+        <w:ind w:left="360"/>
+        <w:rPr>
+          <w:rFonts w:ascii="TT Octosquares Trial" w:hAnsi="TT Octosquares Trial"/>
+          <w:b/>
+          <w:color w:val="A855F7"/>
+        </w:rPr>
+      </w:pPr>
+      <w:r>
+        <w:rPr>
+          <w:rFonts w:ascii="Times New Roman" w:hAnsi="Times New Roman" w:cs="Times New Roman"/>
+          <w:b/>
+          <w:color w:val="A855F7"/>
+        </w:rPr>
+        <w:t>▪</w:t>
+      </w:r>
+      <w:r>
+        <w:rPr>
+          <w:rFonts w:ascii="TT Octosquares Trial" w:hAnsi="TT Octosquares Trial"/>
+          <w:b/>
+          <w:color w:val="A855F7"/>
+        </w:rPr>
+        <w:t xml:space="preserve"> Game</w:t>
+      </w:r>
+      <w:r>
+        <w:rPr>
+          <w:rFonts w:ascii="TT Octosquares Trial" w:hAnsi="TT Octosquares Trial"/>
+          <w:b/>
+          <w:color w:val="A855F7"/>
+        </w:rPr>
+        <w:t>s Overview/</w:t>
+      </w:r>
+      <w:r>
+        <w:rPr>
+          <w:rFonts w:ascii="TT Octosquares Trial" w:hAnsi="TT Octosquares Trial"/>
+          <w:b/>
+          <w:color w:val="A855F7"/>
+        </w:rPr>
+        <w:t>Comparisons:</w:t>
+      </w:r>
+    </w:p>
+    <w:p>
+      <w:pPr>
+        <w:spacing w:after="80"/>
+        <w:ind w:left="360"/>
+        <w:rPr>
+          <w:rFonts w:ascii="TT Octosquares Trial" w:hAnsi="TT Octosquares Trial"/>
+        </w:rPr>
+      </w:pPr>
+      <w:r>
+        <w:rPr>
+          <w:rFonts w:ascii="TT Octosquares Trial" w:hAnsi="TT Octosquares Trial"/>
+        </w:rPr>
+        <w:t>We have used here a parallel-coordinates plot to represent different dimensions over the entire dataset of games. Various interactive features allow the user to narrow down the games visible on the graph by using a brush selection on the dimension axes and/or selecting a game tag to filter out different games. A hover functionality also shows the name of any specific game on the graph.</w:t>
       </w:r>
     </w:p>
     <w:p>
@@ -606,7 +709,10 @@
         <w:t xml:space="preserve">8 </w:t>
       </w:r>
       <w:r>
-        <w:t>/ INTERFACE WIREFRAMES</w:t>
+        <w:t xml:space="preserve">/ </w:t>
+      </w:r>
+      <w:r>
+        <w:t>Interface Wireframes</w:t>
       </w:r>
     </w:p>
     <w:p>
@@ -691,7 +797,7 @@
 <w:ftr xmlns:wpc="http://schemas.microsoft.com/office/word/2010/wordprocessingCanvas" xmlns:cx="http://schemas.microsoft.com/office/drawing/2014/chartex" xmlns:cx1="http://schemas.microsoft.com/office/drawing/2015/9/8/chartex" xmlns:cx2="http://schemas.microsoft.com/office/drawing/2015/10/21/chartex" xmlns:cx3="http://schemas.microsoft.com/office/drawing/2016/5/9/chartex" xmlns:cx4="http://schemas.microsoft.com/office/drawing/2016/5/10/chartex" xmlns:cx5="http://schemas.microsoft.com/office/drawing/2016/5/11/chartex" xmlns:cx6="http://schemas.microsoft.com/office/drawing/2016/5/12/chartex" xmlns:cx7="http://schemas.microsoft.com/office/drawing/2016/5/13/chartex" xmlns:cx8="http://schemas.microsoft.com/office/drawing/2016/5/14/chartex" xmlns:mc="http://schemas.openxmlformats.org/markup-compatibility/2006" xmlns:aink="http://schemas.microsoft.com/office/drawing/2016/ink" xmlns:am3d="http://schemas.microsoft.com/office/drawing/2017/model3d" xmlns:o="urn:schemas-microsoft-com:office:office" xmlns:oel="http://schemas.microsoft.com/office/2019/extlst" xmlns:r="http://schemas.openxmlformats.org/officeDocument/2006/relationships" xmlns:m="http://schemas.openxmlformats.org/officeDocument/2006/math" xmlns:v="urn:schemas-microsoft-com:vml" xmlns:wp14="http://schemas.microsoft.com/office/word/2010/wordprocessingDrawing" xmlns:wp="http://schemas.openxmlformats.org/drawingml/2006/wordprocessingDrawing" xmlns:w10="urn:schemas-microsoft-com:office:word" xmlns:w="http://schemas.openxmlformats.org/wordprocessingml/2006/main" xmlns:w14="http://schemas.microsoft.com/office/word/2010/wordml" xmlns:w15="http://schemas.microsoft.com/office/word/2012/wordml" xmlns:w16cex="http://schemas.microsoft.com/office/word/2018/wordml/cex" xmlns:w16cid="http://schemas.microsoft.com/office/word/2016/wordml/cid" xmlns:w16="http://schemas.microsoft.com/office/word/2018/wordml" xmlns:w16du="http://schemas.microsoft.com/office/word/2023/wordml/word16du" xmlns:w16sdtdh="http://schemas.microsoft.com/office/word/2020/wordml/sdtdatahash" xmlns:w16sdtfl="http://schemas.microsoft.com/office/word/2024/wordml/sdtformatlock" xmlns:w16se="http://schemas.microsoft.com/office/word/2015/wordml/symex" xmlns:wpg="http://schemas.microsoft.com/office/word/2010/wordprocessingGroup" xmlns:wpi="http://schemas.microsoft.com/office/word/2010/wordprocessingInk" xmlns:wne="http://schemas.microsoft.com/office/word/2006/wordml" xmlns:wps="http://schemas.microsoft.com/office/word/2010/wordprocessingShape" mc:Ignorable="w14 w15 w16se w16cid w16 w16cex w16sdtdh w16sdtfl w16du wp14">
   <w:p>
     <w:pPr>
-      <w:pStyle w:val="Pieddepage"/>
+      <w:pStyle w:val="Footer"/>
       <w:jc w:val="right"/>
       <w:rPr>
         <w:rFonts w:ascii="TT Octosquares Trial" w:hAnsi="TT Octosquares Trial"/>
@@ -726,7 +832,6 @@
     <w:r>
       <w:rPr>
         <w:rFonts w:ascii="TT Octosquares Trial" w:hAnsi="TT Octosquares Trial"/>
-        <w:noProof/>
       </w:rPr>
       <w:t>1</w:t>
     </w:r>
@@ -808,7 +913,7 @@
     <w:lvl w:ilvl="0">
       <w:start w:val="1"/>
       <w:numFmt w:val="decimal"/>
-      <w:pStyle w:val="Listenumros3"/>
+      <w:pStyle w:val="ListNumber3"/>
       <w:lvlText w:val="%1."/>
       <w:lvlJc w:val="left"/>
       <w:pPr>
@@ -826,7 +931,7 @@
     <w:lvl w:ilvl="0">
       <w:start w:val="1"/>
       <w:numFmt w:val="decimal"/>
-      <w:pStyle w:val="Listenumros2"/>
+      <w:pStyle w:val="ListNumber2"/>
       <w:lvlText w:val="%1."/>
       <w:lvlJc w:val="left"/>
       <w:pPr>
@@ -864,7 +969,7 @@
     <w:lvl w:ilvl="0">
       <w:start w:val="1"/>
       <w:numFmt w:val="bullet"/>
-      <w:pStyle w:val="Listepuces3"/>
+      <w:pStyle w:val="ListBullet3"/>
       <w:lvlText w:val=""/>
       <w:lvlJc w:val="left"/>
       <w:pPr>
@@ -885,7 +990,7 @@
     <w:lvl w:ilvl="0">
       <w:start w:val="1"/>
       <w:numFmt w:val="bullet"/>
-      <w:pStyle w:val="Listepuces2"/>
+      <w:pStyle w:val="ListBullet2"/>
       <w:lvlText w:val=""/>
       <w:lvlJc w:val="left"/>
       <w:pPr>
@@ -906,7 +1011,7 @@
     <w:lvl w:ilvl="0">
       <w:start w:val="1"/>
       <w:numFmt w:val="decimal"/>
-      <w:pStyle w:val="Listenumros"/>
+      <w:pStyle w:val="ListNumber"/>
       <w:lvlText w:val="%1."/>
       <w:lvlJc w:val="left"/>
       <w:pPr>
@@ -924,7 +1029,7 @@
     <w:lvl w:ilvl="0">
       <w:start w:val="1"/>
       <w:numFmt w:val="bullet"/>
-      <w:pStyle w:val="Listepuces"/>
+      <w:pStyle w:val="ListBullet"/>
       <w:lvlText w:val=""/>
       <w:lvlJc w:val="left"/>
       <w:pPr>
@@ -1358,12 +1463,15 @@
     <w:name w:val="Normal"/>
     <w:qFormat/>
     <w:rsid w:val="00FC693F"/>
-  </w:style>
-  <w:style w:type="paragraph" w:styleId="Titre1">
+    <w:rPr>
+      <w:lang w:val="en-GB"/>
+    </w:rPr>
+  </w:style>
+  <w:style w:type="paragraph" w:styleId="Heading1">
     <w:name w:val="heading 1"/>
     <w:basedOn w:val="Normal"/>
     <w:next w:val="Normal"/>
-    <w:link w:val="Titre1Car"/>
+    <w:link w:val="Heading1Char"/>
     <w:uiPriority w:val="9"/>
     <w:qFormat/>
     <w:rsid w:val="00FC693F"/>
@@ -1382,11 +1490,11 @@
       <w:szCs w:val="28"/>
     </w:rPr>
   </w:style>
-  <w:style w:type="paragraph" w:styleId="Titre2">
+  <w:style w:type="paragraph" w:styleId="Heading2">
     <w:name w:val="heading 2"/>
     <w:basedOn w:val="Normal"/>
     <w:next w:val="Normal"/>
-    <w:link w:val="Titre2Car"/>
+    <w:link w:val="Heading2Char"/>
     <w:uiPriority w:val="9"/>
     <w:unhideWhenUsed/>
     <w:qFormat/>
@@ -1406,11 +1514,11 @@
       <w:szCs w:val="26"/>
     </w:rPr>
   </w:style>
-  <w:style w:type="paragraph" w:styleId="Titre3">
+  <w:style w:type="paragraph" w:styleId="Heading3">
     <w:name w:val="heading 3"/>
     <w:basedOn w:val="Normal"/>
     <w:next w:val="Normal"/>
-    <w:link w:val="Titre3Car"/>
+    <w:link w:val="Heading3Char"/>
     <w:uiPriority w:val="9"/>
     <w:unhideWhenUsed/>
     <w:qFormat/>
@@ -1428,11 +1536,11 @@
       <w:color w:val="4F81BD" w:themeColor="accent1"/>
     </w:rPr>
   </w:style>
-  <w:style w:type="paragraph" w:styleId="Titre4">
+  <w:style w:type="paragraph" w:styleId="Heading4">
     <w:name w:val="heading 4"/>
     <w:basedOn w:val="Normal"/>
     <w:next w:val="Normal"/>
-    <w:link w:val="Titre4Car"/>
+    <w:link w:val="Heading4Char"/>
     <w:uiPriority w:val="9"/>
     <w:semiHidden/>
     <w:unhideWhenUsed/>
@@ -1453,11 +1561,11 @@
       <w:color w:val="4F81BD" w:themeColor="accent1"/>
     </w:rPr>
   </w:style>
-  <w:style w:type="paragraph" w:styleId="Titre5">
+  <w:style w:type="paragraph" w:styleId="Heading5">
     <w:name w:val="heading 5"/>
     <w:basedOn w:val="Normal"/>
     <w:next w:val="Normal"/>
-    <w:link w:val="Titre5Car"/>
+    <w:link w:val="Heading5Char"/>
     <w:uiPriority w:val="9"/>
     <w:semiHidden/>
     <w:unhideWhenUsed/>
@@ -1474,11 +1582,11 @@
       <w:color w:val="243F60" w:themeColor="accent1" w:themeShade="7F"/>
     </w:rPr>
   </w:style>
-  <w:style w:type="paragraph" w:styleId="Titre6">
+  <w:style w:type="paragraph" w:styleId="Heading6">
     <w:name w:val="heading 6"/>
     <w:basedOn w:val="Normal"/>
     <w:next w:val="Normal"/>
-    <w:link w:val="Titre6Car"/>
+    <w:link w:val="Heading6Char"/>
     <w:uiPriority w:val="9"/>
     <w:semiHidden/>
     <w:unhideWhenUsed/>
@@ -1497,11 +1605,11 @@
       <w:color w:val="243F60" w:themeColor="accent1" w:themeShade="7F"/>
     </w:rPr>
   </w:style>
-  <w:style w:type="paragraph" w:styleId="Titre7">
+  <w:style w:type="paragraph" w:styleId="Heading7">
     <w:name w:val="heading 7"/>
     <w:basedOn w:val="Normal"/>
     <w:next w:val="Normal"/>
-    <w:link w:val="Titre7Car"/>
+    <w:link w:val="Heading7Char"/>
     <w:uiPriority w:val="9"/>
     <w:semiHidden/>
     <w:unhideWhenUsed/>
@@ -1520,11 +1628,11 @@
       <w:color w:val="404040" w:themeColor="text1" w:themeTint="BF"/>
     </w:rPr>
   </w:style>
-  <w:style w:type="paragraph" w:styleId="Titre8">
+  <w:style w:type="paragraph" w:styleId="Heading8">
     <w:name w:val="heading 8"/>
     <w:basedOn w:val="Normal"/>
     <w:next w:val="Normal"/>
-    <w:link w:val="Titre8Car"/>
+    <w:link w:val="Heading8Char"/>
     <w:uiPriority w:val="9"/>
     <w:semiHidden/>
     <w:unhideWhenUsed/>
@@ -1543,11 +1651,11 @@
       <w:szCs w:val="20"/>
     </w:rPr>
   </w:style>
-  <w:style w:type="paragraph" w:styleId="Titre9">
+  <w:style w:type="paragraph" w:styleId="Heading9">
     <w:name w:val="heading 9"/>
     <w:basedOn w:val="Normal"/>
     <w:next w:val="Normal"/>
-    <w:link w:val="Titre9Car"/>
+    <w:link w:val="Heading9Char"/>
     <w:uiPriority w:val="9"/>
     <w:semiHidden/>
     <w:unhideWhenUsed/>
@@ -1568,13 +1676,13 @@
       <w:szCs w:val="20"/>
     </w:rPr>
   </w:style>
-  <w:style w:type="character" w:default="1" w:styleId="Policepardfaut">
+  <w:style w:type="character" w:default="1" w:styleId="DefaultParagraphFont">
     <w:name w:val="Default Paragraph Font"/>
     <w:uiPriority w:val="1"/>
     <w:semiHidden/>
     <w:unhideWhenUsed/>
   </w:style>
-  <w:style w:type="table" w:default="1" w:styleId="TableauNormal">
+  <w:style w:type="table" w:default="1" w:styleId="TableNormal">
     <w:name w:val="Normal Table"/>
     <w:uiPriority w:val="99"/>
     <w:semiHidden/>
@@ -1589,16 +1697,16 @@
       </w:tblCellMar>
     </w:tblPr>
   </w:style>
-  <w:style w:type="numbering" w:default="1" w:styleId="Aucuneliste">
+  <w:style w:type="numbering" w:default="1" w:styleId="NoList">
     <w:name w:val="No List"/>
     <w:uiPriority w:val="99"/>
     <w:semiHidden/>
     <w:unhideWhenUsed/>
   </w:style>
-  <w:style w:type="paragraph" w:styleId="En-tte">
+  <w:style w:type="paragraph" w:styleId="Header">
     <w:name w:val="header"/>
     <w:basedOn w:val="Normal"/>
-    <w:link w:val="En-tteCar"/>
+    <w:link w:val="HeaderChar"/>
     <w:uiPriority w:val="99"/>
     <w:unhideWhenUsed/>
     <w:rsid w:val="00E618BF"/>
@@ -1610,17 +1718,17 @@
       <w:spacing w:after="0" w:line="240" w:lineRule="auto"/>
     </w:pPr>
   </w:style>
-  <w:style w:type="character" w:customStyle="1" w:styleId="En-tteCar">
-    <w:name w:val="En-tête Car"/>
-    <w:basedOn w:val="Policepardfaut"/>
-    <w:link w:val="En-tte"/>
+  <w:style w:type="character" w:customStyle="1" w:styleId="HeaderChar">
+    <w:name w:val="Header Char"/>
+    <w:basedOn w:val="DefaultParagraphFont"/>
+    <w:link w:val="Header"/>
     <w:uiPriority w:val="99"/>
     <w:rsid w:val="00E618BF"/>
   </w:style>
-  <w:style w:type="paragraph" w:styleId="Pieddepage">
+  <w:style w:type="paragraph" w:styleId="Footer">
     <w:name w:val="footer"/>
     <w:basedOn w:val="Normal"/>
-    <w:link w:val="PieddepageCar"/>
+    <w:link w:val="FooterChar"/>
     <w:uiPriority w:val="99"/>
     <w:unhideWhenUsed/>
     <w:rsid w:val="00E618BF"/>
@@ -1632,14 +1740,14 @@
       <w:spacing w:after="0" w:line="240" w:lineRule="auto"/>
     </w:pPr>
   </w:style>
-  <w:style w:type="character" w:customStyle="1" w:styleId="PieddepageCar">
-    <w:name w:val="Pied de page Car"/>
-    <w:basedOn w:val="Policepardfaut"/>
-    <w:link w:val="Pieddepage"/>
+  <w:style w:type="character" w:customStyle="1" w:styleId="FooterChar">
+    <w:name w:val="Footer Char"/>
+    <w:basedOn w:val="DefaultParagraphFont"/>
+    <w:link w:val="Footer"/>
     <w:uiPriority w:val="99"/>
     <w:rsid w:val="00E618BF"/>
   </w:style>
-  <w:style w:type="paragraph" w:styleId="Sansinterligne">
+  <w:style w:type="paragraph" w:styleId="NoSpacing">
     <w:name w:val="No Spacing"/>
     <w:uiPriority w:val="1"/>
     <w:qFormat/>
@@ -1648,10 +1756,10 @@
       <w:spacing w:after="0" w:line="240" w:lineRule="auto"/>
     </w:pPr>
   </w:style>
-  <w:style w:type="character" w:customStyle="1" w:styleId="Titre1Car">
-    <w:name w:val="Titre 1 Car"/>
-    <w:basedOn w:val="Policepardfaut"/>
-    <w:link w:val="Titre1"/>
+  <w:style w:type="character" w:customStyle="1" w:styleId="Heading1Char">
+    <w:name w:val="Heading 1 Char"/>
+    <w:basedOn w:val="DefaultParagraphFont"/>
+    <w:link w:val="Heading1"/>
     <w:uiPriority w:val="9"/>
     <w:rsid w:val="00FC693F"/>
     <w:rPr>
@@ -1663,10 +1771,10 @@
       <w:szCs w:val="28"/>
     </w:rPr>
   </w:style>
-  <w:style w:type="character" w:customStyle="1" w:styleId="Titre2Car">
-    <w:name w:val="Titre 2 Car"/>
-    <w:basedOn w:val="Policepardfaut"/>
-    <w:link w:val="Titre2"/>
+  <w:style w:type="character" w:customStyle="1" w:styleId="Heading2Char">
+    <w:name w:val="Heading 2 Char"/>
+    <w:basedOn w:val="DefaultParagraphFont"/>
+    <w:link w:val="Heading2"/>
     <w:uiPriority w:val="9"/>
     <w:rsid w:val="00FC693F"/>
     <w:rPr>
@@ -1678,10 +1786,10 @@
       <w:szCs w:val="26"/>
     </w:rPr>
   </w:style>
-  <w:style w:type="character" w:customStyle="1" w:styleId="Titre3Car">
-    <w:name w:val="Titre 3 Car"/>
-    <w:basedOn w:val="Policepardfaut"/>
-    <w:link w:val="Titre3"/>
+  <w:style w:type="character" w:customStyle="1" w:styleId="Heading3Char">
+    <w:name w:val="Heading 3 Char"/>
+    <w:basedOn w:val="DefaultParagraphFont"/>
+    <w:link w:val="Heading3"/>
     <w:uiPriority w:val="9"/>
     <w:rsid w:val="00FC693F"/>
     <w:rPr>
@@ -1691,11 +1799,11 @@
       <w:color w:val="4F81BD" w:themeColor="accent1"/>
     </w:rPr>
   </w:style>
-  <w:style w:type="paragraph" w:styleId="Titre">
+  <w:style w:type="paragraph" w:styleId="Title">
     <w:name w:val="Title"/>
     <w:basedOn w:val="Normal"/>
     <w:next w:val="Normal"/>
-    <w:link w:val="TitreCar"/>
+    <w:link w:val="TitleChar"/>
     <w:uiPriority w:val="10"/>
     <w:qFormat/>
     <w:rsid w:val="00FC693F"/>
@@ -1715,10 +1823,10 @@
       <w:szCs w:val="52"/>
     </w:rPr>
   </w:style>
-  <w:style w:type="character" w:customStyle="1" w:styleId="TitreCar">
-    <w:name w:val="Titre Car"/>
-    <w:basedOn w:val="Policepardfaut"/>
-    <w:link w:val="Titre"/>
+  <w:style w:type="character" w:customStyle="1" w:styleId="TitleChar">
+    <w:name w:val="Title Char"/>
+    <w:basedOn w:val="DefaultParagraphFont"/>
+    <w:link w:val="Title"/>
     <w:uiPriority w:val="10"/>
     <w:rsid w:val="00FC693F"/>
     <w:rPr>
@@ -1730,11 +1838,11 @@
       <w:szCs w:val="52"/>
     </w:rPr>
   </w:style>
-  <w:style w:type="paragraph" w:styleId="Sous-titre">
+  <w:style w:type="paragraph" w:styleId="Subtitle">
     <w:name w:val="Subtitle"/>
     <w:basedOn w:val="Normal"/>
     <w:next w:val="Normal"/>
-    <w:link w:val="Sous-titreCar"/>
+    <w:link w:val="SubtitleChar"/>
     <w:uiPriority w:val="11"/>
     <w:qFormat/>
     <w:rsid w:val="00FC693F"/>
@@ -1753,10 +1861,10 @@
       <w:szCs w:val="24"/>
     </w:rPr>
   </w:style>
-  <w:style w:type="character" w:customStyle="1" w:styleId="Sous-titreCar">
-    <w:name w:val="Sous-titre Car"/>
-    <w:basedOn w:val="Policepardfaut"/>
-    <w:link w:val="Sous-titre"/>
+  <w:style w:type="character" w:customStyle="1" w:styleId="SubtitleChar">
+    <w:name w:val="Subtitle Char"/>
+    <w:basedOn w:val="DefaultParagraphFont"/>
+    <w:link w:val="Subtitle"/>
     <w:uiPriority w:val="11"/>
     <w:rsid w:val="00FC693F"/>
     <w:rPr>
@@ -1769,7 +1877,7 @@
       <w:szCs w:val="24"/>
     </w:rPr>
   </w:style>
-  <w:style w:type="paragraph" w:styleId="Paragraphedeliste">
+  <w:style w:type="paragraph" w:styleId="ListParagraph">
     <w:name w:val="List Paragraph"/>
     <w:basedOn w:val="Normal"/>
     <w:uiPriority w:val="34"/>
@@ -1780,10 +1888,10 @@
       <w:contextualSpacing/>
     </w:pPr>
   </w:style>
-  <w:style w:type="paragraph" w:styleId="Corpsdetexte">
+  <w:style w:type="paragraph" w:styleId="BodyText">
     <w:name w:val="Body Text"/>
     <w:basedOn w:val="Normal"/>
-    <w:link w:val="CorpsdetexteCar"/>
+    <w:link w:val="BodyTextChar"/>
     <w:uiPriority w:val="99"/>
     <w:unhideWhenUsed/>
     <w:rsid w:val="00AA1D8D"/>
@@ -1791,17 +1899,17 @@
       <w:spacing w:after="120"/>
     </w:pPr>
   </w:style>
-  <w:style w:type="character" w:customStyle="1" w:styleId="CorpsdetexteCar">
-    <w:name w:val="Corps de texte Car"/>
-    <w:basedOn w:val="Policepardfaut"/>
-    <w:link w:val="Corpsdetexte"/>
+  <w:style w:type="character" w:customStyle="1" w:styleId="BodyTextChar">
+    <w:name w:val="Body Text Char"/>
+    <w:basedOn w:val="DefaultParagraphFont"/>
+    <w:link w:val="BodyText"/>
     <w:uiPriority w:val="99"/>
     <w:rsid w:val="00AA1D8D"/>
   </w:style>
-  <w:style w:type="paragraph" w:styleId="Corpsdetexte2">
+  <w:style w:type="paragraph" w:styleId="BodyText2">
     <w:name w:val="Body Text 2"/>
     <w:basedOn w:val="Normal"/>
-    <w:link w:val="Corpsdetexte2Car"/>
+    <w:link w:val="BodyText2Char"/>
     <w:uiPriority w:val="99"/>
     <w:unhideWhenUsed/>
     <w:rsid w:val="00AA1D8D"/>
@@ -1809,17 +1917,17 @@
       <w:spacing w:after="120" w:line="480" w:lineRule="auto"/>
     </w:pPr>
   </w:style>
-  <w:style w:type="character" w:customStyle="1" w:styleId="Corpsdetexte2Car">
-    <w:name w:val="Corps de texte 2 Car"/>
-    <w:basedOn w:val="Policepardfaut"/>
-    <w:link w:val="Corpsdetexte2"/>
+  <w:style w:type="character" w:customStyle="1" w:styleId="BodyText2Char">
+    <w:name w:val="Body Text 2 Char"/>
+    <w:basedOn w:val="DefaultParagraphFont"/>
+    <w:link w:val="BodyText2"/>
     <w:uiPriority w:val="99"/>
     <w:rsid w:val="00AA1D8D"/>
   </w:style>
-  <w:style w:type="paragraph" w:styleId="Corpsdetexte3">
+  <w:style w:type="paragraph" w:styleId="BodyText3">
     <w:name w:val="Body Text 3"/>
     <w:basedOn w:val="Normal"/>
-    <w:link w:val="Corpsdetexte3Car"/>
+    <w:link w:val="BodyText3Char"/>
     <w:uiPriority w:val="99"/>
     <w:unhideWhenUsed/>
     <w:rsid w:val="00AA1D8D"/>
@@ -1831,10 +1939,10 @@
       <w:szCs w:val="16"/>
     </w:rPr>
   </w:style>
-  <w:style w:type="character" w:customStyle="1" w:styleId="Corpsdetexte3Car">
-    <w:name w:val="Corps de texte 3 Car"/>
-    <w:basedOn w:val="Policepardfaut"/>
-    <w:link w:val="Corpsdetexte3"/>
+  <w:style w:type="character" w:customStyle="1" w:styleId="BodyText3Char">
+    <w:name w:val="Body Text 3 Char"/>
+    <w:basedOn w:val="DefaultParagraphFont"/>
+    <w:link w:val="BodyText3"/>
     <w:uiPriority w:val="99"/>
     <w:rsid w:val="00AA1D8D"/>
     <w:rPr>
@@ -1842,7 +1950,7 @@
       <w:szCs w:val="16"/>
     </w:rPr>
   </w:style>
-  <w:style w:type="paragraph" w:styleId="Liste">
+  <w:style w:type="paragraph" w:styleId="List">
     <w:name w:val="List"/>
     <w:basedOn w:val="Normal"/>
     <w:uiPriority w:val="99"/>
@@ -1853,7 +1961,7 @@
       <w:contextualSpacing/>
     </w:pPr>
   </w:style>
-  <w:style w:type="paragraph" w:styleId="Liste2">
+  <w:style w:type="paragraph" w:styleId="List2">
     <w:name w:val="List 2"/>
     <w:basedOn w:val="Normal"/>
     <w:uiPriority w:val="99"/>
@@ -1864,7 +1972,7 @@
       <w:contextualSpacing/>
     </w:pPr>
   </w:style>
-  <w:style w:type="paragraph" w:styleId="Liste3">
+  <w:style w:type="paragraph" w:styleId="List3">
     <w:name w:val="List 3"/>
     <w:basedOn w:val="Normal"/>
     <w:uiPriority w:val="99"/>
@@ -1875,7 +1983,7 @@
       <w:contextualSpacing/>
     </w:pPr>
   </w:style>
-  <w:style w:type="paragraph" w:styleId="Listepuces">
+  <w:style w:type="paragraph" w:styleId="ListBullet">
     <w:name w:val="List Bullet"/>
     <w:basedOn w:val="Normal"/>
     <w:uiPriority w:val="99"/>
@@ -1888,7 +1996,7 @@
       <w:contextualSpacing/>
     </w:pPr>
   </w:style>
-  <w:style w:type="paragraph" w:styleId="Listepuces2">
+  <w:style w:type="paragraph" w:styleId="ListBullet2">
     <w:name w:val="List Bullet 2"/>
     <w:basedOn w:val="Normal"/>
     <w:uiPriority w:val="99"/>
@@ -1901,7 +2009,7 @@
       <w:contextualSpacing/>
     </w:pPr>
   </w:style>
-  <w:style w:type="paragraph" w:styleId="Listepuces3">
+  <w:style w:type="paragraph" w:styleId="ListBullet3">
     <w:name w:val="List Bullet 3"/>
     <w:basedOn w:val="Normal"/>
     <w:uiPriority w:val="99"/>
@@ -1914,7 +2022,7 @@
       <w:contextualSpacing/>
     </w:pPr>
   </w:style>
-  <w:style w:type="paragraph" w:styleId="Listenumros">
+  <w:style w:type="paragraph" w:styleId="ListNumber">
     <w:name w:val="List Number"/>
     <w:basedOn w:val="Normal"/>
     <w:uiPriority w:val="99"/>
@@ -1927,7 +2035,7 @@
       <w:contextualSpacing/>
     </w:pPr>
   </w:style>
-  <w:style w:type="paragraph" w:styleId="Listenumros2">
+  <w:style w:type="paragraph" w:styleId="ListNumber2">
     <w:name w:val="List Number 2"/>
     <w:basedOn w:val="Normal"/>
     <w:uiPriority w:val="99"/>
@@ -1940,7 +2048,7 @@
       <w:contextualSpacing/>
     </w:pPr>
   </w:style>
-  <w:style w:type="paragraph" w:styleId="Listenumros3">
+  <w:style w:type="paragraph" w:styleId="ListNumber3">
     <w:name w:val="List Number 3"/>
     <w:basedOn w:val="Normal"/>
     <w:uiPriority w:val="99"/>
@@ -1953,7 +2061,7 @@
       <w:contextualSpacing/>
     </w:pPr>
   </w:style>
-  <w:style w:type="paragraph" w:styleId="Listecontinue">
+  <w:style w:type="paragraph" w:styleId="ListContinue">
     <w:name w:val="List Continue"/>
     <w:basedOn w:val="Normal"/>
     <w:uiPriority w:val="99"/>
@@ -1965,7 +2073,7 @@
       <w:contextualSpacing/>
     </w:pPr>
   </w:style>
-  <w:style w:type="paragraph" w:styleId="Listecontinue2">
+  <w:style w:type="paragraph" w:styleId="ListContinue2">
     <w:name w:val="List Continue 2"/>
     <w:basedOn w:val="Normal"/>
     <w:uiPriority w:val="99"/>
@@ -1977,7 +2085,7 @@
       <w:contextualSpacing/>
     </w:pPr>
   </w:style>
-  <w:style w:type="paragraph" w:styleId="Listecontinue3">
+  <w:style w:type="paragraph" w:styleId="ListContinue3">
     <w:name w:val="List Continue 3"/>
     <w:basedOn w:val="Normal"/>
     <w:uiPriority w:val="99"/>
@@ -1989,9 +2097,9 @@
       <w:contextualSpacing/>
     </w:pPr>
   </w:style>
-  <w:style w:type="paragraph" w:styleId="Textedemacro">
+  <w:style w:type="paragraph" w:styleId="MacroText">
     <w:name w:val="macro"/>
-    <w:link w:val="TextedemacroCar"/>
+    <w:link w:val="MacroTextChar"/>
     <w:uiPriority w:val="99"/>
     <w:unhideWhenUsed/>
     <w:rsid w:val="0029639D"/>
@@ -2012,10 +2120,10 @@
       <w:szCs w:val="20"/>
     </w:rPr>
   </w:style>
-  <w:style w:type="character" w:customStyle="1" w:styleId="TextedemacroCar">
-    <w:name w:val="Texte de macro Car"/>
-    <w:basedOn w:val="Policepardfaut"/>
-    <w:link w:val="Textedemacro"/>
+  <w:style w:type="character" w:customStyle="1" w:styleId="MacroTextChar">
+    <w:name w:val="Macro Text Char"/>
+    <w:basedOn w:val="DefaultParagraphFont"/>
+    <w:link w:val="MacroText"/>
     <w:uiPriority w:val="99"/>
     <w:rsid w:val="0029639D"/>
     <w:rPr>
@@ -2024,11 +2132,11 @@
       <w:szCs w:val="20"/>
     </w:rPr>
   </w:style>
-  <w:style w:type="paragraph" w:styleId="Citation">
+  <w:style w:type="paragraph" w:styleId="Quote">
     <w:name w:val="Quote"/>
     <w:basedOn w:val="Normal"/>
     <w:next w:val="Normal"/>
-    <w:link w:val="CitationCar"/>
+    <w:link w:val="QuoteChar"/>
     <w:uiPriority w:val="29"/>
     <w:qFormat/>
     <w:rsid w:val="00FC693F"/>
@@ -2038,10 +2146,10 @@
       <w:color w:val="000000" w:themeColor="text1"/>
     </w:rPr>
   </w:style>
-  <w:style w:type="character" w:customStyle="1" w:styleId="CitationCar">
-    <w:name w:val="Citation Car"/>
-    <w:basedOn w:val="Policepardfaut"/>
-    <w:link w:val="Citation"/>
+  <w:style w:type="character" w:customStyle="1" w:styleId="QuoteChar">
+    <w:name w:val="Quote Char"/>
+    <w:basedOn w:val="DefaultParagraphFont"/>
+    <w:link w:val="Quote"/>
     <w:uiPriority w:val="29"/>
     <w:rsid w:val="00FC693F"/>
     <w:rPr>
@@ -2050,10 +2158,10 @@
       <w:color w:val="000000" w:themeColor="text1"/>
     </w:rPr>
   </w:style>
-  <w:style w:type="character" w:customStyle="1" w:styleId="Titre4Car">
-    <w:name w:val="Titre 4 Car"/>
-    <w:basedOn w:val="Policepardfaut"/>
-    <w:link w:val="Titre4"/>
+  <w:style w:type="character" w:customStyle="1" w:styleId="Heading4Char">
+    <w:name w:val="Heading 4 Char"/>
+    <w:basedOn w:val="DefaultParagraphFont"/>
+    <w:link w:val="Heading4"/>
     <w:uiPriority w:val="9"/>
     <w:semiHidden/>
     <w:rsid w:val="00FC693F"/>
@@ -2066,10 +2174,10 @@
       <w:color w:val="4F81BD" w:themeColor="accent1"/>
     </w:rPr>
   </w:style>
-  <w:style w:type="character" w:customStyle="1" w:styleId="Titre5Car">
-    <w:name w:val="Titre 5 Car"/>
-    <w:basedOn w:val="Policepardfaut"/>
-    <w:link w:val="Titre5"/>
+  <w:style w:type="character" w:customStyle="1" w:styleId="Heading5Char">
+    <w:name w:val="Heading 5 Char"/>
+    <w:basedOn w:val="DefaultParagraphFont"/>
+    <w:link w:val="Heading5"/>
     <w:uiPriority w:val="9"/>
     <w:semiHidden/>
     <w:rsid w:val="00FC693F"/>
@@ -2078,10 +2186,10 @@
       <w:color w:val="243F60" w:themeColor="accent1" w:themeShade="7F"/>
     </w:rPr>
   </w:style>
-  <w:style w:type="character" w:customStyle="1" w:styleId="Titre6Car">
-    <w:name w:val="Titre 6 Car"/>
-    <w:basedOn w:val="Policepardfaut"/>
-    <w:link w:val="Titre6"/>
+  <w:style w:type="character" w:customStyle="1" w:styleId="Heading6Char">
+    <w:name w:val="Heading 6 Char"/>
+    <w:basedOn w:val="DefaultParagraphFont"/>
+    <w:link w:val="Heading6"/>
     <w:uiPriority w:val="9"/>
     <w:semiHidden/>
     <w:rsid w:val="00FC693F"/>
@@ -2092,10 +2200,10 @@
       <w:color w:val="243F60" w:themeColor="accent1" w:themeShade="7F"/>
     </w:rPr>
   </w:style>
-  <w:style w:type="character" w:customStyle="1" w:styleId="Titre7Car">
-    <w:name w:val="Titre 7 Car"/>
-    <w:basedOn w:val="Policepardfaut"/>
-    <w:link w:val="Titre7"/>
+  <w:style w:type="character" w:customStyle="1" w:styleId="Heading7Char">
+    <w:name w:val="Heading 7 Char"/>
+    <w:basedOn w:val="DefaultParagraphFont"/>
+    <w:link w:val="Heading7"/>
     <w:uiPriority w:val="9"/>
     <w:semiHidden/>
     <w:rsid w:val="00FC693F"/>
@@ -2106,10 +2214,10 @@
       <w:color w:val="404040" w:themeColor="text1" w:themeTint="BF"/>
     </w:rPr>
   </w:style>
-  <w:style w:type="character" w:customStyle="1" w:styleId="Titre8Car">
-    <w:name w:val="Titre 8 Car"/>
-    <w:basedOn w:val="Policepardfaut"/>
-    <w:link w:val="Titre8"/>
+  <w:style w:type="character" w:customStyle="1" w:styleId="Heading8Char">
+    <w:name w:val="Heading 8 Char"/>
+    <w:basedOn w:val="DefaultParagraphFont"/>
+    <w:link w:val="Heading8"/>
     <w:uiPriority w:val="9"/>
     <w:semiHidden/>
     <w:rsid w:val="00FC693F"/>
@@ -2120,10 +2228,10 @@
       <w:szCs w:val="20"/>
     </w:rPr>
   </w:style>
-  <w:style w:type="character" w:customStyle="1" w:styleId="Titre9Car">
-    <w:name w:val="Titre 9 Car"/>
-    <w:basedOn w:val="Policepardfaut"/>
-    <w:link w:val="Titre9"/>
+  <w:style w:type="character" w:customStyle="1" w:styleId="Heading9Char">
+    <w:name w:val="Heading 9 Char"/>
+    <w:basedOn w:val="DefaultParagraphFont"/>
+    <w:link w:val="Heading9"/>
     <w:uiPriority w:val="9"/>
     <w:semiHidden/>
     <w:rsid w:val="00FC693F"/>
@@ -2136,7 +2244,7 @@
       <w:szCs w:val="20"/>
     </w:rPr>
   </w:style>
-  <w:style w:type="paragraph" w:styleId="Lgende">
+  <w:style w:type="paragraph" w:styleId="Caption">
     <w:name w:val="caption"/>
     <w:basedOn w:val="Normal"/>
     <w:next w:val="Normal"/>
@@ -2156,9 +2264,9 @@
       <w:szCs w:val="18"/>
     </w:rPr>
   </w:style>
-  <w:style w:type="character" w:styleId="lev">
+  <w:style w:type="character" w:styleId="Strong">
     <w:name w:val="Strong"/>
-    <w:basedOn w:val="Policepardfaut"/>
+    <w:basedOn w:val="DefaultParagraphFont"/>
     <w:uiPriority w:val="22"/>
     <w:qFormat/>
     <w:rsid w:val="00FC693F"/>
@@ -2167,9 +2275,9 @@
       <w:bCs/>
     </w:rPr>
   </w:style>
-  <w:style w:type="character" w:styleId="Accentuation">
+  <w:style w:type="character" w:styleId="Emphasis">
     <w:name w:val="Emphasis"/>
-    <w:basedOn w:val="Policepardfaut"/>
+    <w:basedOn w:val="DefaultParagraphFont"/>
     <w:uiPriority w:val="20"/>
     <w:qFormat/>
     <w:rsid w:val="00FC693F"/>
@@ -2178,11 +2286,11 @@
       <w:iCs/>
     </w:rPr>
   </w:style>
-  <w:style w:type="paragraph" w:styleId="Citationintense">
+  <w:style w:type="paragraph" w:styleId="IntenseQuote">
     <w:name w:val="Intense Quote"/>
     <w:basedOn w:val="Normal"/>
     <w:next w:val="Normal"/>
-    <w:link w:val="CitationintenseCar"/>
+    <w:link w:val="IntenseQuoteChar"/>
     <w:uiPriority w:val="30"/>
     <w:qFormat/>
     <w:rsid w:val="00FC693F"/>
@@ -2201,10 +2309,10 @@
       <w:color w:val="4F81BD" w:themeColor="accent1"/>
     </w:rPr>
   </w:style>
-  <w:style w:type="character" w:customStyle="1" w:styleId="CitationintenseCar">
-    <w:name w:val="Citation intense Car"/>
-    <w:basedOn w:val="Policepardfaut"/>
-    <w:link w:val="Citationintense"/>
+  <w:style w:type="character" w:customStyle="1" w:styleId="IntenseQuoteChar">
+    <w:name w:val="Intense Quote Char"/>
+    <w:basedOn w:val="DefaultParagraphFont"/>
+    <w:link w:val="IntenseQuote"/>
     <w:uiPriority w:val="30"/>
     <w:rsid w:val="00FC693F"/>
     <w:rPr>
@@ -2215,9 +2323,9 @@
       <w:color w:val="4F81BD" w:themeColor="accent1"/>
     </w:rPr>
   </w:style>
-  <w:style w:type="character" w:styleId="Accentuationlgre">
+  <w:style w:type="character" w:styleId="SubtleEmphasis">
     <w:name w:val="Subtle Emphasis"/>
-    <w:basedOn w:val="Policepardfaut"/>
+    <w:basedOn w:val="DefaultParagraphFont"/>
     <w:uiPriority w:val="19"/>
     <w:qFormat/>
     <w:rsid w:val="00FC693F"/>
@@ -2227,9 +2335,9 @@
       <w:color w:val="808080" w:themeColor="text1" w:themeTint="7F"/>
     </w:rPr>
   </w:style>
-  <w:style w:type="character" w:styleId="Accentuationintense">
+  <w:style w:type="character" w:styleId="IntenseEmphasis">
     <w:name w:val="Intense Emphasis"/>
-    <w:basedOn w:val="Policepardfaut"/>
+    <w:basedOn w:val="DefaultParagraphFont"/>
     <w:uiPriority w:val="21"/>
     <w:qFormat/>
     <w:rsid w:val="00FC693F"/>
@@ -2241,9 +2349,9 @@
       <w:color w:val="4F81BD" w:themeColor="accent1"/>
     </w:rPr>
   </w:style>
-  <w:style w:type="character" w:styleId="Rfrencelgre">
+  <w:style w:type="character" w:styleId="SubtleReference">
     <w:name w:val="Subtle Reference"/>
-    <w:basedOn w:val="Policepardfaut"/>
+    <w:basedOn w:val="DefaultParagraphFont"/>
     <w:uiPriority w:val="31"/>
     <w:qFormat/>
     <w:rsid w:val="00FC693F"/>
@@ -2253,9 +2361,9 @@
       <w:u w:val="single"/>
     </w:rPr>
   </w:style>
-  <w:style w:type="character" w:styleId="Rfrenceintense">
+  <w:style w:type="character" w:styleId="IntenseReference">
     <w:name w:val="Intense Reference"/>
-    <w:basedOn w:val="Policepardfaut"/>
+    <w:basedOn w:val="DefaultParagraphFont"/>
     <w:uiPriority w:val="32"/>
     <w:qFormat/>
     <w:rsid w:val="00FC693F"/>
@@ -2268,9 +2376,9 @@
       <w:u w:val="single"/>
     </w:rPr>
   </w:style>
-  <w:style w:type="character" w:styleId="Titredulivre">
+  <w:style w:type="character" w:styleId="BookTitle">
     <w:name w:val="Book Title"/>
-    <w:basedOn w:val="Policepardfaut"/>
+    <w:basedOn w:val="DefaultParagraphFont"/>
     <w:uiPriority w:val="33"/>
     <w:qFormat/>
     <w:rsid w:val="00FC693F"/>
@@ -2281,9 +2389,9 @@
       <w:spacing w:val="5"/>
     </w:rPr>
   </w:style>
-  <w:style w:type="paragraph" w:styleId="En-ttedetabledesmatires">
+  <w:style w:type="paragraph" w:styleId="TOCHeading">
     <w:name w:val="TOC Heading"/>
-    <w:basedOn w:val="Titre1"/>
+    <w:basedOn w:val="Heading1"/>
     <w:next w:val="Normal"/>
     <w:uiPriority w:val="39"/>
     <w:semiHidden/>
@@ -2294,9 +2402,9 @@
       <w:outlineLvl w:val="9"/>
     </w:pPr>
   </w:style>
-  <w:style w:type="table" w:styleId="Grilledutableau">
+  <w:style w:type="table" w:styleId="TableGrid">
     <w:name w:val="Table Grid"/>
-    <w:basedOn w:val="TableauNormal"/>
+    <w:basedOn w:val="TableNormal"/>
     <w:uiPriority w:val="59"/>
     <w:rsid w:val="00FC693F"/>
     <w:pPr>
@@ -2313,9 +2421,9 @@
       </w:tblBorders>
     </w:tblPr>
   </w:style>
-  <w:style w:type="table" w:styleId="Ombrageclair">
+  <w:style w:type="table" w:styleId="LightShading">
     <w:name w:val="Light Shading"/>
-    <w:basedOn w:val="TableauNormal"/>
+    <w:basedOn w:val="TableNormal"/>
     <w:uiPriority w:val="60"/>
     <w:rsid w:val="00FC693F"/>
     <w:pPr>
@@ -2409,9 +2517,9 @@
       </w:tcPr>
     </w:tblStylePr>
   </w:style>
-  <w:style w:type="table" w:styleId="Trameclaire-Accent1">
+  <w:style w:type="table" w:styleId="LightShading-Accent1">
     <w:name w:val="Light Shading Accent 1"/>
-    <w:basedOn w:val="TableauNormal"/>
+    <w:basedOn w:val="TableNormal"/>
     <w:uiPriority w:val="60"/>
     <w:rsid w:val="00FC693F"/>
     <w:pPr>
@@ -2505,9 +2613,9 @@
       </w:tcPr>
     </w:tblStylePr>
   </w:style>
-  <w:style w:type="table" w:styleId="Trameclaire-Accent2">
+  <w:style w:type="table" w:styleId="LightShading-Accent2">
     <w:name w:val="Light Shading Accent 2"/>
-    <w:basedOn w:val="TableauNormal"/>
+    <w:basedOn w:val="TableNormal"/>
     <w:uiPriority w:val="60"/>
     <w:rsid w:val="00FC693F"/>
     <w:pPr>
@@ -2601,9 +2709,9 @@
       </w:tcPr>
     </w:tblStylePr>
   </w:style>
-  <w:style w:type="table" w:styleId="Trameclaire-Accent3">
+  <w:style w:type="table" w:styleId="LightShading-Accent3">
     <w:name w:val="Light Shading Accent 3"/>
-    <w:basedOn w:val="TableauNormal"/>
+    <w:basedOn w:val="TableNormal"/>
     <w:uiPriority w:val="60"/>
     <w:rsid w:val="00FC693F"/>
     <w:pPr>
@@ -2697,9 +2805,9 @@
       </w:tcPr>
     </w:tblStylePr>
   </w:style>
-  <w:style w:type="table" w:styleId="Trameclaire-Accent4">
+  <w:style w:type="table" w:styleId="LightShading-Accent4">
     <w:name w:val="Light Shading Accent 4"/>
-    <w:basedOn w:val="TableauNormal"/>
+    <w:basedOn w:val="TableNormal"/>
     <w:uiPriority w:val="60"/>
     <w:rsid w:val="00FC693F"/>
     <w:pPr>
@@ -2793,9 +2901,9 @@
       </w:tcPr>
     </w:tblStylePr>
   </w:style>
-  <w:style w:type="table" w:styleId="Trameclaire-Accent5">
+  <w:style w:type="table" w:styleId="LightShading-Accent5">
     <w:name w:val="Light Shading Accent 5"/>
-    <w:basedOn w:val="TableauNormal"/>
+    <w:basedOn w:val="TableNormal"/>
     <w:uiPriority w:val="60"/>
     <w:rsid w:val="00FC693F"/>
     <w:pPr>
@@ -2889,9 +2997,9 @@
       </w:tcPr>
     </w:tblStylePr>
   </w:style>
-  <w:style w:type="table" w:styleId="Trameclaire-Accent6">
+  <w:style w:type="table" w:styleId="LightShading-Accent6">
     <w:name w:val="Light Shading Accent 6"/>
-    <w:basedOn w:val="TableauNormal"/>
+    <w:basedOn w:val="TableNormal"/>
     <w:uiPriority w:val="60"/>
     <w:rsid w:val="00FC693F"/>
     <w:pPr>
@@ -2985,9 +3093,9 @@
       </w:tcPr>
     </w:tblStylePr>
   </w:style>
-  <w:style w:type="table" w:styleId="Listeclaire">
+  <w:style w:type="table" w:styleId="LightList">
     <w:name w:val="Light List"/>
-    <w:basedOn w:val="TableauNormal"/>
+    <w:basedOn w:val="TableNormal"/>
     <w:uiPriority w:val="61"/>
     <w:rsid w:val="00FC693F"/>
     <w:pPr>
@@ -3070,9 +3178,9 @@
       </w:tcPr>
     </w:tblStylePr>
   </w:style>
-  <w:style w:type="table" w:styleId="Listeclaire-Accent1">
+  <w:style w:type="table" w:styleId="LightList-Accent1">
     <w:name w:val="Light List Accent 1"/>
-    <w:basedOn w:val="TableauNormal"/>
+    <w:basedOn w:val="TableNormal"/>
     <w:uiPriority w:val="61"/>
     <w:rsid w:val="00FC693F"/>
     <w:pPr>
@@ -3155,9 +3263,9 @@
       </w:tcPr>
     </w:tblStylePr>
   </w:style>
-  <w:style w:type="table" w:styleId="Listeclaire-Accent2">
+  <w:style w:type="table" w:styleId="LightList-Accent2">
     <w:name w:val="Light List Accent 2"/>
-    <w:basedOn w:val="TableauNormal"/>
+    <w:basedOn w:val="TableNormal"/>
     <w:uiPriority w:val="61"/>
     <w:rsid w:val="00CB0664"/>
     <w:pPr>
@@ -3240,9 +3348,9 @@
       </w:tcPr>
     </w:tblStylePr>
   </w:style>
-  <w:style w:type="table" w:styleId="Listeclaire-Accent3">
+  <w:style w:type="table" w:styleId="LightList-Accent3">
     <w:name w:val="Light List Accent 3"/>
-    <w:basedOn w:val="TableauNormal"/>
+    <w:basedOn w:val="TableNormal"/>
     <w:uiPriority w:val="61"/>
     <w:rsid w:val="00CB0664"/>
     <w:pPr>
@@ -3325,9 +3433,9 @@
       </w:tcPr>
     </w:tblStylePr>
   </w:style>
-  <w:style w:type="table" w:styleId="Listeclaire-Accent4">
+  <w:style w:type="table" w:styleId="LightList-Accent4">
     <w:name w:val="Light List Accent 4"/>
-    <w:basedOn w:val="TableauNormal"/>
+    <w:basedOn w:val="TableNormal"/>
     <w:uiPriority w:val="61"/>
     <w:rsid w:val="00CB0664"/>
     <w:pPr>
@@ -3410,9 +3518,9 @@
       </w:tcPr>
     </w:tblStylePr>
   </w:style>
-  <w:style w:type="table" w:styleId="Listeclaire-Accent5">
+  <w:style w:type="table" w:styleId="LightList-Accent5">
     <w:name w:val="Light List Accent 5"/>
-    <w:basedOn w:val="TableauNormal"/>
+    <w:basedOn w:val="TableNormal"/>
     <w:uiPriority w:val="61"/>
     <w:rsid w:val="00CB0664"/>
     <w:pPr>
@@ -3495,9 +3603,9 @@
       </w:tcPr>
     </w:tblStylePr>
   </w:style>
-  <w:style w:type="table" w:styleId="Listeclaire-Accent6">
+  <w:style w:type="table" w:styleId="LightList-Accent6">
     <w:name w:val="Light List Accent 6"/>
-    <w:basedOn w:val="TableauNormal"/>
+    <w:basedOn w:val="TableNormal"/>
     <w:uiPriority w:val="61"/>
     <w:rsid w:val="00CB0664"/>
     <w:pPr>
@@ -3580,9 +3688,9 @@
       </w:tcPr>
     </w:tblStylePr>
   </w:style>
-  <w:style w:type="table" w:styleId="Grilleclaire">
+  <w:style w:type="table" w:styleId="LightGrid">
     <w:name w:val="Light Grid"/>
-    <w:basedOn w:val="TableauNormal"/>
+    <w:basedOn w:val="TableNormal"/>
     <w:uiPriority w:val="62"/>
     <w:rsid w:val="00CB0664"/>
     <w:pPr>
@@ -3703,9 +3811,9 @@
       </w:tcPr>
     </w:tblStylePr>
   </w:style>
-  <w:style w:type="table" w:styleId="Grilleclaire-Accent1">
+  <w:style w:type="table" w:styleId="LightGrid-Accent1">
     <w:name w:val="Light Grid Accent 1"/>
-    <w:basedOn w:val="TableauNormal"/>
+    <w:basedOn w:val="TableNormal"/>
     <w:uiPriority w:val="62"/>
     <w:rsid w:val="00CB0664"/>
     <w:pPr>
@@ -3826,9 +3934,9 @@
       </w:tcPr>
     </w:tblStylePr>
   </w:style>
-  <w:style w:type="table" w:styleId="Grilleclaire-Accent2">
+  <w:style w:type="table" w:styleId="LightGrid-Accent2">
     <w:name w:val="Light Grid Accent 2"/>
-    <w:basedOn w:val="TableauNormal"/>
+    <w:basedOn w:val="TableNormal"/>
     <w:uiPriority w:val="62"/>
     <w:rsid w:val="00CB0664"/>
     <w:pPr>
@@ -3949,9 +4057,9 @@
       </w:tcPr>
     </w:tblStylePr>
   </w:style>
-  <w:style w:type="table" w:styleId="Grilleclaire-Accent3">
+  <w:style w:type="table" w:styleId="LightGrid-Accent3">
     <w:name w:val="Light Grid Accent 3"/>
-    <w:basedOn w:val="TableauNormal"/>
+    <w:basedOn w:val="TableNormal"/>
     <w:uiPriority w:val="62"/>
     <w:rsid w:val="00CB0664"/>
     <w:pPr>
@@ -4072,9 +4180,9 @@
       </w:tcPr>
     </w:tblStylePr>
   </w:style>
-  <w:style w:type="table" w:styleId="Grilleclaire-Accent4">
+  <w:style w:type="table" w:styleId="LightGrid-Accent4">
     <w:name w:val="Light Grid Accent 4"/>
-    <w:basedOn w:val="TableauNormal"/>
+    <w:basedOn w:val="TableNormal"/>
     <w:uiPriority w:val="62"/>
     <w:rsid w:val="00CB0664"/>
     <w:pPr>
@@ -4195,9 +4303,9 @@
       </w:tcPr>
     </w:tblStylePr>
   </w:style>
-  <w:style w:type="table" w:styleId="Grilleclaire-Accent5">
+  <w:style w:type="table" w:styleId="LightGrid-Accent5">
     <w:name w:val="Light Grid Accent 5"/>
-    <w:basedOn w:val="TableauNormal"/>
+    <w:basedOn w:val="TableNormal"/>
     <w:uiPriority w:val="62"/>
     <w:rsid w:val="00CB0664"/>
     <w:pPr>
@@ -4318,9 +4426,9 @@
       </w:tcPr>
     </w:tblStylePr>
   </w:style>
-  <w:style w:type="table" w:styleId="Grilleclaire-Accent6">
+  <w:style w:type="table" w:styleId="LightGrid-Accent6">
     <w:name w:val="Light Grid Accent 6"/>
-    <w:basedOn w:val="TableauNormal"/>
+    <w:basedOn w:val="TableNormal"/>
     <w:uiPriority w:val="62"/>
     <w:rsid w:val="00CB0664"/>
     <w:pPr>
@@ -4441,9 +4549,9 @@
       </w:tcPr>
     </w:tblStylePr>
   </w:style>
-  <w:style w:type="table" w:styleId="Tramemoyenne1">
+  <w:style w:type="table" w:styleId="MediumShading1">
     <w:name w:val="Medium Shading 1"/>
-    <w:basedOn w:val="TableauNormal"/>
+    <w:basedOn w:val="TableNormal"/>
     <w:uiPriority w:val="63"/>
     <w:rsid w:val="00CB0664"/>
     <w:pPr>
@@ -4540,9 +4648,9 @@
       </w:tcPr>
     </w:tblStylePr>
   </w:style>
-  <w:style w:type="table" w:styleId="Tramemoyenne1-Accent1">
+  <w:style w:type="table" w:styleId="MediumShading1-Accent1">
     <w:name w:val="Medium Shading 1 Accent 1"/>
-    <w:basedOn w:val="TableauNormal"/>
+    <w:basedOn w:val="TableNormal"/>
     <w:uiPriority w:val="63"/>
     <w:rsid w:val="00CB0664"/>
     <w:pPr>
@@ -4639,9 +4747,9 @@
       </w:tcPr>
     </w:tblStylePr>
   </w:style>
-  <w:style w:type="table" w:styleId="Tramemoyenne1-Accent2">
+  <w:style w:type="table" w:styleId="MediumShading1-Accent2">
     <w:name w:val="Medium Shading 1 Accent 2"/>
-    <w:basedOn w:val="TableauNormal"/>
+    <w:basedOn w:val="TableNormal"/>
     <w:uiPriority w:val="63"/>
     <w:rsid w:val="00CB0664"/>
     <w:pPr>
@@ -4738,9 +4846,9 @@
       </w:tcPr>
     </w:tblStylePr>
   </w:style>
-  <w:style w:type="table" w:styleId="Tramemoyenne1-Accent3">
+  <w:style w:type="table" w:styleId="MediumShading1-Accent3">
     <w:name w:val="Medium Shading 1 Accent 3"/>
-    <w:basedOn w:val="TableauNormal"/>
+    <w:basedOn w:val="TableNormal"/>
     <w:uiPriority w:val="63"/>
     <w:rsid w:val="00CB0664"/>
     <w:pPr>
@@ -4837,9 +4945,9 @@
       </w:tcPr>
     </w:tblStylePr>
   </w:style>
-  <w:style w:type="table" w:styleId="Tramemoyenne1-Accent4">
+  <w:style w:type="table" w:styleId="MediumShading1-Accent4">
     <w:name w:val="Medium Shading 1 Accent 4"/>
-    <w:basedOn w:val="TableauNormal"/>
+    <w:basedOn w:val="TableNormal"/>
     <w:uiPriority w:val="63"/>
     <w:rsid w:val="00CB0664"/>
     <w:pPr>
@@ -4936,9 +5044,9 @@
       </w:tcPr>
     </w:tblStylePr>
   </w:style>
-  <w:style w:type="table" w:styleId="Tramemoyenne1-Accent5">
+  <w:style w:type="table" w:styleId="MediumShading1-Accent5">
     <w:name w:val="Medium Shading 1 Accent 5"/>
-    <w:basedOn w:val="TableauNormal"/>
+    <w:basedOn w:val="TableNormal"/>
     <w:uiPriority w:val="63"/>
     <w:rsid w:val="00CB0664"/>
     <w:pPr>
@@ -5035,9 +5143,9 @@
       </w:tcPr>
     </w:tblStylePr>
   </w:style>
-  <w:style w:type="table" w:styleId="Tramemoyenne1-Accent6">
+  <w:style w:type="table" w:styleId="MediumShading1-Accent6">
     <w:name w:val="Medium Shading 1 Accent 6"/>
-    <w:basedOn w:val="TableauNormal"/>
+    <w:basedOn w:val="TableNormal"/>
     <w:uiPriority w:val="63"/>
     <w:rsid w:val="00CB0664"/>
     <w:pPr>
@@ -5134,9 +5242,9 @@
       </w:tcPr>
     </w:tblStylePr>
   </w:style>
-  <w:style w:type="table" w:styleId="Tramemoyenne2">
+  <w:style w:type="table" w:styleId="MediumShading2">
     <w:name w:val="Medium Shading 2"/>
-    <w:basedOn w:val="TableauNormal"/>
+    <w:basedOn w:val="TableNormal"/>
     <w:uiPriority w:val="64"/>
     <w:rsid w:val="00CB0664"/>
     <w:pPr>
@@ -5276,9 +5384,9 @@
       </w:tcPr>
     </w:tblStylePr>
   </w:style>
-  <w:style w:type="table" w:styleId="Tramemoyenne2-Accent1">
+  <w:style w:type="table" w:styleId="MediumShading2-Accent1">
     <w:name w:val="Medium Shading 2 Accent 1"/>
-    <w:basedOn w:val="TableauNormal"/>
+    <w:basedOn w:val="TableNormal"/>
     <w:uiPriority w:val="64"/>
     <w:rsid w:val="00CB0664"/>
     <w:pPr>
@@ -5418,9 +5526,9 @@
       </w:tcPr>
     </w:tblStylePr>
   </w:style>
-  <w:style w:type="table" w:styleId="Tramemoyenne2-Accent2">
+  <w:style w:type="table" w:styleId="MediumShading2-Accent2">
     <w:name w:val="Medium Shading 2 Accent 2"/>
-    <w:basedOn w:val="TableauNormal"/>
+    <w:basedOn w:val="TableNormal"/>
     <w:uiPriority w:val="64"/>
     <w:rsid w:val="00CB0664"/>
     <w:pPr>
@@ -5560,9 +5668,9 @@
       </w:tcPr>
     </w:tblStylePr>
   </w:style>
-  <w:style w:type="table" w:styleId="Tramemoyenne2-Accent3">
+  <w:style w:type="table" w:styleId="MediumShading2-Accent3">
     <w:name w:val="Medium Shading 2 Accent 3"/>
-    <w:basedOn w:val="TableauNormal"/>
+    <w:basedOn w:val="TableNormal"/>
     <w:uiPriority w:val="64"/>
     <w:rsid w:val="00CB0664"/>
     <w:pPr>
@@ -5702,9 +5810,9 @@
       </w:tcPr>
     </w:tblStylePr>
   </w:style>
-  <w:style w:type="table" w:styleId="Tramemoyenne2-Accent4">
+  <w:style w:type="table" w:styleId="MediumShading2-Accent4">
     <w:name w:val="Medium Shading 2 Accent 4"/>
-    <w:basedOn w:val="TableauNormal"/>
+    <w:basedOn w:val="TableNormal"/>
     <w:uiPriority w:val="64"/>
     <w:rsid w:val="00CB0664"/>
     <w:pPr>
@@ -5844,9 +5952,9 @@
       </w:tcPr>
     </w:tblStylePr>
   </w:style>
-  <w:style w:type="table" w:styleId="Tramemoyenne2-Accent5">
+  <w:style w:type="table" w:styleId="MediumShading2-Accent5">
     <w:name w:val="Medium Shading 2 Accent 5"/>
-    <w:basedOn w:val="TableauNormal"/>
+    <w:basedOn w:val="TableNormal"/>
     <w:uiPriority w:val="64"/>
     <w:rsid w:val="00CB0664"/>
     <w:pPr>
@@ -5986,9 +6094,9 @@
       </w:tcPr>
     </w:tblStylePr>
   </w:style>
-  <w:style w:type="table" w:styleId="Tramemoyenne2-Accent6">
+  <w:style w:type="table" w:styleId="MediumShading2-Accent6">
     <w:name w:val="Medium Shading 2 Accent 6"/>
-    <w:basedOn w:val="TableauNormal"/>
+    <w:basedOn w:val="TableNormal"/>
     <w:uiPriority w:val="64"/>
     <w:rsid w:val="00CB0664"/>
     <w:pPr>
@@ -6128,9 +6236,9 @@
       </w:tcPr>
     </w:tblStylePr>
   </w:style>
-  <w:style w:type="table" w:styleId="Listemoyenne1">
+  <w:style w:type="table" w:styleId="MediumList1">
     <w:name w:val="Medium List 1"/>
-    <w:basedOn w:val="TableauNormal"/>
+    <w:basedOn w:val="TableNormal"/>
     <w:uiPriority w:val="65"/>
     <w:rsid w:val="00CB0664"/>
     <w:pPr>
@@ -6205,9 +6313,9 @@
       </w:tcPr>
     </w:tblStylePr>
   </w:style>
-  <w:style w:type="table" w:styleId="Listemoyenne1-Accent1">
+  <w:style w:type="table" w:styleId="MediumList1-Accent1">
     <w:name w:val="Medium List 1 Accent 1"/>
-    <w:basedOn w:val="TableauNormal"/>
+    <w:basedOn w:val="TableNormal"/>
     <w:uiPriority w:val="65"/>
     <w:rsid w:val="00CB0664"/>
     <w:pPr>
@@ -6282,9 +6390,9 @@
       </w:tcPr>
     </w:tblStylePr>
   </w:style>
-  <w:style w:type="table" w:styleId="Listemoyenne1-Accent2">
+  <w:style w:type="table" w:styleId="MediumList1-Accent2">
     <w:name w:val="Medium List 1 Accent 2"/>
-    <w:basedOn w:val="TableauNormal"/>
+    <w:basedOn w:val="TableNormal"/>
     <w:uiPriority w:val="65"/>
     <w:rsid w:val="00CB0664"/>
     <w:pPr>
@@ -6359,9 +6467,9 @@
       </w:tcPr>
     </w:tblStylePr>
   </w:style>
-  <w:style w:type="table" w:styleId="Listemoyenne1-Accent3">
+  <w:style w:type="table" w:styleId="MediumList1-Accent3">
     <w:name w:val="Medium List 1 Accent 3"/>
-    <w:basedOn w:val="TableauNormal"/>
+    <w:basedOn w:val="TableNormal"/>
     <w:uiPriority w:val="65"/>
     <w:rsid w:val="00CB0664"/>
     <w:pPr>
@@ -6436,9 +6544,9 @@
       </w:tcPr>
     </w:tblStylePr>
   </w:style>
-  <w:style w:type="table" w:styleId="Listemoyenne1-Accent4">
+  <w:style w:type="table" w:styleId="MediumList1-Accent4">
     <w:name w:val="Medium List 1 Accent 4"/>
-    <w:basedOn w:val="TableauNormal"/>
+    <w:basedOn w:val="TableNormal"/>
     <w:uiPriority w:val="65"/>
     <w:rsid w:val="00CB0664"/>
     <w:pPr>
@@ -6513,9 +6621,9 @@
       </w:tcPr>
     </w:tblStylePr>
   </w:style>
-  <w:style w:type="table" w:styleId="Listemoyenne1-Accent5">
+  <w:style w:type="table" w:styleId="MediumList1-Accent5">
     <w:name w:val="Medium List 1 Accent 5"/>
-    <w:basedOn w:val="TableauNormal"/>
+    <w:basedOn w:val="TableNormal"/>
     <w:uiPriority w:val="65"/>
     <w:rsid w:val="00CB0664"/>
     <w:pPr>
@@ -6590,9 +6698,9 @@
       </w:tcPr>
     </w:tblStylePr>
   </w:style>
-  <w:style w:type="table" w:styleId="Listemoyenne1-Accent6">
+  <w:style w:type="table" w:styleId="MediumList1-Accent6">
     <w:name w:val="Medium List 1 Accent 6"/>
-    <w:basedOn w:val="TableauNormal"/>
+    <w:basedOn w:val="TableNormal"/>
     <w:uiPriority w:val="65"/>
     <w:rsid w:val="00CB0664"/>
     <w:pPr>
@@ -6667,9 +6775,9 @@
       </w:tcPr>
     </w:tblStylePr>
   </w:style>
-  <w:style w:type="table" w:styleId="Listemoyenne2">
+  <w:style w:type="table" w:styleId="MediumList2">
     <w:name w:val="Medium List 2"/>
-    <w:basedOn w:val="TableauNormal"/>
+    <w:basedOn w:val="TableNormal"/>
     <w:uiPriority w:val="66"/>
     <w:rsid w:val="00CB0664"/>
     <w:pPr>
@@ -6788,9 +6896,9 @@
       </w:tcPr>
     </w:tblStylePr>
   </w:style>
-  <w:style w:type="table" w:styleId="Listemoyenne2-Accent1">
+  <w:style w:type="table" w:styleId="MediumList2-Accent1">
     <w:name w:val="Medium List 2 Accent 1"/>
-    <w:basedOn w:val="TableauNormal"/>
+    <w:basedOn w:val="TableNormal"/>
     <w:uiPriority w:val="66"/>
     <w:rsid w:val="00CB0664"/>
     <w:pPr>
@@ -6909,9 +7017,9 @@
       </w:tcPr>
     </w:tblStylePr>
   </w:style>
-  <w:style w:type="table" w:styleId="Listemoyenne2-Accent2">
+  <w:style w:type="table" w:styleId="MediumList2-Accent2">
     <w:name w:val="Medium List 2 Accent 2"/>
-    <w:basedOn w:val="TableauNormal"/>
+    <w:basedOn w:val="TableNormal"/>
     <w:uiPriority w:val="66"/>
     <w:rsid w:val="00CB0664"/>
     <w:pPr>
@@ -7030,9 +7138,9 @@
       </w:tcPr>
     </w:tblStylePr>
   </w:style>
-  <w:style w:type="table" w:styleId="Listemoyenne2-Accent3">
+  <w:style w:type="table" w:styleId="MediumList2-Accent3">
     <w:name w:val="Medium List 2 Accent 3"/>
-    <w:basedOn w:val="TableauNormal"/>
+    <w:basedOn w:val="TableNormal"/>
     <w:uiPriority w:val="66"/>
     <w:rsid w:val="00CB0664"/>
     <w:pPr>
@@ -7151,9 +7259,9 @@
       </w:tcPr>
     </w:tblStylePr>
   </w:style>
-  <w:style w:type="table" w:styleId="Listemoyenne2-Accent4">
+  <w:style w:type="table" w:styleId="MediumList2-Accent4">
     <w:name w:val="Medium List 2 Accent 4"/>
-    <w:basedOn w:val="TableauNormal"/>
+    <w:basedOn w:val="TableNormal"/>
     <w:uiPriority w:val="66"/>
     <w:rsid w:val="00CB0664"/>
     <w:pPr>
@@ -7272,9 +7380,9 @@
       </w:tcPr>
     </w:tblStylePr>
   </w:style>
-  <w:style w:type="table" w:styleId="Listemoyenne2-Accent5">
+  <w:style w:type="table" w:styleId="MediumList2-Accent5">
     <w:name w:val="Medium List 2 Accent 5"/>
-    <w:basedOn w:val="TableauNormal"/>
+    <w:basedOn w:val="TableNormal"/>
     <w:uiPriority w:val="66"/>
     <w:rsid w:val="00CB0664"/>
     <w:pPr>
@@ -7393,9 +7501,9 @@
       </w:tcPr>
     </w:tblStylePr>
   </w:style>
-  <w:style w:type="table" w:styleId="Listemoyenne2-Accent6">
+  <w:style w:type="table" w:styleId="MediumList2-Accent6">
     <w:name w:val="Medium List 2 Accent 6"/>
-    <w:basedOn w:val="TableauNormal"/>
+    <w:basedOn w:val="TableNormal"/>
     <w:uiPriority w:val="66"/>
     <w:rsid w:val="00CB0664"/>
     <w:pPr>
@@ -7514,9 +7622,9 @@
       </w:tcPr>
     </w:tblStylePr>
   </w:style>
-  <w:style w:type="table" w:styleId="Grillemoyenne1">
+  <w:style w:type="table" w:styleId="MediumGrid1">
     <w:name w:val="Medium Grid 1"/>
-    <w:basedOn w:val="TableauNormal"/>
+    <w:basedOn w:val="TableNormal"/>
     <w:uiPriority w:val="67"/>
     <w:rsid w:val="00CB0664"/>
     <w:pPr>
@@ -7580,9 +7688,9 @@
       </w:tcPr>
     </w:tblStylePr>
   </w:style>
-  <w:style w:type="table" w:styleId="Grillemoyenne1-Accent1">
+  <w:style w:type="table" w:styleId="MediumGrid1-Accent1">
     <w:name w:val="Medium Grid 1 Accent 1"/>
-    <w:basedOn w:val="TableauNormal"/>
+    <w:basedOn w:val="TableNormal"/>
     <w:uiPriority w:val="67"/>
     <w:rsid w:val="00CB0664"/>
     <w:pPr>
@@ -7646,9 +7754,9 @@
       </w:tcPr>
     </w:tblStylePr>
   </w:style>
-  <w:style w:type="table" w:styleId="Grillemoyenne1-Accent2">
+  <w:style w:type="table" w:styleId="MediumGrid1-Accent2">
     <w:name w:val="Medium Grid 1 Accent 2"/>
-    <w:basedOn w:val="TableauNormal"/>
+    <w:basedOn w:val="TableNormal"/>
     <w:uiPriority w:val="67"/>
     <w:rsid w:val="00CB0664"/>
     <w:pPr>
@@ -7712,9 +7820,9 @@
       </w:tcPr>
     </w:tblStylePr>
   </w:style>
-  <w:style w:type="table" w:styleId="Grillemoyenne1-Accent3">
+  <w:style w:type="table" w:styleId="MediumGrid1-Accent3">
     <w:name w:val="Medium Grid 1 Accent 3"/>
-    <w:basedOn w:val="TableauNormal"/>
+    <w:basedOn w:val="TableNormal"/>
     <w:uiPriority w:val="67"/>
     <w:rsid w:val="00CB0664"/>
     <w:pPr>
@@ -7778,9 +7886,9 @@
       </w:tcPr>
     </w:tblStylePr>
   </w:style>
-  <w:style w:type="table" w:styleId="Grillemoyenne1-Accent4">
+  <w:style w:type="table" w:styleId="MediumGrid1-Accent4">
     <w:name w:val="Medium Grid 1 Accent 4"/>
-    <w:basedOn w:val="TableauNormal"/>
+    <w:basedOn w:val="TableNormal"/>
     <w:uiPriority w:val="67"/>
     <w:rsid w:val="00CB0664"/>
     <w:pPr>
@@ -7844,9 +7952,9 @@
       </w:tcPr>
     </w:tblStylePr>
   </w:style>
-  <w:style w:type="table" w:styleId="Grillemoyenne1-Accent5">
+  <w:style w:type="table" w:styleId="MediumGrid1-Accent5">
     <w:name w:val="Medium Grid 1 Accent 5"/>
-    <w:basedOn w:val="TableauNormal"/>
+    <w:basedOn w:val="TableNormal"/>
     <w:uiPriority w:val="67"/>
     <w:rsid w:val="00CB0664"/>
     <w:pPr>
@@ -7910,9 +8018,9 @@
       </w:tcPr>
     </w:tblStylePr>
   </w:style>
-  <w:style w:type="table" w:styleId="Grillemoyenne1-Accent6">
+  <w:style w:type="table" w:styleId="MediumGrid1-Accent6">
     <w:name w:val="Medium Grid 1 Accent 6"/>
-    <w:basedOn w:val="TableauNormal"/>
+    <w:basedOn w:val="TableNormal"/>
     <w:uiPriority w:val="67"/>
     <w:rsid w:val="00CB0664"/>
     <w:pPr>
@@ -7976,9 +8084,9 @@
       </w:tcPr>
     </w:tblStylePr>
   </w:style>
-  <w:style w:type="table" w:styleId="Grillemoyenne2">
+  <w:style w:type="table" w:styleId="MediumGrid2">
     <w:name w:val="Medium Grid 2"/>
-    <w:basedOn w:val="TableauNormal"/>
+    <w:basedOn w:val="TableNormal"/>
     <w:uiPriority w:val="68"/>
     <w:rsid w:val="00CB0664"/>
     <w:pPr>
@@ -8094,9 +8202,9 @@
       </w:tcPr>
     </w:tblStylePr>
   </w:style>
-  <w:style w:type="table" w:styleId="Grillemoyenne2-Accent1">
+  <w:style w:type="table" w:styleId="MediumGrid2-Accent1">
     <w:name w:val="Medium Grid 2 Accent 1"/>
-    <w:basedOn w:val="TableauNormal"/>
+    <w:basedOn w:val="TableNormal"/>
     <w:uiPriority w:val="68"/>
     <w:rsid w:val="00CB0664"/>
     <w:pPr>
@@ -8212,9 +8320,9 @@
       </w:tcPr>
     </w:tblStylePr>
   </w:style>
-  <w:style w:type="table" w:styleId="Grillemoyenne2-Accent2">
+  <w:style w:type="table" w:styleId="MediumGrid2-Accent2">
     <w:name w:val="Medium Grid 2 Accent 2"/>
-    <w:basedOn w:val="TableauNormal"/>
+    <w:basedOn w:val="TableNormal"/>
     <w:uiPriority w:val="68"/>
     <w:rsid w:val="00CB0664"/>
     <w:pPr>
@@ -8330,9 +8438,9 @@
       </w:tcPr>
     </w:tblStylePr>
   </w:style>
-  <w:style w:type="table" w:styleId="Grillemoyenne2-Accent3">
+  <w:style w:type="table" w:styleId="MediumGrid2-Accent3">
     <w:name w:val="Medium Grid 2 Accent 3"/>
-    <w:basedOn w:val="TableauNormal"/>
+    <w:basedOn w:val="TableNormal"/>
     <w:uiPriority w:val="68"/>
     <w:rsid w:val="00CB0664"/>
     <w:pPr>
@@ -8448,9 +8556,9 @@
       </w:tcPr>
     </w:tblStylePr>
   </w:style>
-  <w:style w:type="table" w:styleId="Grillemoyenne2-Accent4">
+  <w:style w:type="table" w:styleId="MediumGrid2-Accent4">
     <w:name w:val="Medium Grid 2 Accent 4"/>
-    <w:basedOn w:val="TableauNormal"/>
+    <w:basedOn w:val="TableNormal"/>
     <w:uiPriority w:val="68"/>
     <w:rsid w:val="00CB0664"/>
     <w:pPr>
@@ -8566,9 +8674,9 @@
       </w:tcPr>
     </w:tblStylePr>
   </w:style>
-  <w:style w:type="table" w:styleId="Grillemoyenne2-Accent5">
+  <w:style w:type="table" w:styleId="MediumGrid2-Accent5">
     <w:name w:val="Medium Grid 2 Accent 5"/>
-    <w:basedOn w:val="TableauNormal"/>
+    <w:basedOn w:val="TableNormal"/>
     <w:uiPriority w:val="68"/>
     <w:rsid w:val="00CB0664"/>
     <w:pPr>
@@ -8684,9 +8792,9 @@
       </w:tcPr>
     </w:tblStylePr>
   </w:style>
-  <w:style w:type="table" w:styleId="Grillemoyenne2-Accent6">
+  <w:style w:type="table" w:styleId="MediumGrid2-Accent6">
     <w:name w:val="Medium Grid 2 Accent 6"/>
-    <w:basedOn w:val="TableauNormal"/>
+    <w:basedOn w:val="TableNormal"/>
     <w:uiPriority w:val="68"/>
     <w:rsid w:val="00CB0664"/>
     <w:pPr>
@@ -8802,9 +8910,9 @@
       </w:tcPr>
     </w:tblStylePr>
   </w:style>
-  <w:style w:type="table" w:styleId="Grillemoyenne3">
+  <w:style w:type="table" w:styleId="MediumGrid3">
     <w:name w:val="Medium Grid 3"/>
-    <w:basedOn w:val="TableauNormal"/>
+    <w:basedOn w:val="TableNormal"/>
     <w:uiPriority w:val="69"/>
     <w:rsid w:val="00CB0664"/>
     <w:pPr>
@@ -8936,9 +9044,9 @@
       </w:tcPr>
     </w:tblStylePr>
   </w:style>
-  <w:style w:type="table" w:styleId="Grillemoyenne3-Accent1">
+  <w:style w:type="table" w:styleId="MediumGrid3-Accent1">
     <w:name w:val="Medium Grid 3 Accent 1"/>
-    <w:basedOn w:val="TableauNormal"/>
+    <w:basedOn w:val="TableNormal"/>
     <w:uiPriority w:val="69"/>
     <w:rsid w:val="00CB0664"/>
     <w:pPr>
@@ -9070,9 +9178,9 @@
       </w:tcPr>
     </w:tblStylePr>
   </w:style>
-  <w:style w:type="table" w:styleId="Grillemoyenne3-Accent2">
+  <w:style w:type="table" w:styleId="MediumGrid3-Accent2">
     <w:name w:val="Medium Grid 3 Accent 2"/>
-    <w:basedOn w:val="TableauNormal"/>
+    <w:basedOn w:val="TableNormal"/>
     <w:uiPriority w:val="69"/>
     <w:rsid w:val="00CB0664"/>
     <w:pPr>
@@ -9204,9 +9312,9 @@
       </w:tcPr>
     </w:tblStylePr>
   </w:style>
-  <w:style w:type="table" w:styleId="Grillemoyenne3-Accent3">
+  <w:style w:type="table" w:styleId="MediumGrid3-Accent3">
     <w:name w:val="Medium Grid 3 Accent 3"/>
-    <w:basedOn w:val="TableauNormal"/>
+    <w:basedOn w:val="TableNormal"/>
     <w:uiPriority w:val="69"/>
     <w:rsid w:val="00CB0664"/>
     <w:pPr>
@@ -9338,9 +9446,9 @@
       </w:tcPr>
     </w:tblStylePr>
   </w:style>
-  <w:style w:type="table" w:styleId="Grillemoyenne3-Accent4">
+  <w:style w:type="table" w:styleId="MediumGrid3-Accent4">
     <w:name w:val="Medium Grid 3 Accent 4"/>
-    <w:basedOn w:val="TableauNormal"/>
+    <w:basedOn w:val="TableNormal"/>
     <w:uiPriority w:val="69"/>
     <w:rsid w:val="00CB0664"/>
     <w:pPr>
@@ -9472,9 +9580,9 @@
       </w:tcPr>
     </w:tblStylePr>
   </w:style>
-  <w:style w:type="table" w:styleId="Grillemoyenne3-Accent5">
+  <w:style w:type="table" w:styleId="MediumGrid3-Accent5">
     <w:name w:val="Medium Grid 3 Accent 5"/>
-    <w:basedOn w:val="TableauNormal"/>
+    <w:basedOn w:val="TableNormal"/>
     <w:uiPriority w:val="69"/>
     <w:rsid w:val="00CB0664"/>
     <w:pPr>
@@ -9606,9 +9714,9 @@
       </w:tcPr>
     </w:tblStylePr>
   </w:style>
-  <w:style w:type="table" w:styleId="Grillemoyenne3-Accent6">
+  <w:style w:type="table" w:styleId="MediumGrid3-Accent6">
     <w:name w:val="Medium Grid 3 Accent 6"/>
-    <w:basedOn w:val="TableauNormal"/>
+    <w:basedOn w:val="TableNormal"/>
     <w:uiPriority w:val="69"/>
     <w:rsid w:val="00CB0664"/>
     <w:pPr>
@@ -9740,9 +9848,9 @@
       </w:tcPr>
     </w:tblStylePr>
   </w:style>
-  <w:style w:type="table" w:styleId="Listefonce">
+  <w:style w:type="table" w:styleId="DarkList">
     <w:name w:val="Dark List"/>
-    <w:basedOn w:val="TableauNormal"/>
+    <w:basedOn w:val="TableNormal"/>
     <w:uiPriority w:val="70"/>
     <w:rsid w:val="00CB0664"/>
     <w:pPr>
@@ -9847,9 +9955,9 @@
       </w:tcPr>
     </w:tblStylePr>
   </w:style>
-  <w:style w:type="table" w:styleId="Listefonce-Accent1">
+  <w:style w:type="table" w:styleId="DarkList-Accent1">
     <w:name w:val="Dark List Accent 1"/>
-    <w:basedOn w:val="TableauNormal"/>
+    <w:basedOn w:val="TableNormal"/>
     <w:uiPriority w:val="70"/>
     <w:rsid w:val="00CB0664"/>
     <w:pPr>
@@ -9954,9 +10062,9 @@
       </w:tcPr>
     </w:tblStylePr>
   </w:style>
-  <w:style w:type="table" w:styleId="Listefonce-Accent2">
+  <w:style w:type="table" w:styleId="DarkList-Accent2">
     <w:name w:val="Dark List Accent 2"/>
-    <w:basedOn w:val="TableauNormal"/>
+    <w:basedOn w:val="TableNormal"/>
     <w:uiPriority w:val="70"/>
     <w:rsid w:val="00CB0664"/>
     <w:pPr>
@@ -10061,9 +10169,9 @@
       </w:tcPr>
     </w:tblStylePr>
   </w:style>
-  <w:style w:type="table" w:styleId="Listefonce-Accent3">
+  <w:style w:type="table" w:styleId="DarkList-Accent3">
     <w:name w:val="Dark List Accent 3"/>
-    <w:basedOn w:val="TableauNormal"/>
+    <w:basedOn w:val="TableNormal"/>
     <w:uiPriority w:val="70"/>
     <w:rsid w:val="00CB0664"/>
     <w:pPr>
@@ -10168,9 +10276,9 @@
       </w:tcPr>
     </w:tblStylePr>
   </w:style>
-  <w:style w:type="table" w:styleId="Listefonce-Accent4">
+  <w:style w:type="table" w:styleId="DarkList-Accent4">
     <w:name w:val="Dark List Accent 4"/>
-    <w:basedOn w:val="TableauNormal"/>
+    <w:basedOn w:val="TableNormal"/>
     <w:uiPriority w:val="70"/>
     <w:rsid w:val="00CB0664"/>
     <w:pPr>
@@ -10275,9 +10383,9 @@
       </w:tcPr>
     </w:tblStylePr>
   </w:style>
-  <w:style w:type="table" w:styleId="Listefonce-Accent5">
+  <w:style w:type="table" w:styleId="DarkList-Accent5">
     <w:name w:val="Dark List Accent 5"/>
-    <w:basedOn w:val="TableauNormal"/>
+    <w:basedOn w:val="TableNormal"/>
     <w:uiPriority w:val="70"/>
     <w:rsid w:val="00CB0664"/>
     <w:pPr>
@@ -10382,9 +10490,9 @@
       </w:tcPr>
     </w:tblStylePr>
   </w:style>
-  <w:style w:type="table" w:styleId="Listefonce-Accent6">
+  <w:style w:type="table" w:styleId="DarkList-Accent6">
     <w:name w:val="Dark List Accent 6"/>
-    <w:basedOn w:val="TableauNormal"/>
+    <w:basedOn w:val="TableNormal"/>
     <w:uiPriority w:val="70"/>
     <w:rsid w:val="00CB0664"/>
     <w:pPr>
@@ -10489,9 +10597,9 @@
       </w:tcPr>
     </w:tblStylePr>
   </w:style>
-  <w:style w:type="table" w:styleId="Tramecouleur">
+  <w:style w:type="table" w:styleId="ColorfulShading">
     <w:name w:val="Colorful Shading"/>
-    <w:basedOn w:val="TableauNormal"/>
+    <w:basedOn w:val="TableNormal"/>
     <w:uiPriority w:val="71"/>
     <w:rsid w:val="00CB0664"/>
     <w:pPr>
@@ -10604,9 +10712,9 @@
       </w:rPr>
     </w:tblStylePr>
   </w:style>
-  <w:style w:type="table" w:styleId="Tramecouleur-Accent1">
+  <w:style w:type="table" w:styleId="ColorfulShading-Accent1">
     <w:name w:val="Colorful Shading Accent 1"/>
-    <w:basedOn w:val="TableauNormal"/>
+    <w:basedOn w:val="TableNormal"/>
     <w:uiPriority w:val="71"/>
     <w:rsid w:val="00CB0664"/>
     <w:pPr>
@@ -10719,9 +10827,9 @@
       </w:rPr>
     </w:tblStylePr>
   </w:style>
-  <w:style w:type="table" w:styleId="Tramecouleur-Accent2">
+  <w:style w:type="table" w:styleId="ColorfulShading-Accent2">
     <w:name w:val="Colorful Shading Accent 2"/>
-    <w:basedOn w:val="TableauNormal"/>
+    <w:basedOn w:val="TableNormal"/>
     <w:uiPriority w:val="71"/>
     <w:rsid w:val="00CB0664"/>
     <w:pPr>
@@ -10834,9 +10942,9 @@
       </w:rPr>
     </w:tblStylePr>
   </w:style>
-  <w:style w:type="table" w:styleId="Tramecouleur-Accent3">
+  <w:style w:type="table" w:styleId="ColorfulShading-Accent3">
     <w:name w:val="Colorful Shading Accent 3"/>
-    <w:basedOn w:val="TableauNormal"/>
+    <w:basedOn w:val="TableNormal"/>
     <w:uiPriority w:val="71"/>
     <w:rsid w:val="00CB0664"/>
     <w:pPr>
@@ -10939,9 +11047,9 @@
       </w:tcPr>
     </w:tblStylePr>
   </w:style>
-  <w:style w:type="table" w:styleId="Tramecouleur-Accent4">
+  <w:style w:type="table" w:styleId="ColorfulShading-Accent4">
     <w:name w:val="Colorful Shading Accent 4"/>
-    <w:basedOn w:val="TableauNormal"/>
+    <w:basedOn w:val="TableNormal"/>
     <w:uiPriority w:val="71"/>
     <w:rsid w:val="00CB0664"/>
     <w:pPr>
@@ -11054,9 +11162,9 @@
       </w:rPr>
     </w:tblStylePr>
   </w:style>
-  <w:style w:type="table" w:styleId="Tramecouleur-Accent5">
+  <w:style w:type="table" w:styleId="ColorfulShading-Accent5">
     <w:name w:val="Colorful Shading Accent 5"/>
-    <w:basedOn w:val="TableauNormal"/>
+    <w:basedOn w:val="TableNormal"/>
     <w:uiPriority w:val="71"/>
     <w:rsid w:val="00CB0664"/>
     <w:pPr>
@@ -11169,9 +11277,9 @@
       </w:rPr>
     </w:tblStylePr>
   </w:style>
-  <w:style w:type="table" w:styleId="Tramecouleur-Accent6">
+  <w:style w:type="table" w:styleId="ColorfulShading-Accent6">
     <w:name w:val="Colorful Shading Accent 6"/>
-    <w:basedOn w:val="TableauNormal"/>
+    <w:basedOn w:val="TableNormal"/>
     <w:uiPriority w:val="71"/>
     <w:rsid w:val="00CB0664"/>
     <w:pPr>
@@ -11284,9 +11392,9 @@
       </w:rPr>
     </w:tblStylePr>
   </w:style>
-  <w:style w:type="table" w:styleId="Listecouleur">
+  <w:style w:type="table" w:styleId="ColorfulList">
     <w:name w:val="Colorful List"/>
-    <w:basedOn w:val="TableauNormal"/>
+    <w:basedOn w:val="TableNormal"/>
     <w:uiPriority w:val="72"/>
     <w:rsid w:val="00CB0664"/>
     <w:pPr>
@@ -11363,9 +11471,9 @@
       </w:tcPr>
     </w:tblStylePr>
   </w:style>
-  <w:style w:type="table" w:styleId="Listecouleur-Accent1">
+  <w:style w:type="table" w:styleId="ColorfulList-Accent1">
     <w:name w:val="Colorful List Accent 1"/>
-    <w:basedOn w:val="TableauNormal"/>
+    <w:basedOn w:val="TableNormal"/>
     <w:uiPriority w:val="72"/>
     <w:rsid w:val="00CB0664"/>
     <w:pPr>
@@ -11442,9 +11550,9 @@
       </w:tcPr>
     </w:tblStylePr>
   </w:style>
-  <w:style w:type="table" w:styleId="Listecouleur-Accent2">
+  <w:style w:type="table" w:styleId="ColorfulList-Accent2">
     <w:name w:val="Colorful List Accent 2"/>
-    <w:basedOn w:val="TableauNormal"/>
+    <w:basedOn w:val="TableNormal"/>
     <w:uiPriority w:val="72"/>
     <w:rsid w:val="00CB0664"/>
     <w:pPr>
@@ -11521,9 +11629,9 @@
       </w:tcPr>
     </w:tblStylePr>
   </w:style>
-  <w:style w:type="table" w:styleId="Listecouleur-Accent3">
+  <w:style w:type="table" w:styleId="ColorfulList-Accent3">
     <w:name w:val="Colorful List Accent 3"/>
-    <w:basedOn w:val="TableauNormal"/>
+    <w:basedOn w:val="TableNormal"/>
     <w:uiPriority w:val="72"/>
     <w:rsid w:val="00CB0664"/>
     <w:pPr>
@@ -11600,9 +11708,9 @@
       </w:tcPr>
     </w:tblStylePr>
   </w:style>
-  <w:style w:type="table" w:styleId="Listecouleur-Accent4">
+  <w:style w:type="table" w:styleId="ColorfulList-Accent4">
     <w:name w:val="Colorful List Accent 4"/>
-    <w:basedOn w:val="TableauNormal"/>
+    <w:basedOn w:val="TableNormal"/>
     <w:uiPriority w:val="72"/>
     <w:rsid w:val="00CB0664"/>
     <w:pPr>
@@ -11679,9 +11787,9 @@
       </w:tcPr>
     </w:tblStylePr>
   </w:style>
-  <w:style w:type="table" w:styleId="Listecouleur-Accent5">
+  <w:style w:type="table" w:styleId="ColorfulList-Accent5">
     <w:name w:val="Colorful List Accent 5"/>
-    <w:basedOn w:val="TableauNormal"/>
+    <w:basedOn w:val="TableNormal"/>
     <w:uiPriority w:val="72"/>
     <w:rsid w:val="00CB0664"/>
     <w:pPr>
@@ -11758,9 +11866,9 @@
       </w:tcPr>
     </w:tblStylePr>
   </w:style>
-  <w:style w:type="table" w:styleId="Listecouleur-Accent6">
+  <w:style w:type="table" w:styleId="ColorfulList-Accent6">
     <w:name w:val="Colorful List Accent 6"/>
-    <w:basedOn w:val="TableauNormal"/>
+    <w:basedOn w:val="TableNormal"/>
     <w:uiPriority w:val="72"/>
     <w:rsid w:val="00CB0664"/>
     <w:pPr>
@@ -11837,9 +11945,9 @@
       </w:tcPr>
     </w:tblStylePr>
   </w:style>
-  <w:style w:type="table" w:styleId="Grillecouleur">
+  <w:style w:type="table" w:styleId="ColorfulGrid">
     <w:name w:val="Colorful Grid"/>
-    <w:basedOn w:val="TableauNormal"/>
+    <w:basedOn w:val="TableNormal"/>
     <w:uiPriority w:val="73"/>
     <w:rsid w:val="00CB0664"/>
     <w:pPr>
@@ -11910,9 +12018,9 @@
       </w:tcPr>
     </w:tblStylePr>
   </w:style>
-  <w:style w:type="table" w:styleId="Grillecouleur-Accent1">
+  <w:style w:type="table" w:styleId="ColorfulGrid-Accent1">
     <w:name w:val="Colorful Grid Accent 1"/>
-    <w:basedOn w:val="TableauNormal"/>
+    <w:basedOn w:val="TableNormal"/>
     <w:uiPriority w:val="73"/>
     <w:rsid w:val="00CB0664"/>
     <w:pPr>
@@ -11983,9 +12091,9 @@
       </w:tcPr>
     </w:tblStylePr>
   </w:style>
-  <w:style w:type="table" w:styleId="Grillecouleur-Accent2">
+  <w:style w:type="table" w:styleId="ColorfulGrid-Accent2">
     <w:name w:val="Colorful Grid Accent 2"/>
-    <w:basedOn w:val="TableauNormal"/>
+    <w:basedOn w:val="TableNormal"/>
     <w:uiPriority w:val="73"/>
     <w:rsid w:val="00CB0664"/>
     <w:pPr>
@@ -12056,9 +12164,9 @@
       </w:tcPr>
     </w:tblStylePr>
   </w:style>
-  <w:style w:type="table" w:styleId="Grillecouleur-Accent3">
+  <w:style w:type="table" w:styleId="ColorfulGrid-Accent3">
     <w:name w:val="Colorful Grid Accent 3"/>
-    <w:basedOn w:val="TableauNormal"/>
+    <w:basedOn w:val="TableNormal"/>
     <w:uiPriority w:val="73"/>
     <w:rsid w:val="00CB0664"/>
     <w:pPr>
@@ -12129,9 +12237,9 @@
       </w:tcPr>
     </w:tblStylePr>
   </w:style>
-  <w:style w:type="table" w:styleId="Grillecouleur-Accent4">
+  <w:style w:type="table" w:styleId="ColorfulGrid-Accent4">
     <w:name w:val="Colorful Grid Accent 4"/>
-    <w:basedOn w:val="TableauNormal"/>
+    <w:basedOn w:val="TableNormal"/>
     <w:uiPriority w:val="73"/>
     <w:rsid w:val="00CB0664"/>
     <w:pPr>
@@ -12202,9 +12310,9 @@
       </w:tcPr>
     </w:tblStylePr>
   </w:style>
-  <w:style w:type="table" w:styleId="Grillecouleur-Accent5">
+  <w:style w:type="table" w:styleId="ColorfulGrid-Accent5">
     <w:name w:val="Colorful Grid Accent 5"/>
-    <w:basedOn w:val="TableauNormal"/>
+    <w:basedOn w:val="TableNormal"/>
     <w:uiPriority w:val="73"/>
     <w:rsid w:val="00CB0664"/>
     <w:pPr>
@@ -12275,9 +12383,9 @@
       </w:tcPr>
     </w:tblStylePr>
   </w:style>
-  <w:style w:type="table" w:styleId="Grillecouleur-Accent6">
+  <w:style w:type="table" w:styleId="ColorfulGrid-Accent6">
     <w:name w:val="Colorful Grid Accent 6"/>
-    <w:basedOn w:val="TableauNormal"/>
+    <w:basedOn w:val="TableNormal"/>
     <w:uiPriority w:val="73"/>
     <w:rsid w:val="00CB0664"/>
     <w:pPr>
@@ -12366,7 +12474,7 @@
   </w:style>
   <w:style w:type="character" w:customStyle="1" w:styleId="Title2Car">
     <w:name w:val="Title 2 Car"/>
-    <w:basedOn w:val="Policepardfaut"/>
+    <w:basedOn w:val="DefaultParagraphFont"/>
     <w:link w:val="Title2"/>
     <w:rsid w:val="00741173"/>
     <w:rPr>
@@ -12390,7 +12498,7 @@
   </w:style>
   <w:style w:type="character" w:customStyle="1" w:styleId="BodyCar">
     <w:name w:val="Body Car"/>
-    <w:basedOn w:val="Policepardfaut"/>
+    <w:basedOn w:val="DefaultParagraphFont"/>
     <w:link w:val="Body"/>
     <w:rsid w:val="00741173"/>
     <w:rPr>

</xml_diff>

<commit_message>
update process book's structure
</commit_message>
<xml_diff>
--- a/milestones/Steaming_Dev_Gossip_Design_Process_Book.docx
+++ b/milestones/Steaming_Dev_Gossip_Design_Process_Book.docx
@@ -4,25 +4,29 @@
   <w:body>
     <w:p>
       <w:pPr>
-        <w:spacing w:before="600" w:after="80"/>
+        <w:spacing w:after="80"/>
         <w:jc w:val="center"/>
         <w:rPr>
-          <w:rFonts w:ascii="Impact" w:hAnsi="Impact"/>
-          <w:color w:val="121214"/>
-          <w:sz w:val="56"/>
+          <w:rFonts w:ascii="TT Octosquares Trial" w:hAnsi="TT Octosquares Trial"/>
+          <w:sz w:val="18"/>
+          <w:szCs w:val="18"/>
         </w:rPr>
       </w:pPr>
       <w:r>
         <w:rPr>
-          <w:rFonts w:ascii="Impact" w:hAnsi="Impact"/>
+          <w:rFonts w:ascii="TT Octosquares Trial" w:hAnsi="TT Octosquares Trial"/>
+          <w:b/>
+          <w:bCs/>
           <w:color w:val="121214"/>
-          <w:sz w:val="56"/>
+          <w:sz w:val="72"/>
+          <w:szCs w:val="24"/>
+          <w:lang w:val="en-US"/>
         </w:rPr>
         <w:drawing>
-          <wp:inline distT="0" distB="0" distL="0" distR="0" wp14:anchorId="1F239191" wp14:editId="1A4DFA74">
-            <wp:extent cx="5943600" cy="893445"/>
-            <wp:effectExtent l="0" t="0" r="0" b="1905"/>
-            <wp:docPr id="112178737" name="Image 1"/>
+          <wp:inline distT="0" distB="0" distL="0" distR="0" wp14:anchorId="1E2EEFAE" wp14:editId="737AF696">
+            <wp:extent cx="5943600" cy="548005"/>
+            <wp:effectExtent l="0" t="0" r="0" b="4445"/>
+            <wp:docPr id="2115429302" name="Image 1"/>
             <wp:cNvGraphicFramePr>
               <a:graphicFrameLocks xmlns:a="http://schemas.openxmlformats.org/drawingml/2006/main" noChangeAspect="1"/>
             </wp:cNvGraphicFramePr>
@@ -30,7 +34,7 @@
               <a:graphicData uri="http://schemas.openxmlformats.org/drawingml/2006/picture">
                 <pic:pic xmlns:pic="http://schemas.openxmlformats.org/drawingml/2006/picture">
                   <pic:nvPicPr>
-                    <pic:cNvPr id="112178737" name=""/>
+                    <pic:cNvPr id="2115429302" name=""/>
                     <pic:cNvPicPr/>
                   </pic:nvPicPr>
                   <pic:blipFill>
@@ -42,7 +46,7 @@
                   <pic:spPr>
                     <a:xfrm>
                       <a:off x="0" y="0"/>
-                      <a:ext cx="5943600" cy="893445"/>
+                      <a:ext cx="5943600" cy="548005"/>
                     </a:xfrm>
                     <a:prstGeom prst="rect">
                       <a:avLst/>
@@ -54,28 +58,577 @@
           </wp:inline>
         </w:drawing>
       </w:r>
-    </w:p>
-    <w:p>
-      <w:pPr>
-        <w:spacing w:after="80"/>
-        <w:jc w:val="center"/>
-        <w:rPr>
-          <w:rFonts w:ascii="TALERO" w:hAnsi="TALERO"/>
-        </w:rPr>
-      </w:pPr>
       <w:r>
         <w:rPr>
-          <w:rFonts w:ascii="TALERO" w:hAnsi="TALERO"/>
+          <w:rFonts w:ascii="TT Octosquares Trial" w:hAnsi="TT Octosquares Trial"/>
           <w:color w:val="121214"/>
-          <w:sz w:val="56"/>
+          <w:sz w:val="44"/>
+          <w:szCs w:val="16"/>
         </w:rPr>
         <w:t>WEB DESIGN PROCESS BOOK</w:t>
       </w:r>
     </w:p>
     <w:p>
       <w:pPr>
-        <w:spacing w:after="400"/>
-        <w:jc w:val="center"/>
+        <w:pStyle w:val="Title2"/>
+        <w:rPr>
+          <w:lang w:val="en-US"/>
+        </w:rPr>
+      </w:pPr>
+      <w:r>
+        <w:rPr>
+          <w:lang w:val="en-US"/>
+        </w:rPr>
+        <w:t>PROJECT OVERVIEW</w:t>
+      </w:r>
+    </w:p>
+    <w:p>
+      <w:pPr>
+        <w:pStyle w:val="Body"/>
+        <w:numPr>
+          <w:ilvl w:val="0"/>
+          <w:numId w:val="11"/>
+        </w:numPr>
+        <w:spacing w:after="240"/>
+      </w:pPr>
+      <w:r>
+        <w:rPr>
+          <w:color w:val="000000" w:themeColor="text1"/>
+        </w:rPr>
+        <w:t xml:space="preserve">Un genre </w:t>
+      </w:r>
+      <w:proofErr w:type="spellStart"/>
+      <w:r>
+        <w:rPr>
+          <w:color w:val="000000" w:themeColor="text1"/>
+        </w:rPr>
+        <w:t>d’abstract</w:t>
+      </w:r>
+      <w:proofErr w:type="spellEnd"/>
+      <w:r>
+        <w:rPr>
+          <w:color w:val="000000" w:themeColor="text1"/>
+        </w:rPr>
+        <w:t xml:space="preserve"> </w:t>
+      </w:r>
+    </w:p>
+    <w:p>
+      <w:pPr>
+        <w:pStyle w:val="Title2"/>
+      </w:pPr>
+      <w:r>
+        <w:t>How we get there (changer titre)</w:t>
+      </w:r>
+    </w:p>
+    <w:p>
+      <w:pPr>
+        <w:pStyle w:val="Body"/>
+        <w:numPr>
+          <w:ilvl w:val="0"/>
+          <w:numId w:val="11"/>
+        </w:numPr>
+        <w:spacing w:line="240" w:lineRule="auto"/>
+        <w:rPr>
+          <w:color w:val="000000" w:themeColor="text1"/>
+          <w:lang w:val="en-US"/>
+        </w:rPr>
+      </w:pPr>
+      <w:r>
+        <w:rPr>
+          <w:color w:val="000000" w:themeColor="text1"/>
+          <w:lang w:val="en-US"/>
+        </w:rPr>
+        <w:t xml:space="preserve">Why we chose </w:t>
+      </w:r>
+      <w:r>
+        <w:rPr>
+          <w:color w:val="000000" w:themeColor="text1"/>
+          <w:lang w:val="en-US"/>
+        </w:rPr>
+        <w:t>to do th</w:t>
+      </w:r>
+      <w:r>
+        <w:rPr>
+          <w:color w:val="000000" w:themeColor="text1"/>
+          <w:lang w:val="en-US"/>
+        </w:rPr>
+        <w:t>is</w:t>
+      </w:r>
+      <w:r>
+        <w:rPr>
+          <w:color w:val="000000" w:themeColor="text1"/>
+          <w:lang w:val="en-US"/>
+        </w:rPr>
+        <w:t xml:space="preserve"> project </w:t>
+      </w:r>
+      <w:r>
+        <w:rPr>
+          <w:color w:val="000000" w:themeColor="text1"/>
+          <w:lang w:val="en-US"/>
+        </w:rPr>
+        <w:t>(</w:t>
+      </w:r>
+      <w:proofErr w:type="spellStart"/>
+      <w:r>
+        <w:rPr>
+          <w:color w:val="000000" w:themeColor="text1"/>
+          <w:lang w:val="en-US"/>
+        </w:rPr>
+        <w:t>parler</w:t>
+      </w:r>
+      <w:proofErr w:type="spellEnd"/>
+      <w:r>
+        <w:rPr>
+          <w:color w:val="000000" w:themeColor="text1"/>
+          <w:lang w:val="en-US"/>
+        </w:rPr>
+        <w:t xml:space="preserve"> de </w:t>
+      </w:r>
+      <w:proofErr w:type="spellStart"/>
+      <w:r>
+        <w:rPr>
+          <w:color w:val="000000" w:themeColor="text1"/>
+          <w:lang w:val="en-US"/>
+        </w:rPr>
+        <w:t>Mekisnoi</w:t>
+      </w:r>
+      <w:proofErr w:type="spellEnd"/>
+      <w:r>
+        <w:rPr>
+          <w:color w:val="000000" w:themeColor="text1"/>
+          <w:lang w:val="en-US"/>
+        </w:rPr>
+        <w:t xml:space="preserve"> pour </w:t>
+      </w:r>
+      <w:proofErr w:type="spellStart"/>
+      <w:r>
+        <w:rPr>
+          <w:color w:val="000000" w:themeColor="text1"/>
+          <w:lang w:val="en-US"/>
+        </w:rPr>
+        <w:t>montrer</w:t>
+      </w:r>
+      <w:proofErr w:type="spellEnd"/>
+      <w:r>
+        <w:rPr>
+          <w:color w:val="000000" w:themeColor="text1"/>
+          <w:lang w:val="en-US"/>
+        </w:rPr>
+        <w:t xml:space="preserve"> </w:t>
+      </w:r>
+      <w:proofErr w:type="spellStart"/>
+      <w:r>
+        <w:rPr>
+          <w:color w:val="000000" w:themeColor="text1"/>
+          <w:lang w:val="en-US"/>
+        </w:rPr>
+        <w:t>que</w:t>
+      </w:r>
+      <w:proofErr w:type="spellEnd"/>
+      <w:r>
+        <w:rPr>
+          <w:color w:val="000000" w:themeColor="text1"/>
+          <w:lang w:val="en-US"/>
+        </w:rPr>
+        <w:t xml:space="preserve"> </w:t>
+      </w:r>
+      <w:proofErr w:type="spellStart"/>
+      <w:r>
+        <w:rPr>
+          <w:color w:val="000000" w:themeColor="text1"/>
+          <w:lang w:val="en-US"/>
+        </w:rPr>
+        <w:t>c’est</w:t>
+      </w:r>
+      <w:proofErr w:type="spellEnd"/>
+      <w:r>
+        <w:rPr>
+          <w:color w:val="000000" w:themeColor="text1"/>
+          <w:lang w:val="en-US"/>
+        </w:rPr>
+        <w:t xml:space="preserve"> personnel)</w:t>
+      </w:r>
+    </w:p>
+    <w:p>
+      <w:pPr>
+        <w:pStyle w:val="Body"/>
+        <w:numPr>
+          <w:ilvl w:val="0"/>
+          <w:numId w:val="11"/>
+        </w:numPr>
+        <w:rPr>
+          <w:color w:val="000000" w:themeColor="text1"/>
+          <w:lang w:val="fr-CH"/>
+        </w:rPr>
+      </w:pPr>
+      <w:r>
+        <w:rPr>
+          <w:color w:val="000000" w:themeColor="text1"/>
+          <w:lang w:val="fr-CH"/>
+        </w:rPr>
+        <w:t xml:space="preserve">Inspirations (Steam </w:t>
+      </w:r>
+      <w:proofErr w:type="spellStart"/>
+      <w:r>
+        <w:rPr>
+          <w:color w:val="000000" w:themeColor="text1"/>
+          <w:lang w:val="fr-CH"/>
+        </w:rPr>
+        <w:t>Database</w:t>
+      </w:r>
+      <w:proofErr w:type="spellEnd"/>
+      <w:r>
+        <w:rPr>
+          <w:color w:val="000000" w:themeColor="text1"/>
+          <w:lang w:val="fr-CH"/>
+        </w:rPr>
+        <w:t>)</w:t>
+      </w:r>
+    </w:p>
+    <w:p>
+      <w:pPr>
+        <w:pStyle w:val="Body"/>
+        <w:numPr>
+          <w:ilvl w:val="0"/>
+          <w:numId w:val="11"/>
+        </w:numPr>
+        <w:rPr>
+          <w:color w:val="000000" w:themeColor="text1"/>
+          <w:lang w:val="en-US"/>
+        </w:rPr>
+      </w:pPr>
+      <w:r>
+        <w:rPr>
+          <w:color w:val="000000" w:themeColor="text1"/>
+          <w:lang w:val="en-US"/>
+        </w:rPr>
+        <w:t>Why we wanted</w:t>
+      </w:r>
+      <w:r>
+        <w:rPr>
+          <w:color w:val="000000" w:themeColor="text1"/>
+          <w:lang w:val="en-US"/>
+        </w:rPr>
+        <w:t xml:space="preserve"> to scrap the data (we want</w:t>
+      </w:r>
+      <w:r>
+        <w:rPr>
+          <w:color w:val="000000" w:themeColor="text1"/>
+          <w:lang w:val="en-US"/>
+        </w:rPr>
+        <w:t xml:space="preserve">ed to see our </w:t>
+      </w:r>
+      <w:proofErr w:type="spellStart"/>
+      <w:r>
+        <w:rPr>
+          <w:color w:val="000000" w:themeColor="text1"/>
+          <w:lang w:val="en-US"/>
+        </w:rPr>
+        <w:t>favourite</w:t>
+      </w:r>
+      <w:proofErr w:type="spellEnd"/>
+      <w:r>
+        <w:rPr>
+          <w:color w:val="000000" w:themeColor="text1"/>
+          <w:lang w:val="en-US"/>
+        </w:rPr>
+        <w:t xml:space="preserve"> new games</w:t>
+      </w:r>
+      <w:r>
+        <w:rPr>
+          <w:color w:val="000000" w:themeColor="text1"/>
+          <w:lang w:val="en-US"/>
+        </w:rPr>
+        <w:t>)</w:t>
+      </w:r>
+    </w:p>
+    <w:p>
+      <w:pPr>
+        <w:pStyle w:val="Title2"/>
+        <w:rPr>
+          <w:lang w:val="en-US"/>
+        </w:rPr>
+      </w:pPr>
+    </w:p>
+    <w:p>
+      <w:pPr>
+        <w:pStyle w:val="Title2"/>
+      </w:pPr>
+      <w:r>
+        <w:t>Dataset Summary</w:t>
+      </w:r>
+      <w:r>
+        <w:t xml:space="preserve"> and Preprocessing</w:t>
+      </w:r>
+    </w:p>
+    <w:p>
+      <w:pPr>
+        <w:pStyle w:val="Body"/>
+        <w:numPr>
+          <w:ilvl w:val="0"/>
+          <w:numId w:val="11"/>
+        </w:numPr>
+      </w:pPr>
+      <w:r>
+        <w:t>How we scraped the dataset</w:t>
+      </w:r>
+    </w:p>
+    <w:p>
+      <w:pPr>
+        <w:pStyle w:val="Body"/>
+        <w:numPr>
+          <w:ilvl w:val="0"/>
+          <w:numId w:val="11"/>
+        </w:numPr>
+      </w:pPr>
+      <w:r>
+        <w:t>What we can do with it. What we can’t do</w:t>
+      </w:r>
+    </w:p>
+    <w:p>
+      <w:pPr>
+        <w:pStyle w:val="Body"/>
+        <w:numPr>
+          <w:ilvl w:val="0"/>
+          <w:numId w:val="11"/>
+        </w:numPr>
+      </w:pPr>
+      <w:r>
+        <w:t>How we pre</w:t>
+      </w:r>
+      <w:r>
+        <w:t>-</w:t>
+      </w:r>
+      <w:r>
+        <w:t>processed the data (memory efficiency)</w:t>
+      </w:r>
+    </w:p>
+    <w:p>
+      <w:pPr>
+        <w:pStyle w:val="Title2"/>
+        <w:rPr>
+          <w:lang w:val="en-US"/>
+        </w:rPr>
+      </w:pPr>
+      <w:r>
+        <w:rPr>
+          <w:lang w:val="en-US"/>
+        </w:rPr>
+        <w:t>Visualization</w:t>
+      </w:r>
+      <w:r>
+        <w:rPr>
+          <w:lang w:val="en-US"/>
+        </w:rPr>
+        <w:t xml:space="preserve"> design and prototyping</w:t>
+      </w:r>
+    </w:p>
+    <w:p>
+      <w:pPr>
+        <w:pStyle w:val="Body"/>
+        <w:numPr>
+          <w:ilvl w:val="0"/>
+          <w:numId w:val="11"/>
+        </w:numPr>
+        <w:rPr>
+          <w:lang w:val="en-US"/>
+        </w:rPr>
+      </w:pPr>
+      <w:r>
+        <w:rPr>
+          <w:lang w:val="en-US"/>
+        </w:rPr>
+        <w:t xml:space="preserve">What </w:t>
+      </w:r>
+      <w:r>
+        <w:rPr>
+          <w:lang w:val="en-US"/>
+        </w:rPr>
+        <w:t>visualizations</w:t>
+      </w:r>
+      <w:r>
+        <w:rPr>
+          <w:lang w:val="en-US"/>
+        </w:rPr>
+        <w:t xml:space="preserve"> were needed</w:t>
+      </w:r>
+    </w:p>
+    <w:p>
+      <w:pPr>
+        <w:pStyle w:val="Body"/>
+        <w:numPr>
+          <w:ilvl w:val="0"/>
+          <w:numId w:val="11"/>
+        </w:numPr>
+        <w:rPr>
+          <w:lang w:val="en-US"/>
+        </w:rPr>
+      </w:pPr>
+      <w:r>
+        <w:rPr>
+          <w:lang w:val="en-US"/>
+        </w:rPr>
+        <w:t>MVP prototypes (images)</w:t>
+      </w:r>
+    </w:p>
+    <w:p>
+      <w:pPr>
+        <w:pStyle w:val="Title2"/>
+        <w:rPr>
+          <w:lang w:val="en-US"/>
+        </w:rPr>
+      </w:pPr>
+      <w:r>
+        <w:rPr>
+          <w:lang w:val="en-US"/>
+        </w:rPr>
+        <w:lastRenderedPageBreak/>
+        <w:t>Implementation of the website</w:t>
+      </w:r>
+    </w:p>
+    <w:p>
+      <w:pPr>
+        <w:pStyle w:val="Body"/>
+        <w:numPr>
+          <w:ilvl w:val="0"/>
+          <w:numId w:val="11"/>
+        </w:numPr>
+        <w:rPr>
+          <w:lang w:val="en-US"/>
+        </w:rPr>
+      </w:pPr>
+      <w:r>
+        <w:rPr>
+          <w:lang w:val="en-US"/>
+        </w:rPr>
+        <w:t xml:space="preserve">We used Typescript instead of JavaScript because static typing is essential </w:t>
+      </w:r>
+      <w:r>
+        <w:rPr>
+          <w:lang w:val="en-US"/>
+        </w:rPr>
+        <w:t>when dealing with</w:t>
+      </w:r>
+      <w:r>
+        <w:rPr>
+          <w:lang w:val="en-US"/>
+        </w:rPr>
+        <w:t xml:space="preserve"> heterogenous </w:t>
+      </w:r>
+      <w:r>
+        <w:rPr>
+          <w:lang w:val="en-US"/>
+        </w:rPr>
+        <w:t>fields in the database</w:t>
+      </w:r>
+    </w:p>
+    <w:p>
+      <w:pPr>
+        <w:pStyle w:val="Body"/>
+        <w:numPr>
+          <w:ilvl w:val="0"/>
+          <w:numId w:val="11"/>
+        </w:numPr>
+        <w:rPr>
+          <w:lang w:val="fr-CH"/>
+        </w:rPr>
+      </w:pPr>
+      <w:r>
+        <w:rPr>
+          <w:lang w:val="fr-CH"/>
+        </w:rPr>
+        <w:t>Code structure (index, styles, TS</w:t>
+      </w:r>
+      <w:r>
+        <w:rPr>
+          <w:lang w:val="fr-CH"/>
+        </w:rPr>
+        <w:t xml:space="preserve"> part) </w:t>
+      </w:r>
+    </w:p>
+    <w:p>
+      <w:pPr>
+        <w:pStyle w:val="Body"/>
+        <w:numPr>
+          <w:ilvl w:val="0"/>
+          <w:numId w:val="11"/>
+        </w:numPr>
+        <w:rPr>
+          <w:lang w:val="en-US"/>
+        </w:rPr>
+      </w:pPr>
+      <w:r>
+        <w:rPr>
+          <w:lang w:val="en-US"/>
+        </w:rPr>
+        <w:t>Deployment on GitHub pages</w:t>
+      </w:r>
+    </w:p>
+    <w:p>
+      <w:pPr>
+        <w:pStyle w:val="Title2"/>
+        <w:rPr>
+          <w:lang w:val="en-US"/>
+        </w:rPr>
+      </w:pPr>
+      <w:r>
+        <w:rPr>
+          <w:lang w:val="en-US"/>
+        </w:rPr>
+        <w:t xml:space="preserve">UI </w:t>
+      </w:r>
+      <w:r>
+        <w:rPr>
+          <w:lang w:val="en-US"/>
+        </w:rPr>
+        <w:t>Component</w:t>
+      </w:r>
+      <w:r>
+        <w:rPr>
+          <w:lang w:val="en-US"/>
+        </w:rPr>
+        <w:t>s</w:t>
+      </w:r>
+    </w:p>
+    <w:p>
+      <w:pPr>
+        <w:spacing w:after="80"/>
+        <w:ind w:left="360"/>
+        <w:rPr>
+          <w:rFonts w:ascii="TT Octosquares Trial" w:hAnsi="TT Octosquares Trial"/>
+          <w:b/>
+          <w:color w:val="A855F7"/>
+        </w:rPr>
+      </w:pPr>
+      <w:r>
+        <w:rPr>
+          <w:rFonts w:ascii="Times New Roman" w:hAnsi="Times New Roman" w:cs="Times New Roman"/>
+          <w:b/>
+          <w:color w:val="A855F7"/>
+        </w:rPr>
+        <w:t>▪</w:t>
+      </w:r>
+      <w:r>
+        <w:rPr>
+          <w:rFonts w:ascii="TT Octosquares Trial" w:hAnsi="TT Octosquares Trial"/>
+          <w:b/>
+          <w:color w:val="A855F7"/>
+        </w:rPr>
+        <w:t xml:space="preserve"> </w:t>
+      </w:r>
+      <w:r>
+        <w:rPr>
+          <w:rFonts w:ascii="TT Octosquares Trial" w:hAnsi="TT Octosquares Trial"/>
+          <w:b/>
+          <w:color w:val="A855F7"/>
+        </w:rPr>
+        <w:t>Game Data Card:</w:t>
+      </w:r>
+    </w:p>
+    <w:p>
+      <w:pPr>
+        <w:spacing w:after="80"/>
+        <w:ind w:left="360"/>
         <w:rPr>
           <w:rFonts w:ascii="TT Octosquares Trial" w:hAnsi="TT Octosquares Trial"/>
         </w:rPr>
@@ -83,32 +636,252 @@
       <w:r>
         <w:rPr>
           <w:rFonts w:ascii="TT Octosquares Trial" w:hAnsi="TT Octosquares Trial"/>
-          <w:color w:val="A855F7"/>
-          <w:sz w:val="26"/>
         </w:rPr>
-        <w:t>Project Case Study &amp; Interface Design Architecture</w:t>
+        <w:t>This visualisation gathers</w:t>
+      </w:r>
+      <w:r>
+        <w:rPr>
+          <w:rFonts w:ascii="TT Octosquares Trial" w:hAnsi="TT Octosquares Trial"/>
+        </w:rPr>
+        <w:t xml:space="preserve"> all relevant information about a single game. We have focused on data that helps bring together the identity of a game. </w:t>
+      </w:r>
+      <w:proofErr w:type="gramStart"/>
+      <w:r>
+        <w:rPr>
+          <w:rFonts w:ascii="TT Octosquares Trial" w:hAnsi="TT Octosquares Trial"/>
+        </w:rPr>
+        <w:t>In order to</w:t>
+      </w:r>
+      <w:proofErr w:type="gramEnd"/>
+      <w:r>
+        <w:rPr>
+          <w:rFonts w:ascii="TT Octosquares Trial" w:hAnsi="TT Octosquares Trial"/>
+        </w:rPr>
+        <w:t xml:space="preserve"> compare its popularity against similar games, the user can select as many filters as they want (including developers, publishers, genres and tags). A dropdown ranks by </w:t>
+      </w:r>
+      <w:r>
+        <w:rPr>
+          <w:rFonts w:ascii="TT Octosquares Trial" w:hAnsi="TT Octosquares Trial"/>
+        </w:rPr>
+        <w:t>peak CCU the first 50 games that have the same subset of filters.</w:t>
       </w:r>
     </w:p>
     <w:p>
       <w:pPr>
-        <w:pStyle w:val="Title2"/>
+        <w:spacing w:after="80"/>
+        <w:ind w:left="360"/>
+        <w:rPr>
+          <w:rFonts w:ascii="TT Octosquares Trial" w:hAnsi="TT Octosquares Trial"/>
+        </w:rPr>
       </w:pPr>
       <w:r>
-        <w:t>01 / PROJECT OVERVIEW</w:t>
+        <w:rPr>
+          <w:rFonts w:ascii="Times New Roman" w:hAnsi="Times New Roman" w:cs="Times New Roman"/>
+          <w:b/>
+          <w:color w:val="A855F7"/>
+        </w:rPr>
+        <w:t>▪</w:t>
+      </w:r>
+      <w:r>
+        <w:rPr>
+          <w:rFonts w:ascii="TT Octosquares Trial" w:hAnsi="TT Octosquares Trial"/>
+          <w:b/>
+          <w:color w:val="A855F7"/>
+        </w:rPr>
+        <w:t xml:space="preserve"> </w:t>
+      </w:r>
+      <w:r>
+        <w:rPr>
+          <w:rFonts w:ascii="TT Octosquares Trial" w:hAnsi="TT Octosquares Trial"/>
+          <w:b/>
+          <w:color w:val="A855F7"/>
+        </w:rPr>
+        <w:t>Top Ranking</w:t>
+      </w:r>
+      <w:r>
+        <w:rPr>
+          <w:rFonts w:ascii="TT Octosquares Trial" w:hAnsi="TT Octosquares Trial"/>
+          <w:b/>
+          <w:color w:val="A855F7"/>
+        </w:rPr>
+        <w:t>:</w:t>
       </w:r>
     </w:p>
     <w:p>
       <w:pPr>
+        <w:spacing w:after="80"/>
+        <w:ind w:left="360"/>
+        <w:rPr>
+          <w:rFonts w:ascii="TT Octosquares Trial" w:hAnsi="TT Octosquares Trial"/>
+          <w:b/>
+          <w:color w:val="A855F7"/>
+        </w:rPr>
+      </w:pPr>
+      <w:r>
+        <w:rPr>
+          <w:rFonts w:ascii="Times New Roman" w:hAnsi="Times New Roman" w:cs="Times New Roman"/>
+          <w:b/>
+          <w:color w:val="A855F7"/>
+        </w:rPr>
+        <w:t>▪</w:t>
+      </w:r>
+      <w:r>
+        <w:rPr>
+          <w:rFonts w:ascii="TT Octosquares Trial" w:hAnsi="TT Octosquares Trial"/>
+          <w:b/>
+          <w:color w:val="A855F7"/>
+        </w:rPr>
+        <w:t xml:space="preserve"> Game</w:t>
+      </w:r>
+      <w:r>
+        <w:rPr>
+          <w:rFonts w:ascii="TT Octosquares Trial" w:hAnsi="TT Octosquares Trial"/>
+          <w:b/>
+          <w:color w:val="A855F7"/>
+        </w:rPr>
+        <w:t>s Overview/</w:t>
+      </w:r>
+      <w:r>
+        <w:rPr>
+          <w:rFonts w:ascii="TT Octosquares Trial" w:hAnsi="TT Octosquares Trial"/>
+          <w:b/>
+          <w:color w:val="A855F7"/>
+        </w:rPr>
+        <w:t>Comparisons:</w:t>
+      </w:r>
+    </w:p>
+    <w:p>
+      <w:pPr>
+        <w:spacing w:after="80"/>
+        <w:ind w:left="360"/>
+        <w:rPr>
+          <w:rFonts w:ascii="TT Octosquares Trial" w:hAnsi="TT Octosquares Trial"/>
+        </w:rPr>
+      </w:pPr>
+      <w:r>
+        <w:rPr>
+          <w:rFonts w:ascii="TT Octosquares Trial" w:hAnsi="TT Octosquares Trial"/>
+        </w:rPr>
+        <w:t>We have used here a parallel-coordinates plot to represent different dimensions over the entire dataset of games. Various interactive features allow the user to narrow down the games visible on the graph by using a brush selection on the dimension axes and/or selecting a game tag to filter out different games. A hover functionality also shows the name of any specific game on the graph.</w:t>
+      </w:r>
+    </w:p>
+    <w:p>
+      <w:pPr>
+        <w:spacing w:after="80"/>
+        <w:ind w:left="360"/>
+        <w:rPr>
+          <w:rFonts w:ascii="TT Octosquares Trial" w:hAnsi="TT Octosquares Trial"/>
+        </w:rPr>
+      </w:pPr>
+      <w:r>
+        <w:rPr>
+          <w:rFonts w:ascii="Times New Roman" w:hAnsi="Times New Roman" w:cs="Times New Roman"/>
+          <w:b/>
+          <w:color w:val="A855F7"/>
+        </w:rPr>
+        <w:t>▪</w:t>
+      </w:r>
+      <w:r>
+        <w:rPr>
+          <w:rFonts w:ascii="TT Octosquares Trial" w:hAnsi="TT Octosquares Trial"/>
+          <w:b/>
+          <w:color w:val="A855F7"/>
+        </w:rPr>
+        <w:t xml:space="preserve"> </w:t>
+      </w:r>
+      <w:r>
+        <w:rPr>
+          <w:rFonts w:ascii="TT Octosquares Trial" w:hAnsi="TT Octosquares Trial"/>
+          <w:b/>
+          <w:color w:val="A855F7"/>
+        </w:rPr>
+        <w:t>Genre Release History:</w:t>
+      </w:r>
+    </w:p>
+    <w:p>
+      <w:pPr>
+        <w:pStyle w:val="Title2"/>
+      </w:pPr>
+      <w:r>
+        <w:lastRenderedPageBreak/>
+        <w:t xml:space="preserve">Challenges </w:t>
+      </w:r>
+    </w:p>
+    <w:p>
+      <w:pPr>
+        <w:pStyle w:val="Title2"/>
+      </w:pPr>
+      <w:r>
+        <w:t xml:space="preserve">Peer Assessment </w:t>
+      </w:r>
+    </w:p>
+    <w:p>
+      <w:pPr>
+        <w:pStyle w:val="Title2"/>
+      </w:pPr>
+      <w:r>
+        <w:t>Final Reflections</w:t>
+      </w:r>
+    </w:p>
+    <w:p>
+      <w:pPr>
+        <w:pStyle w:val="Title2"/>
+      </w:pPr>
+      <w:proofErr w:type="spellStart"/>
+      <w:r>
+        <w:t>Ressources</w:t>
+      </w:r>
+      <w:proofErr w:type="spellEnd"/>
+    </w:p>
+    <w:p>
+      <w:pPr>
         <w:pStyle w:val="Body"/>
+        <w:numPr>
+          <w:ilvl w:val="0"/>
+          <w:numId w:val="11"/>
+        </w:numPr>
       </w:pPr>
       <w:r>
-        <w:t>This design process book documents the creation, UI/UX philosophy, and core development lifecycle of the 'STEAMing DEV GOSSIP' platform. Inspired by tactical modern gaming interfaces and data-heavy analytics dashboards, this layout leverages high contrast neon accents over rich dark surfaces to draw focus to critical performance metrics.</w:t>
+        <w:t>Repo</w:t>
       </w:r>
+    </w:p>
+    <w:p>
+      <w:pPr>
+        <w:pStyle w:val="Body"/>
+        <w:numPr>
+          <w:ilvl w:val="0"/>
+          <w:numId w:val="11"/>
+        </w:numPr>
+      </w:pPr>
+      <w:r>
+        <w:t>Screencast</w:t>
+      </w:r>
+    </w:p>
+    <w:p>
+      <w:pPr>
+        <w:pStyle w:val="Body"/>
+        <w:numPr>
+          <w:ilvl w:val="0"/>
+          <w:numId w:val="11"/>
+        </w:numPr>
+      </w:pPr>
+      <w:r>
+        <w:t>Lien site pages</w:t>
+      </w:r>
+    </w:p>
+    <w:p>
+      <w:pPr>
+        <w:rPr>
+          <w:rFonts w:ascii="Calibri" w:hAnsi="Calibri" w:cs="Calibri"/>
+          <w:color w:val="A855F7"/>
+          <w:sz w:val="48"/>
+        </w:rPr>
+      </w:pPr>
     </w:p>
     <w:tbl>
       <w:tblPr>
+        <w:tblpPr w:leftFromText="141" w:rightFromText="141" w:vertAnchor="text" w:horzAnchor="margin" w:tblpY="427"/>
         <w:tblW w:w="0" w:type="auto"/>
-        <w:jc w:val="center"/>
         <w:tblBorders>
           <w:top w:val="single" w:sz="4" w:space="0" w:color="A855F7"/>
           <w:bottom w:val="single" w:sz="4" w:space="0" w:color="A855F7"/>
@@ -121,9 +894,6 @@
         <w:gridCol w:w="4680"/>
       </w:tblGrid>
       <w:tr>
-        <w:trPr>
-          <w:jc w:val="center"/>
-        </w:trPr>
         <w:tc>
           <w:tcPr>
             <w:tcW w:w="4680" w:type="dxa"/>
@@ -182,9 +952,6 @@
         </w:tc>
       </w:tr>
       <w:tr>
-        <w:trPr>
-          <w:jc w:val="center"/>
-        </w:trPr>
         <w:tc>
           <w:tcPr>
             <w:tcW w:w="4680" w:type="dxa"/>
@@ -230,21 +997,30 @@
                 <w:rFonts w:ascii="TT Octosquares Trial" w:hAnsi="TT Octosquares Trial"/>
               </w:rPr>
             </w:pPr>
+            <w:proofErr w:type="spellStart"/>
+            <w:proofErr w:type="gramStart"/>
             <w:r>
               <w:rPr>
                 <w:rFonts w:ascii="TT Octosquares Trial" w:hAnsi="TT Octosquares Trial"/>
                 <w:color w:val="3F3F46"/>
                 <w:sz w:val="20"/>
               </w:rPr>
-              <w:t>Colors ?</w:t>
+              <w:t>Colors</w:t>
             </w:r>
+            <w:proofErr w:type="spellEnd"/>
+            <w:r>
+              <w:rPr>
+                <w:rFonts w:ascii="TT Octosquares Trial" w:hAnsi="TT Octosquares Trial"/>
+                <w:color w:val="3F3F46"/>
+                <w:sz w:val="20"/>
+              </w:rPr>
+              <w:t xml:space="preserve"> ?</w:t>
+            </w:r>
+            <w:proofErr w:type="gramEnd"/>
           </w:p>
         </w:tc>
       </w:tr>
       <w:tr>
-        <w:trPr>
-          <w:jc w:val="center"/>
-        </w:trPr>
         <w:tc>
           <w:tcPr>
             <w:tcW w:w="4680" w:type="dxa"/>
@@ -300,9 +1076,6 @@
         </w:tc>
       </w:tr>
       <w:tr>
-        <w:trPr>
-          <w:jc w:val="center"/>
-        </w:trPr>
         <w:tc>
           <w:tcPr>
             <w:tcW w:w="4680" w:type="dxa"/>
@@ -348,6 +1121,7 @@
                 <w:rFonts w:ascii="TT Octosquares Trial" w:hAnsi="TT Octosquares Trial"/>
               </w:rPr>
             </w:pPr>
+            <w:proofErr w:type="spellStart"/>
             <w:r>
               <w:rPr>
                 <w:rFonts w:ascii="TT Octosquares Trial" w:hAnsi="TT Octosquares Trial"/>
@@ -356,13 +1130,11 @@
               </w:rPr>
               <w:t>Blabla</w:t>
             </w:r>
+            <w:proofErr w:type="spellEnd"/>
           </w:p>
         </w:tc>
       </w:tr>
       <w:tr>
-        <w:trPr>
-          <w:jc w:val="center"/>
-        </w:trPr>
         <w:tc>
           <w:tcPr>
             <w:tcW w:w="4680" w:type="dxa"/>
@@ -422,339 +1194,31 @@
     </w:tbl>
     <w:p>
       <w:pPr>
-        <w:spacing w:after="240"/>
-      </w:pPr>
-    </w:p>
-    <w:p>
-      <w:pPr>
-        <w:pStyle w:val="Title2"/>
-      </w:pPr>
-      <w:r>
-        <w:lastRenderedPageBreak/>
-        <w:t>02 / Key Questions</w:t>
-      </w:r>
-    </w:p>
-    <w:p>
-      <w:pPr>
-        <w:pStyle w:val="Title2"/>
-      </w:pPr>
-      <w:r>
-        <w:t>03 / Process</w:t>
-      </w:r>
-    </w:p>
-    <w:p>
-      <w:pPr>
-        <w:pStyle w:val="Title2"/>
-      </w:pPr>
-      <w:r>
-        <w:t>04 / Dataset Summary</w:t>
-      </w:r>
-    </w:p>
-    <w:p>
-      <w:pPr>
-        <w:pStyle w:val="Title2"/>
-      </w:pPr>
-      <w:r>
-        <w:t xml:space="preserve">05 / Preprocessing </w:t>
-      </w:r>
-    </w:p>
-    <w:p>
-      <w:pPr>
-        <w:pStyle w:val="Title2"/>
-      </w:pPr>
-      <w:r>
-        <w:t>06 / EDA and Insights</w:t>
-      </w:r>
-    </w:p>
-    <w:p>
-      <w:pPr>
-        <w:pStyle w:val="Title2"/>
-      </w:pPr>
-      <w:r>
-        <w:t>0</w:t>
-      </w:r>
-      <w:r>
-        <w:t>7</w:t>
-      </w:r>
-      <w:r>
-        <w:t xml:space="preserve"> / UI </w:t>
-      </w:r>
-      <w:r>
-        <w:t>Component</w:t>
-      </w:r>
-      <w:r>
-        <w:t xml:space="preserve"> </w:t>
-      </w:r>
-      <w:r>
-        <w:t>Mapping</w:t>
-      </w:r>
-    </w:p>
-    <w:p>
-      <w:pPr>
-        <w:spacing w:after="160" w:line="300" w:lineRule="auto"/>
+        <w:spacing w:after="400"/>
+        <w:jc w:val="center"/>
         <w:rPr>
           <w:rFonts w:ascii="TT Octosquares Trial" w:hAnsi="TT Octosquares Trial"/>
+          <w:lang w:val="fr-CH"/>
         </w:rPr>
       </w:pPr>
       <w:r>
         <w:rPr>
           <w:rFonts w:ascii="TT Octosquares Trial" w:hAnsi="TT Octosquares Trial"/>
+          <w:color w:val="A855F7"/>
+          <w:sz w:val="26"/>
+          <w:lang w:val="fr-CH"/>
         </w:rPr>
-        <w:t>Blablablabla:</w:t>
-      </w:r>
-    </w:p>
-    <w:p>
-      <w:pPr>
-        <w:spacing w:after="80"/>
-        <w:ind w:left="360"/>
-        <w:rPr>
-          <w:rFonts w:ascii="TT Octosquares Trial" w:hAnsi="TT Octosquares Trial"/>
-          <w:b/>
-          <w:color w:val="A855F7"/>
-        </w:rPr>
-      </w:pPr>
-      <w:r>
-        <w:rPr>
-          <w:rFonts w:ascii="Times New Roman" w:hAnsi="Times New Roman" w:cs="Times New Roman"/>
-          <w:b/>
-          <w:color w:val="A855F7"/>
-        </w:rPr>
-        <w:t>▪</w:t>
+        <w:t>Template tableau si bes</w:t>
       </w:r>
       <w:r>
         <w:rPr>
           <w:rFonts w:ascii="TT Octosquares Trial" w:hAnsi="TT Octosquares Trial"/>
-          <w:b/>
           <w:color w:val="A855F7"/>
+          <w:sz w:val="26"/>
+          <w:lang w:val="fr-CH"/>
         </w:rPr>
-        <w:t xml:space="preserve"> </w:t>
+        <w:t>oin</w:t>
       </w:r>
-      <w:r>
-        <w:rPr>
-          <w:rFonts w:ascii="TT Octosquares Trial" w:hAnsi="TT Octosquares Trial"/>
-          <w:b/>
-          <w:color w:val="A855F7"/>
-        </w:rPr>
-        <w:t>Game Data Card:</w:t>
-      </w:r>
-    </w:p>
-    <w:p>
-      <w:pPr>
-        <w:spacing w:after="80"/>
-        <w:ind w:left="360"/>
-        <w:rPr>
-          <w:rFonts w:ascii="TT Octosquares Trial" w:hAnsi="TT Octosquares Trial"/>
-        </w:rPr>
-      </w:pPr>
-      <w:r>
-        <w:rPr>
-          <w:rFonts w:ascii="TT Octosquares Trial" w:hAnsi="TT Octosquares Trial"/>
-        </w:rPr>
-        <w:t>This visualisation gathers</w:t>
-      </w:r>
-      <w:r>
-        <w:rPr>
-          <w:rFonts w:ascii="TT Octosquares Trial" w:hAnsi="TT Octosquares Trial"/>
-        </w:rPr>
-        <w:t xml:space="preserve"> all relevant information about a single game. We have focused on data that helps bring together the identity of a game. In order to compare its popularity against similar games, the user can select as many filters as they want (including developers, publishers, genres and tags). A dropdown ranks by </w:t>
-      </w:r>
-      <w:r>
-        <w:rPr>
-          <w:rFonts w:ascii="TT Octosquares Trial" w:hAnsi="TT Octosquares Trial"/>
-        </w:rPr>
-        <w:t>peak CCU the first 50 games that have the same subset of filters.</w:t>
-      </w:r>
-    </w:p>
-    <w:p>
-      <w:pPr>
-        <w:spacing w:after="80"/>
-        <w:ind w:left="360"/>
-        <w:rPr>
-          <w:rFonts w:ascii="TT Octosquares Trial" w:hAnsi="TT Octosquares Trial"/>
-        </w:rPr>
-      </w:pPr>
-      <w:r>
-        <w:rPr>
-          <w:rFonts w:ascii="Times New Roman" w:hAnsi="Times New Roman" w:cs="Times New Roman"/>
-          <w:b/>
-          <w:color w:val="A855F7"/>
-        </w:rPr>
-        <w:t>▪</w:t>
-      </w:r>
-      <w:r>
-        <w:rPr>
-          <w:rFonts w:ascii="TT Octosquares Trial" w:hAnsi="TT Octosquares Trial"/>
-          <w:b/>
-          <w:color w:val="A855F7"/>
-        </w:rPr>
-        <w:t xml:space="preserve"> </w:t>
-      </w:r>
-      <w:r>
-        <w:rPr>
-          <w:rFonts w:ascii="TT Octosquares Trial" w:hAnsi="TT Octosquares Trial"/>
-          <w:b/>
-          <w:color w:val="A855F7"/>
-        </w:rPr>
-        <w:t>Top Ranking</w:t>
-      </w:r>
-      <w:r>
-        <w:rPr>
-          <w:rFonts w:ascii="TT Octosquares Trial" w:hAnsi="TT Octosquares Trial"/>
-          <w:b/>
-          <w:color w:val="A855F7"/>
-        </w:rPr>
-        <w:t>:</w:t>
-      </w:r>
-    </w:p>
-    <w:p>
-      <w:pPr>
-        <w:spacing w:after="80"/>
-        <w:ind w:left="360"/>
-        <w:rPr>
-          <w:rFonts w:ascii="TT Octosquares Trial" w:hAnsi="TT Octosquares Trial"/>
-          <w:b/>
-          <w:color w:val="A855F7"/>
-        </w:rPr>
-      </w:pPr>
-      <w:r>
-        <w:rPr>
-          <w:rFonts w:ascii="Times New Roman" w:hAnsi="Times New Roman" w:cs="Times New Roman"/>
-          <w:b/>
-          <w:color w:val="A855F7"/>
-        </w:rPr>
-        <w:t>▪</w:t>
-      </w:r>
-      <w:r>
-        <w:rPr>
-          <w:rFonts w:ascii="TT Octosquares Trial" w:hAnsi="TT Octosquares Trial"/>
-          <w:b/>
-          <w:color w:val="A855F7"/>
-        </w:rPr>
-        <w:t xml:space="preserve"> Game</w:t>
-      </w:r>
-      <w:r>
-        <w:rPr>
-          <w:rFonts w:ascii="TT Octosquares Trial" w:hAnsi="TT Octosquares Trial"/>
-          <w:b/>
-          <w:color w:val="A855F7"/>
-        </w:rPr>
-        <w:t>s Overview/</w:t>
-      </w:r>
-      <w:r>
-        <w:rPr>
-          <w:rFonts w:ascii="TT Octosquares Trial" w:hAnsi="TT Octosquares Trial"/>
-          <w:b/>
-          <w:color w:val="A855F7"/>
-        </w:rPr>
-        <w:t>Comparisons:</w:t>
-      </w:r>
-    </w:p>
-    <w:p>
-      <w:pPr>
-        <w:spacing w:after="80"/>
-        <w:ind w:left="360"/>
-        <w:rPr>
-          <w:rFonts w:ascii="TT Octosquares Trial" w:hAnsi="TT Octosquares Trial"/>
-        </w:rPr>
-      </w:pPr>
-      <w:r>
-        <w:rPr>
-          <w:rFonts w:ascii="TT Octosquares Trial" w:hAnsi="TT Octosquares Trial"/>
-        </w:rPr>
-        <w:t>We have used here a parallel-coordinates plot to represent different dimensions over the entire dataset of games. Various interactive features allow the user to narrow down the games visible on the graph by using a brush selection on the dimension axes and/or selecting a game tag to filter out different games. A hover functionality also shows the name of any specific game on the graph.</w:t>
-      </w:r>
-    </w:p>
-    <w:p>
-      <w:pPr>
-        <w:spacing w:after="80"/>
-        <w:ind w:left="360"/>
-        <w:rPr>
-          <w:rFonts w:ascii="TT Octosquares Trial" w:hAnsi="TT Octosquares Trial"/>
-        </w:rPr>
-      </w:pPr>
-      <w:r>
-        <w:rPr>
-          <w:rFonts w:ascii="Times New Roman" w:hAnsi="Times New Roman" w:cs="Times New Roman"/>
-          <w:b/>
-          <w:color w:val="A855F7"/>
-        </w:rPr>
-        <w:t>▪</w:t>
-      </w:r>
-      <w:r>
-        <w:rPr>
-          <w:rFonts w:ascii="TT Octosquares Trial" w:hAnsi="TT Octosquares Trial"/>
-          <w:b/>
-          <w:color w:val="A855F7"/>
-        </w:rPr>
-        <w:t xml:space="preserve"> </w:t>
-      </w:r>
-      <w:r>
-        <w:rPr>
-          <w:rFonts w:ascii="TT Octosquares Trial" w:hAnsi="TT Octosquares Trial"/>
-          <w:b/>
-          <w:color w:val="A855F7"/>
-        </w:rPr>
-        <w:t>Genre Release History:</w:t>
-      </w:r>
-    </w:p>
-    <w:p>
-      <w:pPr>
-        <w:pStyle w:val="Title2"/>
-      </w:pPr>
-      <w:r>
-        <w:lastRenderedPageBreak/>
-        <w:t>0</w:t>
-      </w:r>
-      <w:r>
-        <w:t xml:space="preserve">8 </w:t>
-      </w:r>
-      <w:r>
-        <w:t xml:space="preserve">/ </w:t>
-      </w:r>
-      <w:r>
-        <w:t>Interface Wireframes</w:t>
-      </w:r>
-    </w:p>
-    <w:p>
-      <w:pPr>
-        <w:pStyle w:val="Title2"/>
-      </w:pPr>
-      <w:r>
-        <w:t xml:space="preserve">09 / Final Visualizations </w:t>
-      </w:r>
-    </w:p>
-    <w:p>
-      <w:pPr>
-        <w:pStyle w:val="Title2"/>
-      </w:pPr>
-      <w:r>
-        <w:t xml:space="preserve">10 / Challenges </w:t>
-      </w:r>
-    </w:p>
-    <w:p>
-      <w:pPr>
-        <w:pStyle w:val="Title2"/>
-      </w:pPr>
-      <w:r>
-        <w:t xml:space="preserve">11 / Peer Assessment </w:t>
-      </w:r>
-    </w:p>
-    <w:p>
-      <w:pPr>
-        <w:pStyle w:val="Title2"/>
-      </w:pPr>
-      <w:r>
-        <w:t>12 / Final Reflections</w:t>
-      </w:r>
-    </w:p>
-    <w:p>
-      <w:pPr>
-        <w:rPr>
-          <w:rFonts w:ascii="Calibri" w:hAnsi="Calibri" w:cs="Calibri"/>
-          <w:color w:val="A855F7"/>
-          <w:sz w:val="48"/>
-        </w:rPr>
-      </w:pPr>
     </w:p>
     <w:p/>
     <w:sectPr>
@@ -797,7 +1261,7 @@
 <w:ftr xmlns:wpc="http://schemas.microsoft.com/office/word/2010/wordprocessingCanvas" xmlns:cx="http://schemas.microsoft.com/office/drawing/2014/chartex" xmlns:cx1="http://schemas.microsoft.com/office/drawing/2015/9/8/chartex" xmlns:cx2="http://schemas.microsoft.com/office/drawing/2015/10/21/chartex" xmlns:cx3="http://schemas.microsoft.com/office/drawing/2016/5/9/chartex" xmlns:cx4="http://schemas.microsoft.com/office/drawing/2016/5/10/chartex" xmlns:cx5="http://schemas.microsoft.com/office/drawing/2016/5/11/chartex" xmlns:cx6="http://schemas.microsoft.com/office/drawing/2016/5/12/chartex" xmlns:cx7="http://schemas.microsoft.com/office/drawing/2016/5/13/chartex" xmlns:cx8="http://schemas.microsoft.com/office/drawing/2016/5/14/chartex" xmlns:mc="http://schemas.openxmlformats.org/markup-compatibility/2006" xmlns:aink="http://schemas.microsoft.com/office/drawing/2016/ink" xmlns:am3d="http://schemas.microsoft.com/office/drawing/2017/model3d" xmlns:o="urn:schemas-microsoft-com:office:office" xmlns:oel="http://schemas.microsoft.com/office/2019/extlst" xmlns:r="http://schemas.openxmlformats.org/officeDocument/2006/relationships" xmlns:m="http://schemas.openxmlformats.org/officeDocument/2006/math" xmlns:v="urn:schemas-microsoft-com:vml" xmlns:wp14="http://schemas.microsoft.com/office/word/2010/wordprocessingDrawing" xmlns:wp="http://schemas.openxmlformats.org/drawingml/2006/wordprocessingDrawing" xmlns:w10="urn:schemas-microsoft-com:office:word" xmlns:w="http://schemas.openxmlformats.org/wordprocessingml/2006/main" xmlns:w14="http://schemas.microsoft.com/office/word/2010/wordml" xmlns:w15="http://schemas.microsoft.com/office/word/2012/wordml" xmlns:w16cex="http://schemas.microsoft.com/office/word/2018/wordml/cex" xmlns:w16cid="http://schemas.microsoft.com/office/word/2016/wordml/cid" xmlns:w16="http://schemas.microsoft.com/office/word/2018/wordml" xmlns:w16du="http://schemas.microsoft.com/office/word/2023/wordml/word16du" xmlns:w16sdtdh="http://schemas.microsoft.com/office/word/2020/wordml/sdtdatahash" xmlns:w16sdtfl="http://schemas.microsoft.com/office/word/2024/wordml/sdtformatlock" xmlns:w16se="http://schemas.microsoft.com/office/word/2015/wordml/symex" xmlns:wpg="http://schemas.microsoft.com/office/word/2010/wordprocessingGroup" xmlns:wpi="http://schemas.microsoft.com/office/word/2010/wordprocessingInk" xmlns:wne="http://schemas.microsoft.com/office/word/2006/wordml" xmlns:wps="http://schemas.microsoft.com/office/word/2010/wordprocessingShape" mc:Ignorable="w14 w15 w16se w16cid w16 w16cex w16sdtdh w16sdtfl w16du wp14">
   <w:p>
     <w:pPr>
-      <w:pStyle w:val="Footer"/>
+      <w:pStyle w:val="Pieddepage"/>
       <w:jc w:val="right"/>
       <w:rPr>
         <w:rFonts w:ascii="TT Octosquares Trial" w:hAnsi="TT Octosquares Trial"/>
@@ -913,7 +1377,7 @@
     <w:lvl w:ilvl="0">
       <w:start w:val="1"/>
       <w:numFmt w:val="decimal"/>
-      <w:pStyle w:val="ListNumber3"/>
+      <w:pStyle w:val="Listenumros3"/>
       <w:lvlText w:val="%1."/>
       <w:lvlJc w:val="left"/>
       <w:pPr>
@@ -931,7 +1395,7 @@
     <w:lvl w:ilvl="0">
       <w:start w:val="1"/>
       <w:numFmt w:val="decimal"/>
-      <w:pStyle w:val="ListNumber2"/>
+      <w:pStyle w:val="Listenumros2"/>
       <w:lvlText w:val="%1."/>
       <w:lvlJc w:val="left"/>
       <w:pPr>
@@ -969,7 +1433,7 @@
     <w:lvl w:ilvl="0">
       <w:start w:val="1"/>
       <w:numFmt w:val="bullet"/>
-      <w:pStyle w:val="ListBullet3"/>
+      <w:pStyle w:val="Listepuces3"/>
       <w:lvlText w:val=""/>
       <w:lvlJc w:val="left"/>
       <w:pPr>
@@ -990,7 +1454,7 @@
     <w:lvl w:ilvl="0">
       <w:start w:val="1"/>
       <w:numFmt w:val="bullet"/>
-      <w:pStyle w:val="ListBullet2"/>
+      <w:pStyle w:val="Listepuces2"/>
       <w:lvlText w:val=""/>
       <w:lvlJc w:val="left"/>
       <w:pPr>
@@ -1011,7 +1475,7 @@
     <w:lvl w:ilvl="0">
       <w:start w:val="1"/>
       <w:numFmt w:val="decimal"/>
-      <w:pStyle w:val="ListNumber"/>
+      <w:pStyle w:val="Listenumros"/>
       <w:lvlText w:val="%1."/>
       <w:lvlJc w:val="left"/>
       <w:pPr>
@@ -1029,7 +1493,7 @@
     <w:lvl w:ilvl="0">
       <w:start w:val="1"/>
       <w:numFmt w:val="bullet"/>
-      <w:pStyle w:val="ListBullet"/>
+      <w:pStyle w:val="Listepuces"/>
       <w:lvlText w:val=""/>
       <w:lvlJc w:val="left"/>
       <w:pPr>
@@ -1040,6 +1504,232 @@
       </w:pPr>
       <w:rPr>
         <w:rFonts w:ascii="Symbol" w:hAnsi="Symbol" w:hint="default"/>
+      </w:rPr>
+    </w:lvl>
+  </w:abstractNum>
+  <w:abstractNum w:abstractNumId="9" w15:restartNumberingAfterBreak="0">
+    <w:nsid w:val="256E1ADE"/>
+    <w:multiLevelType w:val="hybridMultilevel"/>
+    <w:tmpl w:val="690A34E2"/>
+    <w:lvl w:ilvl="0" w:tplc="2BE2E338">
+      <w:start w:val="1"/>
+      <w:numFmt w:val="bullet"/>
+      <w:lvlText w:val="-"/>
+      <w:lvlJc w:val="left"/>
+      <w:pPr>
+        <w:ind w:left="720" w:hanging="360"/>
+      </w:pPr>
+      <w:rPr>
+        <w:rFonts w:ascii="TT Octosquares Trial" w:eastAsiaTheme="minorEastAsia" w:hAnsi="TT Octosquares Trial" w:cstheme="minorBidi" w:hint="default"/>
+      </w:rPr>
+    </w:lvl>
+    <w:lvl w:ilvl="1" w:tplc="100C0003" w:tentative="1">
+      <w:start w:val="1"/>
+      <w:numFmt w:val="bullet"/>
+      <w:lvlText w:val="o"/>
+      <w:lvlJc w:val="left"/>
+      <w:pPr>
+        <w:ind w:left="1440" w:hanging="360"/>
+      </w:pPr>
+      <w:rPr>
+        <w:rFonts w:ascii="Courier New" w:hAnsi="Courier New" w:cs="Courier New" w:hint="default"/>
+      </w:rPr>
+    </w:lvl>
+    <w:lvl w:ilvl="2" w:tplc="100C0005" w:tentative="1">
+      <w:start w:val="1"/>
+      <w:numFmt w:val="bullet"/>
+      <w:lvlText w:val=""/>
+      <w:lvlJc w:val="left"/>
+      <w:pPr>
+        <w:ind w:left="2160" w:hanging="360"/>
+      </w:pPr>
+      <w:rPr>
+        <w:rFonts w:ascii="Wingdings" w:hAnsi="Wingdings" w:hint="default"/>
+      </w:rPr>
+    </w:lvl>
+    <w:lvl w:ilvl="3" w:tplc="100C0001" w:tentative="1">
+      <w:start w:val="1"/>
+      <w:numFmt w:val="bullet"/>
+      <w:lvlText w:val=""/>
+      <w:lvlJc w:val="left"/>
+      <w:pPr>
+        <w:ind w:left="2880" w:hanging="360"/>
+      </w:pPr>
+      <w:rPr>
+        <w:rFonts w:ascii="Symbol" w:hAnsi="Symbol" w:hint="default"/>
+      </w:rPr>
+    </w:lvl>
+    <w:lvl w:ilvl="4" w:tplc="100C0003" w:tentative="1">
+      <w:start w:val="1"/>
+      <w:numFmt w:val="bullet"/>
+      <w:lvlText w:val="o"/>
+      <w:lvlJc w:val="left"/>
+      <w:pPr>
+        <w:ind w:left="3600" w:hanging="360"/>
+      </w:pPr>
+      <w:rPr>
+        <w:rFonts w:ascii="Courier New" w:hAnsi="Courier New" w:cs="Courier New" w:hint="default"/>
+      </w:rPr>
+    </w:lvl>
+    <w:lvl w:ilvl="5" w:tplc="100C0005" w:tentative="1">
+      <w:start w:val="1"/>
+      <w:numFmt w:val="bullet"/>
+      <w:lvlText w:val=""/>
+      <w:lvlJc w:val="left"/>
+      <w:pPr>
+        <w:ind w:left="4320" w:hanging="360"/>
+      </w:pPr>
+      <w:rPr>
+        <w:rFonts w:ascii="Wingdings" w:hAnsi="Wingdings" w:hint="default"/>
+      </w:rPr>
+    </w:lvl>
+    <w:lvl w:ilvl="6" w:tplc="100C0001" w:tentative="1">
+      <w:start w:val="1"/>
+      <w:numFmt w:val="bullet"/>
+      <w:lvlText w:val=""/>
+      <w:lvlJc w:val="left"/>
+      <w:pPr>
+        <w:ind w:left="5040" w:hanging="360"/>
+      </w:pPr>
+      <w:rPr>
+        <w:rFonts w:ascii="Symbol" w:hAnsi="Symbol" w:hint="default"/>
+      </w:rPr>
+    </w:lvl>
+    <w:lvl w:ilvl="7" w:tplc="100C0003" w:tentative="1">
+      <w:start w:val="1"/>
+      <w:numFmt w:val="bullet"/>
+      <w:lvlText w:val="o"/>
+      <w:lvlJc w:val="left"/>
+      <w:pPr>
+        <w:ind w:left="5760" w:hanging="360"/>
+      </w:pPr>
+      <w:rPr>
+        <w:rFonts w:ascii="Courier New" w:hAnsi="Courier New" w:cs="Courier New" w:hint="default"/>
+      </w:rPr>
+    </w:lvl>
+    <w:lvl w:ilvl="8" w:tplc="100C0005" w:tentative="1">
+      <w:start w:val="1"/>
+      <w:numFmt w:val="bullet"/>
+      <w:lvlText w:val=""/>
+      <w:lvlJc w:val="left"/>
+      <w:pPr>
+        <w:ind w:left="6480" w:hanging="360"/>
+      </w:pPr>
+      <w:rPr>
+        <w:rFonts w:ascii="Wingdings" w:hAnsi="Wingdings" w:hint="default"/>
+      </w:rPr>
+    </w:lvl>
+  </w:abstractNum>
+  <w:abstractNum w:abstractNumId="10" w15:restartNumberingAfterBreak="0">
+    <w:nsid w:val="44820408"/>
+    <w:multiLevelType w:val="hybridMultilevel"/>
+    <w:tmpl w:val="EF40E9C6"/>
+    <w:lvl w:ilvl="0" w:tplc="82E07020">
+      <w:start w:val="1"/>
+      <w:numFmt w:val="bullet"/>
+      <w:lvlText w:val="-"/>
+      <w:lvlJc w:val="left"/>
+      <w:pPr>
+        <w:ind w:left="720" w:hanging="360"/>
+      </w:pPr>
+      <w:rPr>
+        <w:rFonts w:ascii="TT Octosquares Trial" w:eastAsiaTheme="minorEastAsia" w:hAnsi="TT Octosquares Trial" w:cstheme="minorBidi" w:hint="default"/>
+      </w:rPr>
+    </w:lvl>
+    <w:lvl w:ilvl="1" w:tplc="100C0003">
+      <w:start w:val="1"/>
+      <w:numFmt w:val="bullet"/>
+      <w:lvlText w:val="o"/>
+      <w:lvlJc w:val="left"/>
+      <w:pPr>
+        <w:ind w:left="1440" w:hanging="360"/>
+      </w:pPr>
+      <w:rPr>
+        <w:rFonts w:ascii="Courier New" w:hAnsi="Courier New" w:cs="Courier New" w:hint="default"/>
+      </w:rPr>
+    </w:lvl>
+    <w:lvl w:ilvl="2" w:tplc="100C0005" w:tentative="1">
+      <w:start w:val="1"/>
+      <w:numFmt w:val="bullet"/>
+      <w:lvlText w:val=""/>
+      <w:lvlJc w:val="left"/>
+      <w:pPr>
+        <w:ind w:left="2160" w:hanging="360"/>
+      </w:pPr>
+      <w:rPr>
+        <w:rFonts w:ascii="Wingdings" w:hAnsi="Wingdings" w:hint="default"/>
+      </w:rPr>
+    </w:lvl>
+    <w:lvl w:ilvl="3" w:tplc="100C0001" w:tentative="1">
+      <w:start w:val="1"/>
+      <w:numFmt w:val="bullet"/>
+      <w:lvlText w:val=""/>
+      <w:lvlJc w:val="left"/>
+      <w:pPr>
+        <w:ind w:left="2880" w:hanging="360"/>
+      </w:pPr>
+      <w:rPr>
+        <w:rFonts w:ascii="Symbol" w:hAnsi="Symbol" w:hint="default"/>
+      </w:rPr>
+    </w:lvl>
+    <w:lvl w:ilvl="4" w:tplc="100C0003" w:tentative="1">
+      <w:start w:val="1"/>
+      <w:numFmt w:val="bullet"/>
+      <w:lvlText w:val="o"/>
+      <w:lvlJc w:val="left"/>
+      <w:pPr>
+        <w:ind w:left="3600" w:hanging="360"/>
+      </w:pPr>
+      <w:rPr>
+        <w:rFonts w:ascii="Courier New" w:hAnsi="Courier New" w:cs="Courier New" w:hint="default"/>
+      </w:rPr>
+    </w:lvl>
+    <w:lvl w:ilvl="5" w:tplc="100C0005" w:tentative="1">
+      <w:start w:val="1"/>
+      <w:numFmt w:val="bullet"/>
+      <w:lvlText w:val=""/>
+      <w:lvlJc w:val="left"/>
+      <w:pPr>
+        <w:ind w:left="4320" w:hanging="360"/>
+      </w:pPr>
+      <w:rPr>
+        <w:rFonts w:ascii="Wingdings" w:hAnsi="Wingdings" w:hint="default"/>
+      </w:rPr>
+    </w:lvl>
+    <w:lvl w:ilvl="6" w:tplc="100C0001" w:tentative="1">
+      <w:start w:val="1"/>
+      <w:numFmt w:val="bullet"/>
+      <w:lvlText w:val=""/>
+      <w:lvlJc w:val="left"/>
+      <w:pPr>
+        <w:ind w:left="5040" w:hanging="360"/>
+      </w:pPr>
+      <w:rPr>
+        <w:rFonts w:ascii="Symbol" w:hAnsi="Symbol" w:hint="default"/>
+      </w:rPr>
+    </w:lvl>
+    <w:lvl w:ilvl="7" w:tplc="100C0003" w:tentative="1">
+      <w:start w:val="1"/>
+      <w:numFmt w:val="bullet"/>
+      <w:lvlText w:val="o"/>
+      <w:lvlJc w:val="left"/>
+      <w:pPr>
+        <w:ind w:left="5760" w:hanging="360"/>
+      </w:pPr>
+      <w:rPr>
+        <w:rFonts w:ascii="Courier New" w:hAnsi="Courier New" w:cs="Courier New" w:hint="default"/>
+      </w:rPr>
+    </w:lvl>
+    <w:lvl w:ilvl="8" w:tplc="100C0005" w:tentative="1">
+      <w:start w:val="1"/>
+      <w:numFmt w:val="bullet"/>
+      <w:lvlText w:val=""/>
+      <w:lvlJc w:val="left"/>
+      <w:pPr>
+        <w:ind w:left="6480" w:hanging="360"/>
+      </w:pPr>
+      <w:rPr>
+        <w:rFonts w:ascii="Wingdings" w:hAnsi="Wingdings" w:hint="default"/>
       </w:rPr>
     </w:lvl>
   </w:abstractNum>
@@ -1069,6 +1759,12 @@
   </w:num>
   <w:num w:numId="9" w16cid:durableId="1919822917">
     <w:abstractNumId w:val="0"/>
+  </w:num>
+  <w:num w:numId="10" w16cid:durableId="177696081">
+    <w:abstractNumId w:val="9"/>
+  </w:num>
+  <w:num w:numId="11" w16cid:durableId="1334725074">
+    <w:abstractNumId w:val="10"/>
   </w:num>
 </w:numbering>
 </file>
@@ -1467,11 +2163,11 @@
       <w:lang w:val="en-GB"/>
     </w:rPr>
   </w:style>
-  <w:style w:type="paragraph" w:styleId="Heading1">
+  <w:style w:type="paragraph" w:styleId="Titre1">
     <w:name w:val="heading 1"/>
     <w:basedOn w:val="Normal"/>
     <w:next w:val="Normal"/>
-    <w:link w:val="Heading1Char"/>
+    <w:link w:val="Titre1Car"/>
     <w:uiPriority w:val="9"/>
     <w:qFormat/>
     <w:rsid w:val="00FC693F"/>
@@ -1490,11 +2186,11 @@
       <w:szCs w:val="28"/>
     </w:rPr>
   </w:style>
-  <w:style w:type="paragraph" w:styleId="Heading2">
+  <w:style w:type="paragraph" w:styleId="Titre2">
     <w:name w:val="heading 2"/>
     <w:basedOn w:val="Normal"/>
     <w:next w:val="Normal"/>
-    <w:link w:val="Heading2Char"/>
+    <w:link w:val="Titre2Car"/>
     <w:uiPriority w:val="9"/>
     <w:unhideWhenUsed/>
     <w:qFormat/>
@@ -1514,11 +2210,11 @@
       <w:szCs w:val="26"/>
     </w:rPr>
   </w:style>
-  <w:style w:type="paragraph" w:styleId="Heading3">
+  <w:style w:type="paragraph" w:styleId="Titre3">
     <w:name w:val="heading 3"/>
     <w:basedOn w:val="Normal"/>
     <w:next w:val="Normal"/>
-    <w:link w:val="Heading3Char"/>
+    <w:link w:val="Titre3Car"/>
     <w:uiPriority w:val="9"/>
     <w:unhideWhenUsed/>
     <w:qFormat/>
@@ -1536,11 +2232,11 @@
       <w:color w:val="4F81BD" w:themeColor="accent1"/>
     </w:rPr>
   </w:style>
-  <w:style w:type="paragraph" w:styleId="Heading4">
+  <w:style w:type="paragraph" w:styleId="Titre4">
     <w:name w:val="heading 4"/>
     <w:basedOn w:val="Normal"/>
     <w:next w:val="Normal"/>
-    <w:link w:val="Heading4Char"/>
+    <w:link w:val="Titre4Car"/>
     <w:uiPriority w:val="9"/>
     <w:semiHidden/>
     <w:unhideWhenUsed/>
@@ -1561,11 +2257,11 @@
       <w:color w:val="4F81BD" w:themeColor="accent1"/>
     </w:rPr>
   </w:style>
-  <w:style w:type="paragraph" w:styleId="Heading5">
+  <w:style w:type="paragraph" w:styleId="Titre5">
     <w:name w:val="heading 5"/>
     <w:basedOn w:val="Normal"/>
     <w:next w:val="Normal"/>
-    <w:link w:val="Heading5Char"/>
+    <w:link w:val="Titre5Car"/>
     <w:uiPriority w:val="9"/>
     <w:semiHidden/>
     <w:unhideWhenUsed/>
@@ -1582,11 +2278,11 @@
       <w:color w:val="243F60" w:themeColor="accent1" w:themeShade="7F"/>
     </w:rPr>
   </w:style>
-  <w:style w:type="paragraph" w:styleId="Heading6">
+  <w:style w:type="paragraph" w:styleId="Titre6">
     <w:name w:val="heading 6"/>
     <w:basedOn w:val="Normal"/>
     <w:next w:val="Normal"/>
-    <w:link w:val="Heading6Char"/>
+    <w:link w:val="Titre6Car"/>
     <w:uiPriority w:val="9"/>
     <w:semiHidden/>
     <w:unhideWhenUsed/>
@@ -1605,11 +2301,11 @@
       <w:color w:val="243F60" w:themeColor="accent1" w:themeShade="7F"/>
     </w:rPr>
   </w:style>
-  <w:style w:type="paragraph" w:styleId="Heading7">
+  <w:style w:type="paragraph" w:styleId="Titre7">
     <w:name w:val="heading 7"/>
     <w:basedOn w:val="Normal"/>
     <w:next w:val="Normal"/>
-    <w:link w:val="Heading7Char"/>
+    <w:link w:val="Titre7Car"/>
     <w:uiPriority w:val="9"/>
     <w:semiHidden/>
     <w:unhideWhenUsed/>
@@ -1628,11 +2324,11 @@
       <w:color w:val="404040" w:themeColor="text1" w:themeTint="BF"/>
     </w:rPr>
   </w:style>
-  <w:style w:type="paragraph" w:styleId="Heading8">
+  <w:style w:type="paragraph" w:styleId="Titre8">
     <w:name w:val="heading 8"/>
     <w:basedOn w:val="Normal"/>
     <w:next w:val="Normal"/>
-    <w:link w:val="Heading8Char"/>
+    <w:link w:val="Titre8Car"/>
     <w:uiPriority w:val="9"/>
     <w:semiHidden/>
     <w:unhideWhenUsed/>
@@ -1651,11 +2347,11 @@
       <w:szCs w:val="20"/>
     </w:rPr>
   </w:style>
-  <w:style w:type="paragraph" w:styleId="Heading9">
+  <w:style w:type="paragraph" w:styleId="Titre9">
     <w:name w:val="heading 9"/>
     <w:basedOn w:val="Normal"/>
     <w:next w:val="Normal"/>
-    <w:link w:val="Heading9Char"/>
+    <w:link w:val="Titre9Car"/>
     <w:uiPriority w:val="9"/>
     <w:semiHidden/>
     <w:unhideWhenUsed/>
@@ -1676,13 +2372,12 @@
       <w:szCs w:val="20"/>
     </w:rPr>
   </w:style>
-  <w:style w:type="character" w:default="1" w:styleId="DefaultParagraphFont">
+  <w:style w:type="character" w:default="1" w:styleId="Policepardfaut">
     <w:name w:val="Default Paragraph Font"/>
     <w:uiPriority w:val="1"/>
-    <w:semiHidden/>
     <w:unhideWhenUsed/>
   </w:style>
-  <w:style w:type="table" w:default="1" w:styleId="TableNormal">
+  <w:style w:type="table" w:default="1" w:styleId="TableauNormal">
     <w:name w:val="Normal Table"/>
     <w:uiPriority w:val="99"/>
     <w:semiHidden/>
@@ -1697,16 +2392,16 @@
       </w:tblCellMar>
     </w:tblPr>
   </w:style>
-  <w:style w:type="numbering" w:default="1" w:styleId="NoList">
+  <w:style w:type="numbering" w:default="1" w:styleId="Aucuneliste">
     <w:name w:val="No List"/>
     <w:uiPriority w:val="99"/>
     <w:semiHidden/>
     <w:unhideWhenUsed/>
   </w:style>
-  <w:style w:type="paragraph" w:styleId="Header">
+  <w:style w:type="paragraph" w:styleId="En-tte">
     <w:name w:val="header"/>
     <w:basedOn w:val="Normal"/>
-    <w:link w:val="HeaderChar"/>
+    <w:link w:val="En-tteCar"/>
     <w:uiPriority w:val="99"/>
     <w:unhideWhenUsed/>
     <w:rsid w:val="00E618BF"/>
@@ -1718,17 +2413,17 @@
       <w:spacing w:after="0" w:line="240" w:lineRule="auto"/>
     </w:pPr>
   </w:style>
-  <w:style w:type="character" w:customStyle="1" w:styleId="HeaderChar">
-    <w:name w:val="Header Char"/>
-    <w:basedOn w:val="DefaultParagraphFont"/>
-    <w:link w:val="Header"/>
+  <w:style w:type="character" w:customStyle="1" w:styleId="En-tteCar">
+    <w:name w:val="En-tête Car"/>
+    <w:basedOn w:val="Policepardfaut"/>
+    <w:link w:val="En-tte"/>
     <w:uiPriority w:val="99"/>
     <w:rsid w:val="00E618BF"/>
   </w:style>
-  <w:style w:type="paragraph" w:styleId="Footer">
+  <w:style w:type="paragraph" w:styleId="Pieddepage">
     <w:name w:val="footer"/>
     <w:basedOn w:val="Normal"/>
-    <w:link w:val="FooterChar"/>
+    <w:link w:val="PieddepageCar"/>
     <w:uiPriority w:val="99"/>
     <w:unhideWhenUsed/>
     <w:rsid w:val="00E618BF"/>
@@ -1740,14 +2435,14 @@
       <w:spacing w:after="0" w:line="240" w:lineRule="auto"/>
     </w:pPr>
   </w:style>
-  <w:style w:type="character" w:customStyle="1" w:styleId="FooterChar">
-    <w:name w:val="Footer Char"/>
-    <w:basedOn w:val="DefaultParagraphFont"/>
-    <w:link w:val="Footer"/>
+  <w:style w:type="character" w:customStyle="1" w:styleId="PieddepageCar">
+    <w:name w:val="Pied de page Car"/>
+    <w:basedOn w:val="Policepardfaut"/>
+    <w:link w:val="Pieddepage"/>
     <w:uiPriority w:val="99"/>
     <w:rsid w:val="00E618BF"/>
   </w:style>
-  <w:style w:type="paragraph" w:styleId="NoSpacing">
+  <w:style w:type="paragraph" w:styleId="Sansinterligne">
     <w:name w:val="No Spacing"/>
     <w:uiPriority w:val="1"/>
     <w:qFormat/>
@@ -1756,10 +2451,10 @@
       <w:spacing w:after="0" w:line="240" w:lineRule="auto"/>
     </w:pPr>
   </w:style>
-  <w:style w:type="character" w:customStyle="1" w:styleId="Heading1Char">
-    <w:name w:val="Heading 1 Char"/>
-    <w:basedOn w:val="DefaultParagraphFont"/>
-    <w:link w:val="Heading1"/>
+  <w:style w:type="character" w:customStyle="1" w:styleId="Titre1Car">
+    <w:name w:val="Titre 1 Car"/>
+    <w:basedOn w:val="Policepardfaut"/>
+    <w:link w:val="Titre1"/>
     <w:uiPriority w:val="9"/>
     <w:rsid w:val="00FC693F"/>
     <w:rPr>
@@ -1771,10 +2466,10 @@
       <w:szCs w:val="28"/>
     </w:rPr>
   </w:style>
-  <w:style w:type="character" w:customStyle="1" w:styleId="Heading2Char">
-    <w:name w:val="Heading 2 Char"/>
-    <w:basedOn w:val="DefaultParagraphFont"/>
-    <w:link w:val="Heading2"/>
+  <w:style w:type="character" w:customStyle="1" w:styleId="Titre2Car">
+    <w:name w:val="Titre 2 Car"/>
+    <w:basedOn w:val="Policepardfaut"/>
+    <w:link w:val="Titre2"/>
     <w:uiPriority w:val="9"/>
     <w:rsid w:val="00FC693F"/>
     <w:rPr>
@@ -1786,10 +2481,10 @@
       <w:szCs w:val="26"/>
     </w:rPr>
   </w:style>
-  <w:style w:type="character" w:customStyle="1" w:styleId="Heading3Char">
-    <w:name w:val="Heading 3 Char"/>
-    <w:basedOn w:val="DefaultParagraphFont"/>
-    <w:link w:val="Heading3"/>
+  <w:style w:type="character" w:customStyle="1" w:styleId="Titre3Car">
+    <w:name w:val="Titre 3 Car"/>
+    <w:basedOn w:val="Policepardfaut"/>
+    <w:link w:val="Titre3"/>
     <w:uiPriority w:val="9"/>
     <w:rsid w:val="00FC693F"/>
     <w:rPr>
@@ -1799,11 +2494,11 @@
       <w:color w:val="4F81BD" w:themeColor="accent1"/>
     </w:rPr>
   </w:style>
-  <w:style w:type="paragraph" w:styleId="Title">
+  <w:style w:type="paragraph" w:styleId="Titre">
     <w:name w:val="Title"/>
     <w:basedOn w:val="Normal"/>
     <w:next w:val="Normal"/>
-    <w:link w:val="TitleChar"/>
+    <w:link w:val="TitreCar"/>
     <w:uiPriority w:val="10"/>
     <w:qFormat/>
     <w:rsid w:val="00FC693F"/>
@@ -1823,10 +2518,10 @@
       <w:szCs w:val="52"/>
     </w:rPr>
   </w:style>
-  <w:style w:type="character" w:customStyle="1" w:styleId="TitleChar">
-    <w:name w:val="Title Char"/>
-    <w:basedOn w:val="DefaultParagraphFont"/>
-    <w:link w:val="Title"/>
+  <w:style w:type="character" w:customStyle="1" w:styleId="TitreCar">
+    <w:name w:val="Titre Car"/>
+    <w:basedOn w:val="Policepardfaut"/>
+    <w:link w:val="Titre"/>
     <w:uiPriority w:val="10"/>
     <w:rsid w:val="00FC693F"/>
     <w:rPr>
@@ -1838,11 +2533,11 @@
       <w:szCs w:val="52"/>
     </w:rPr>
   </w:style>
-  <w:style w:type="paragraph" w:styleId="Subtitle">
+  <w:style w:type="paragraph" w:styleId="Sous-titre">
     <w:name w:val="Subtitle"/>
     <w:basedOn w:val="Normal"/>
     <w:next w:val="Normal"/>
-    <w:link w:val="SubtitleChar"/>
+    <w:link w:val="Sous-titreCar"/>
     <w:uiPriority w:val="11"/>
     <w:qFormat/>
     <w:rsid w:val="00FC693F"/>
@@ -1861,10 +2556,10 @@
       <w:szCs w:val="24"/>
     </w:rPr>
   </w:style>
-  <w:style w:type="character" w:customStyle="1" w:styleId="SubtitleChar">
-    <w:name w:val="Subtitle Char"/>
-    <w:basedOn w:val="DefaultParagraphFont"/>
-    <w:link w:val="Subtitle"/>
+  <w:style w:type="character" w:customStyle="1" w:styleId="Sous-titreCar">
+    <w:name w:val="Sous-titre Car"/>
+    <w:basedOn w:val="Policepardfaut"/>
+    <w:link w:val="Sous-titre"/>
     <w:uiPriority w:val="11"/>
     <w:rsid w:val="00FC693F"/>
     <w:rPr>
@@ -1877,7 +2572,7 @@
       <w:szCs w:val="24"/>
     </w:rPr>
   </w:style>
-  <w:style w:type="paragraph" w:styleId="ListParagraph">
+  <w:style w:type="paragraph" w:styleId="Paragraphedeliste">
     <w:name w:val="List Paragraph"/>
     <w:basedOn w:val="Normal"/>
     <w:uiPriority w:val="34"/>
@@ -1888,10 +2583,10 @@
       <w:contextualSpacing/>
     </w:pPr>
   </w:style>
-  <w:style w:type="paragraph" w:styleId="BodyText">
+  <w:style w:type="paragraph" w:styleId="Corpsdetexte">
     <w:name w:val="Body Text"/>
     <w:basedOn w:val="Normal"/>
-    <w:link w:val="BodyTextChar"/>
+    <w:link w:val="CorpsdetexteCar"/>
     <w:uiPriority w:val="99"/>
     <w:unhideWhenUsed/>
     <w:rsid w:val="00AA1D8D"/>
@@ -1899,17 +2594,17 @@
       <w:spacing w:after="120"/>
     </w:pPr>
   </w:style>
-  <w:style w:type="character" w:customStyle="1" w:styleId="BodyTextChar">
-    <w:name w:val="Body Text Char"/>
-    <w:basedOn w:val="DefaultParagraphFont"/>
-    <w:link w:val="BodyText"/>
+  <w:style w:type="character" w:customStyle="1" w:styleId="CorpsdetexteCar">
+    <w:name w:val="Corps de texte Car"/>
+    <w:basedOn w:val="Policepardfaut"/>
+    <w:link w:val="Corpsdetexte"/>
     <w:uiPriority w:val="99"/>
     <w:rsid w:val="00AA1D8D"/>
   </w:style>
-  <w:style w:type="paragraph" w:styleId="BodyText2">
+  <w:style w:type="paragraph" w:styleId="Corpsdetexte2">
     <w:name w:val="Body Text 2"/>
     <w:basedOn w:val="Normal"/>
-    <w:link w:val="BodyText2Char"/>
+    <w:link w:val="Corpsdetexte2Car"/>
     <w:uiPriority w:val="99"/>
     <w:unhideWhenUsed/>
     <w:rsid w:val="00AA1D8D"/>
@@ -1917,17 +2612,17 @@
       <w:spacing w:after="120" w:line="480" w:lineRule="auto"/>
     </w:pPr>
   </w:style>
-  <w:style w:type="character" w:customStyle="1" w:styleId="BodyText2Char">
-    <w:name w:val="Body Text 2 Char"/>
-    <w:basedOn w:val="DefaultParagraphFont"/>
-    <w:link w:val="BodyText2"/>
+  <w:style w:type="character" w:customStyle="1" w:styleId="Corpsdetexte2Car">
+    <w:name w:val="Corps de texte 2 Car"/>
+    <w:basedOn w:val="Policepardfaut"/>
+    <w:link w:val="Corpsdetexte2"/>
     <w:uiPriority w:val="99"/>
     <w:rsid w:val="00AA1D8D"/>
   </w:style>
-  <w:style w:type="paragraph" w:styleId="BodyText3">
+  <w:style w:type="paragraph" w:styleId="Corpsdetexte3">
     <w:name w:val="Body Text 3"/>
     <w:basedOn w:val="Normal"/>
-    <w:link w:val="BodyText3Char"/>
+    <w:link w:val="Corpsdetexte3Car"/>
     <w:uiPriority w:val="99"/>
     <w:unhideWhenUsed/>
     <w:rsid w:val="00AA1D8D"/>
@@ -1939,10 +2634,10 @@
       <w:szCs w:val="16"/>
     </w:rPr>
   </w:style>
-  <w:style w:type="character" w:customStyle="1" w:styleId="BodyText3Char">
-    <w:name w:val="Body Text 3 Char"/>
-    <w:basedOn w:val="DefaultParagraphFont"/>
-    <w:link w:val="BodyText3"/>
+  <w:style w:type="character" w:customStyle="1" w:styleId="Corpsdetexte3Car">
+    <w:name w:val="Corps de texte 3 Car"/>
+    <w:basedOn w:val="Policepardfaut"/>
+    <w:link w:val="Corpsdetexte3"/>
     <w:uiPriority w:val="99"/>
     <w:rsid w:val="00AA1D8D"/>
     <w:rPr>
@@ -1950,7 +2645,7 @@
       <w:szCs w:val="16"/>
     </w:rPr>
   </w:style>
-  <w:style w:type="paragraph" w:styleId="List">
+  <w:style w:type="paragraph" w:styleId="Liste">
     <w:name w:val="List"/>
     <w:basedOn w:val="Normal"/>
     <w:uiPriority w:val="99"/>
@@ -1961,7 +2656,7 @@
       <w:contextualSpacing/>
     </w:pPr>
   </w:style>
-  <w:style w:type="paragraph" w:styleId="List2">
+  <w:style w:type="paragraph" w:styleId="Liste2">
     <w:name w:val="List 2"/>
     <w:basedOn w:val="Normal"/>
     <w:uiPriority w:val="99"/>
@@ -1972,7 +2667,7 @@
       <w:contextualSpacing/>
     </w:pPr>
   </w:style>
-  <w:style w:type="paragraph" w:styleId="List3">
+  <w:style w:type="paragraph" w:styleId="Liste3">
     <w:name w:val="List 3"/>
     <w:basedOn w:val="Normal"/>
     <w:uiPriority w:val="99"/>
@@ -1983,7 +2678,7 @@
       <w:contextualSpacing/>
     </w:pPr>
   </w:style>
-  <w:style w:type="paragraph" w:styleId="ListBullet">
+  <w:style w:type="paragraph" w:styleId="Listepuces">
     <w:name w:val="List Bullet"/>
     <w:basedOn w:val="Normal"/>
     <w:uiPriority w:val="99"/>
@@ -1996,7 +2691,7 @@
       <w:contextualSpacing/>
     </w:pPr>
   </w:style>
-  <w:style w:type="paragraph" w:styleId="ListBullet2">
+  <w:style w:type="paragraph" w:styleId="Listepuces2">
     <w:name w:val="List Bullet 2"/>
     <w:basedOn w:val="Normal"/>
     <w:uiPriority w:val="99"/>
@@ -2009,7 +2704,7 @@
       <w:contextualSpacing/>
     </w:pPr>
   </w:style>
-  <w:style w:type="paragraph" w:styleId="ListBullet3">
+  <w:style w:type="paragraph" w:styleId="Listepuces3">
     <w:name w:val="List Bullet 3"/>
     <w:basedOn w:val="Normal"/>
     <w:uiPriority w:val="99"/>
@@ -2022,7 +2717,7 @@
       <w:contextualSpacing/>
     </w:pPr>
   </w:style>
-  <w:style w:type="paragraph" w:styleId="ListNumber">
+  <w:style w:type="paragraph" w:styleId="Listenumros">
     <w:name w:val="List Number"/>
     <w:basedOn w:val="Normal"/>
     <w:uiPriority w:val="99"/>
@@ -2035,7 +2730,7 @@
       <w:contextualSpacing/>
     </w:pPr>
   </w:style>
-  <w:style w:type="paragraph" w:styleId="ListNumber2">
+  <w:style w:type="paragraph" w:styleId="Listenumros2">
     <w:name w:val="List Number 2"/>
     <w:basedOn w:val="Normal"/>
     <w:uiPriority w:val="99"/>
@@ -2048,7 +2743,7 @@
       <w:contextualSpacing/>
     </w:pPr>
   </w:style>
-  <w:style w:type="paragraph" w:styleId="ListNumber3">
+  <w:style w:type="paragraph" w:styleId="Listenumros3">
     <w:name w:val="List Number 3"/>
     <w:basedOn w:val="Normal"/>
     <w:uiPriority w:val="99"/>
@@ -2061,7 +2756,7 @@
       <w:contextualSpacing/>
     </w:pPr>
   </w:style>
-  <w:style w:type="paragraph" w:styleId="ListContinue">
+  <w:style w:type="paragraph" w:styleId="Listecontinue">
     <w:name w:val="List Continue"/>
     <w:basedOn w:val="Normal"/>
     <w:uiPriority w:val="99"/>
@@ -2073,7 +2768,7 @@
       <w:contextualSpacing/>
     </w:pPr>
   </w:style>
-  <w:style w:type="paragraph" w:styleId="ListContinue2">
+  <w:style w:type="paragraph" w:styleId="Listecontinue2">
     <w:name w:val="List Continue 2"/>
     <w:basedOn w:val="Normal"/>
     <w:uiPriority w:val="99"/>
@@ -2085,7 +2780,7 @@
       <w:contextualSpacing/>
     </w:pPr>
   </w:style>
-  <w:style w:type="paragraph" w:styleId="ListContinue3">
+  <w:style w:type="paragraph" w:styleId="Listecontinue3">
     <w:name w:val="List Continue 3"/>
     <w:basedOn w:val="Normal"/>
     <w:uiPriority w:val="99"/>
@@ -2097,9 +2792,9 @@
       <w:contextualSpacing/>
     </w:pPr>
   </w:style>
-  <w:style w:type="paragraph" w:styleId="MacroText">
+  <w:style w:type="paragraph" w:styleId="Textedemacro">
     <w:name w:val="macro"/>
-    <w:link w:val="MacroTextChar"/>
+    <w:link w:val="TextedemacroCar"/>
     <w:uiPriority w:val="99"/>
     <w:unhideWhenUsed/>
     <w:rsid w:val="0029639D"/>
@@ -2120,10 +2815,10 @@
       <w:szCs w:val="20"/>
     </w:rPr>
   </w:style>
-  <w:style w:type="character" w:customStyle="1" w:styleId="MacroTextChar">
-    <w:name w:val="Macro Text Char"/>
-    <w:basedOn w:val="DefaultParagraphFont"/>
-    <w:link w:val="MacroText"/>
+  <w:style w:type="character" w:customStyle="1" w:styleId="TextedemacroCar">
+    <w:name w:val="Texte de macro Car"/>
+    <w:basedOn w:val="Policepardfaut"/>
+    <w:link w:val="Textedemacro"/>
     <w:uiPriority w:val="99"/>
     <w:rsid w:val="0029639D"/>
     <w:rPr>
@@ -2132,11 +2827,11 @@
       <w:szCs w:val="20"/>
     </w:rPr>
   </w:style>
-  <w:style w:type="paragraph" w:styleId="Quote">
+  <w:style w:type="paragraph" w:styleId="Citation">
     <w:name w:val="Quote"/>
     <w:basedOn w:val="Normal"/>
     <w:next w:val="Normal"/>
-    <w:link w:val="QuoteChar"/>
+    <w:link w:val="CitationCar"/>
     <w:uiPriority w:val="29"/>
     <w:qFormat/>
     <w:rsid w:val="00FC693F"/>
@@ -2146,10 +2841,10 @@
       <w:color w:val="000000" w:themeColor="text1"/>
     </w:rPr>
   </w:style>
-  <w:style w:type="character" w:customStyle="1" w:styleId="QuoteChar">
-    <w:name w:val="Quote Char"/>
-    <w:basedOn w:val="DefaultParagraphFont"/>
-    <w:link w:val="Quote"/>
+  <w:style w:type="character" w:customStyle="1" w:styleId="CitationCar">
+    <w:name w:val="Citation Car"/>
+    <w:basedOn w:val="Policepardfaut"/>
+    <w:link w:val="Citation"/>
     <w:uiPriority w:val="29"/>
     <w:rsid w:val="00FC693F"/>
     <w:rPr>
@@ -2158,10 +2853,10 @@
       <w:color w:val="000000" w:themeColor="text1"/>
     </w:rPr>
   </w:style>
-  <w:style w:type="character" w:customStyle="1" w:styleId="Heading4Char">
-    <w:name w:val="Heading 4 Char"/>
-    <w:basedOn w:val="DefaultParagraphFont"/>
-    <w:link w:val="Heading4"/>
+  <w:style w:type="character" w:customStyle="1" w:styleId="Titre4Car">
+    <w:name w:val="Titre 4 Car"/>
+    <w:basedOn w:val="Policepardfaut"/>
+    <w:link w:val="Titre4"/>
     <w:uiPriority w:val="9"/>
     <w:semiHidden/>
     <w:rsid w:val="00FC693F"/>
@@ -2174,10 +2869,10 @@
       <w:color w:val="4F81BD" w:themeColor="accent1"/>
     </w:rPr>
   </w:style>
-  <w:style w:type="character" w:customStyle="1" w:styleId="Heading5Char">
-    <w:name w:val="Heading 5 Char"/>
-    <w:basedOn w:val="DefaultParagraphFont"/>
-    <w:link w:val="Heading5"/>
+  <w:style w:type="character" w:customStyle="1" w:styleId="Titre5Car">
+    <w:name w:val="Titre 5 Car"/>
+    <w:basedOn w:val="Policepardfaut"/>
+    <w:link w:val="Titre5"/>
     <w:uiPriority w:val="9"/>
     <w:semiHidden/>
     <w:rsid w:val="00FC693F"/>
@@ -2186,10 +2881,10 @@
       <w:color w:val="243F60" w:themeColor="accent1" w:themeShade="7F"/>
     </w:rPr>
   </w:style>
-  <w:style w:type="character" w:customStyle="1" w:styleId="Heading6Char">
-    <w:name w:val="Heading 6 Char"/>
-    <w:basedOn w:val="DefaultParagraphFont"/>
-    <w:link w:val="Heading6"/>
+  <w:style w:type="character" w:customStyle="1" w:styleId="Titre6Car">
+    <w:name w:val="Titre 6 Car"/>
+    <w:basedOn w:val="Policepardfaut"/>
+    <w:link w:val="Titre6"/>
     <w:uiPriority w:val="9"/>
     <w:semiHidden/>
     <w:rsid w:val="00FC693F"/>
@@ -2200,10 +2895,10 @@
       <w:color w:val="243F60" w:themeColor="accent1" w:themeShade="7F"/>
     </w:rPr>
   </w:style>
-  <w:style w:type="character" w:customStyle="1" w:styleId="Heading7Char">
-    <w:name w:val="Heading 7 Char"/>
-    <w:basedOn w:val="DefaultParagraphFont"/>
-    <w:link w:val="Heading7"/>
+  <w:style w:type="character" w:customStyle="1" w:styleId="Titre7Car">
+    <w:name w:val="Titre 7 Car"/>
+    <w:basedOn w:val="Policepardfaut"/>
+    <w:link w:val="Titre7"/>
     <w:uiPriority w:val="9"/>
     <w:semiHidden/>
     <w:rsid w:val="00FC693F"/>
@@ -2214,10 +2909,10 @@
       <w:color w:val="404040" w:themeColor="text1" w:themeTint="BF"/>
     </w:rPr>
   </w:style>
-  <w:style w:type="character" w:customStyle="1" w:styleId="Heading8Char">
-    <w:name w:val="Heading 8 Char"/>
-    <w:basedOn w:val="DefaultParagraphFont"/>
-    <w:link w:val="Heading8"/>
+  <w:style w:type="character" w:customStyle="1" w:styleId="Titre8Car">
+    <w:name w:val="Titre 8 Car"/>
+    <w:basedOn w:val="Policepardfaut"/>
+    <w:link w:val="Titre8"/>
     <w:uiPriority w:val="9"/>
     <w:semiHidden/>
     <w:rsid w:val="00FC693F"/>
@@ -2228,10 +2923,10 @@
       <w:szCs w:val="20"/>
     </w:rPr>
   </w:style>
-  <w:style w:type="character" w:customStyle="1" w:styleId="Heading9Char">
-    <w:name w:val="Heading 9 Char"/>
-    <w:basedOn w:val="DefaultParagraphFont"/>
-    <w:link w:val="Heading9"/>
+  <w:style w:type="character" w:customStyle="1" w:styleId="Titre9Car">
+    <w:name w:val="Titre 9 Car"/>
+    <w:basedOn w:val="Policepardfaut"/>
+    <w:link w:val="Titre9"/>
     <w:uiPriority w:val="9"/>
     <w:semiHidden/>
     <w:rsid w:val="00FC693F"/>
@@ -2244,7 +2939,7 @@
       <w:szCs w:val="20"/>
     </w:rPr>
   </w:style>
-  <w:style w:type="paragraph" w:styleId="Caption">
+  <w:style w:type="paragraph" w:styleId="Lgende">
     <w:name w:val="caption"/>
     <w:basedOn w:val="Normal"/>
     <w:next w:val="Normal"/>
@@ -2264,9 +2959,9 @@
       <w:szCs w:val="18"/>
     </w:rPr>
   </w:style>
-  <w:style w:type="character" w:styleId="Strong">
+  <w:style w:type="character" w:styleId="lev">
     <w:name w:val="Strong"/>
-    <w:basedOn w:val="DefaultParagraphFont"/>
+    <w:basedOn w:val="Policepardfaut"/>
     <w:uiPriority w:val="22"/>
     <w:qFormat/>
     <w:rsid w:val="00FC693F"/>
@@ -2275,9 +2970,9 @@
       <w:bCs/>
     </w:rPr>
   </w:style>
-  <w:style w:type="character" w:styleId="Emphasis">
+  <w:style w:type="character" w:styleId="Accentuation">
     <w:name w:val="Emphasis"/>
-    <w:basedOn w:val="DefaultParagraphFont"/>
+    <w:basedOn w:val="Policepardfaut"/>
     <w:uiPriority w:val="20"/>
     <w:qFormat/>
     <w:rsid w:val="00FC693F"/>
@@ -2286,11 +2981,11 @@
       <w:iCs/>
     </w:rPr>
   </w:style>
-  <w:style w:type="paragraph" w:styleId="IntenseQuote">
+  <w:style w:type="paragraph" w:styleId="Citationintense">
     <w:name w:val="Intense Quote"/>
     <w:basedOn w:val="Normal"/>
     <w:next w:val="Normal"/>
-    <w:link w:val="IntenseQuoteChar"/>
+    <w:link w:val="CitationintenseCar"/>
     <w:uiPriority w:val="30"/>
     <w:qFormat/>
     <w:rsid w:val="00FC693F"/>
@@ -2309,10 +3004,10 @@
       <w:color w:val="4F81BD" w:themeColor="accent1"/>
     </w:rPr>
   </w:style>
-  <w:style w:type="character" w:customStyle="1" w:styleId="IntenseQuoteChar">
-    <w:name w:val="Intense Quote Char"/>
-    <w:basedOn w:val="DefaultParagraphFont"/>
-    <w:link w:val="IntenseQuote"/>
+  <w:style w:type="character" w:customStyle="1" w:styleId="CitationintenseCar">
+    <w:name w:val="Citation intense Car"/>
+    <w:basedOn w:val="Policepardfaut"/>
+    <w:link w:val="Citationintense"/>
     <w:uiPriority w:val="30"/>
     <w:rsid w:val="00FC693F"/>
     <w:rPr>
@@ -2323,9 +3018,9 @@
       <w:color w:val="4F81BD" w:themeColor="accent1"/>
     </w:rPr>
   </w:style>
-  <w:style w:type="character" w:styleId="SubtleEmphasis">
+  <w:style w:type="character" w:styleId="Accentuationlgre">
     <w:name w:val="Subtle Emphasis"/>
-    <w:basedOn w:val="DefaultParagraphFont"/>
+    <w:basedOn w:val="Policepardfaut"/>
     <w:uiPriority w:val="19"/>
     <w:qFormat/>
     <w:rsid w:val="00FC693F"/>
@@ -2335,9 +3030,9 @@
       <w:color w:val="808080" w:themeColor="text1" w:themeTint="7F"/>
     </w:rPr>
   </w:style>
-  <w:style w:type="character" w:styleId="IntenseEmphasis">
+  <w:style w:type="character" w:styleId="Accentuationintense">
     <w:name w:val="Intense Emphasis"/>
-    <w:basedOn w:val="DefaultParagraphFont"/>
+    <w:basedOn w:val="Policepardfaut"/>
     <w:uiPriority w:val="21"/>
     <w:qFormat/>
     <w:rsid w:val="00FC693F"/>
@@ -2349,9 +3044,9 @@
       <w:color w:val="4F81BD" w:themeColor="accent1"/>
     </w:rPr>
   </w:style>
-  <w:style w:type="character" w:styleId="SubtleReference">
+  <w:style w:type="character" w:styleId="Rfrencelgre">
     <w:name w:val="Subtle Reference"/>
-    <w:basedOn w:val="DefaultParagraphFont"/>
+    <w:basedOn w:val="Policepardfaut"/>
     <w:uiPriority w:val="31"/>
     <w:qFormat/>
     <w:rsid w:val="00FC693F"/>
@@ -2361,9 +3056,9 @@
       <w:u w:val="single"/>
     </w:rPr>
   </w:style>
-  <w:style w:type="character" w:styleId="IntenseReference">
+  <w:style w:type="character" w:styleId="Rfrenceintense">
     <w:name w:val="Intense Reference"/>
-    <w:basedOn w:val="DefaultParagraphFont"/>
+    <w:basedOn w:val="Policepardfaut"/>
     <w:uiPriority w:val="32"/>
     <w:qFormat/>
     <w:rsid w:val="00FC693F"/>
@@ -2376,9 +3071,9 @@
       <w:u w:val="single"/>
     </w:rPr>
   </w:style>
-  <w:style w:type="character" w:styleId="BookTitle">
+  <w:style w:type="character" w:styleId="Titredulivre">
     <w:name w:val="Book Title"/>
-    <w:basedOn w:val="DefaultParagraphFont"/>
+    <w:basedOn w:val="Policepardfaut"/>
     <w:uiPriority w:val="33"/>
     <w:qFormat/>
     <w:rsid w:val="00FC693F"/>
@@ -2389,9 +3084,9 @@
       <w:spacing w:val="5"/>
     </w:rPr>
   </w:style>
-  <w:style w:type="paragraph" w:styleId="TOCHeading">
+  <w:style w:type="paragraph" w:styleId="En-ttedetabledesmatires">
     <w:name w:val="TOC Heading"/>
-    <w:basedOn w:val="Heading1"/>
+    <w:basedOn w:val="Titre1"/>
     <w:next w:val="Normal"/>
     <w:uiPriority w:val="39"/>
     <w:semiHidden/>
@@ -2402,9 +3097,9 @@
       <w:outlineLvl w:val="9"/>
     </w:pPr>
   </w:style>
-  <w:style w:type="table" w:styleId="TableGrid">
+  <w:style w:type="table" w:styleId="Grilledutableau">
     <w:name w:val="Table Grid"/>
-    <w:basedOn w:val="TableNormal"/>
+    <w:basedOn w:val="TableauNormal"/>
     <w:uiPriority w:val="59"/>
     <w:rsid w:val="00FC693F"/>
     <w:pPr>
@@ -2421,9 +3116,9 @@
       </w:tblBorders>
     </w:tblPr>
   </w:style>
-  <w:style w:type="table" w:styleId="LightShading">
+  <w:style w:type="table" w:styleId="Ombrageclair">
     <w:name w:val="Light Shading"/>
-    <w:basedOn w:val="TableNormal"/>
+    <w:basedOn w:val="TableauNormal"/>
     <w:uiPriority w:val="60"/>
     <w:rsid w:val="00FC693F"/>
     <w:pPr>
@@ -2517,9 +3212,9 @@
       </w:tcPr>
     </w:tblStylePr>
   </w:style>
-  <w:style w:type="table" w:styleId="LightShading-Accent1">
+  <w:style w:type="table" w:styleId="Trameclaire-Accent1">
     <w:name w:val="Light Shading Accent 1"/>
-    <w:basedOn w:val="TableNormal"/>
+    <w:basedOn w:val="TableauNormal"/>
     <w:uiPriority w:val="60"/>
     <w:rsid w:val="00FC693F"/>
     <w:pPr>
@@ -2613,9 +3308,9 @@
       </w:tcPr>
     </w:tblStylePr>
   </w:style>
-  <w:style w:type="table" w:styleId="LightShading-Accent2">
+  <w:style w:type="table" w:styleId="Trameclaire-Accent2">
     <w:name w:val="Light Shading Accent 2"/>
-    <w:basedOn w:val="TableNormal"/>
+    <w:basedOn w:val="TableauNormal"/>
     <w:uiPriority w:val="60"/>
     <w:rsid w:val="00FC693F"/>
     <w:pPr>
@@ -2709,9 +3404,9 @@
       </w:tcPr>
     </w:tblStylePr>
   </w:style>
-  <w:style w:type="table" w:styleId="LightShading-Accent3">
+  <w:style w:type="table" w:styleId="Trameclaire-Accent3">
     <w:name w:val="Light Shading Accent 3"/>
-    <w:basedOn w:val="TableNormal"/>
+    <w:basedOn w:val="TableauNormal"/>
     <w:uiPriority w:val="60"/>
     <w:rsid w:val="00FC693F"/>
     <w:pPr>
@@ -2805,9 +3500,9 @@
       </w:tcPr>
     </w:tblStylePr>
   </w:style>
-  <w:style w:type="table" w:styleId="LightShading-Accent4">
+  <w:style w:type="table" w:styleId="Trameclaire-Accent4">
     <w:name w:val="Light Shading Accent 4"/>
-    <w:basedOn w:val="TableNormal"/>
+    <w:basedOn w:val="TableauNormal"/>
     <w:uiPriority w:val="60"/>
     <w:rsid w:val="00FC693F"/>
     <w:pPr>
@@ -2901,9 +3596,9 @@
       </w:tcPr>
     </w:tblStylePr>
   </w:style>
-  <w:style w:type="table" w:styleId="LightShading-Accent5">
+  <w:style w:type="table" w:styleId="Trameclaire-Accent5">
     <w:name w:val="Light Shading Accent 5"/>
-    <w:basedOn w:val="TableNormal"/>
+    <w:basedOn w:val="TableauNormal"/>
     <w:uiPriority w:val="60"/>
     <w:rsid w:val="00FC693F"/>
     <w:pPr>
@@ -2997,9 +3692,9 @@
       </w:tcPr>
     </w:tblStylePr>
   </w:style>
-  <w:style w:type="table" w:styleId="LightShading-Accent6">
+  <w:style w:type="table" w:styleId="Trameclaire-Accent6">
     <w:name w:val="Light Shading Accent 6"/>
-    <w:basedOn w:val="TableNormal"/>
+    <w:basedOn w:val="TableauNormal"/>
     <w:uiPriority w:val="60"/>
     <w:rsid w:val="00FC693F"/>
     <w:pPr>
@@ -3093,9 +3788,9 @@
       </w:tcPr>
     </w:tblStylePr>
   </w:style>
-  <w:style w:type="table" w:styleId="LightList">
+  <w:style w:type="table" w:styleId="Listeclaire">
     <w:name w:val="Light List"/>
-    <w:basedOn w:val="TableNormal"/>
+    <w:basedOn w:val="TableauNormal"/>
     <w:uiPriority w:val="61"/>
     <w:rsid w:val="00FC693F"/>
     <w:pPr>
@@ -3178,9 +3873,9 @@
       </w:tcPr>
     </w:tblStylePr>
   </w:style>
-  <w:style w:type="table" w:styleId="LightList-Accent1">
+  <w:style w:type="table" w:styleId="Listeclaire-Accent1">
     <w:name w:val="Light List Accent 1"/>
-    <w:basedOn w:val="TableNormal"/>
+    <w:basedOn w:val="TableauNormal"/>
     <w:uiPriority w:val="61"/>
     <w:rsid w:val="00FC693F"/>
     <w:pPr>
@@ -3263,9 +3958,9 @@
       </w:tcPr>
     </w:tblStylePr>
   </w:style>
-  <w:style w:type="table" w:styleId="LightList-Accent2">
+  <w:style w:type="table" w:styleId="Listeclaire-Accent2">
     <w:name w:val="Light List Accent 2"/>
-    <w:basedOn w:val="TableNormal"/>
+    <w:basedOn w:val="TableauNormal"/>
     <w:uiPriority w:val="61"/>
     <w:rsid w:val="00CB0664"/>
     <w:pPr>
@@ -3348,9 +4043,9 @@
       </w:tcPr>
     </w:tblStylePr>
   </w:style>
-  <w:style w:type="table" w:styleId="LightList-Accent3">
+  <w:style w:type="table" w:styleId="Listeclaire-Accent3">
     <w:name w:val="Light List Accent 3"/>
-    <w:basedOn w:val="TableNormal"/>
+    <w:basedOn w:val="TableauNormal"/>
     <w:uiPriority w:val="61"/>
     <w:rsid w:val="00CB0664"/>
     <w:pPr>
@@ -3433,9 +4128,9 @@
       </w:tcPr>
     </w:tblStylePr>
   </w:style>
-  <w:style w:type="table" w:styleId="LightList-Accent4">
+  <w:style w:type="table" w:styleId="Listeclaire-Accent4">
     <w:name w:val="Light List Accent 4"/>
-    <w:basedOn w:val="TableNormal"/>
+    <w:basedOn w:val="TableauNormal"/>
     <w:uiPriority w:val="61"/>
     <w:rsid w:val="00CB0664"/>
     <w:pPr>
@@ -3518,9 +4213,9 @@
       </w:tcPr>
     </w:tblStylePr>
   </w:style>
-  <w:style w:type="table" w:styleId="LightList-Accent5">
+  <w:style w:type="table" w:styleId="Listeclaire-Accent5">
     <w:name w:val="Light List Accent 5"/>
-    <w:basedOn w:val="TableNormal"/>
+    <w:basedOn w:val="TableauNormal"/>
     <w:uiPriority w:val="61"/>
     <w:rsid w:val="00CB0664"/>
     <w:pPr>
@@ -3603,9 +4298,9 @@
       </w:tcPr>
     </w:tblStylePr>
   </w:style>
-  <w:style w:type="table" w:styleId="LightList-Accent6">
+  <w:style w:type="table" w:styleId="Listeclaire-Accent6">
     <w:name w:val="Light List Accent 6"/>
-    <w:basedOn w:val="TableNormal"/>
+    <w:basedOn w:val="TableauNormal"/>
     <w:uiPriority w:val="61"/>
     <w:rsid w:val="00CB0664"/>
     <w:pPr>
@@ -3688,9 +4383,9 @@
       </w:tcPr>
     </w:tblStylePr>
   </w:style>
-  <w:style w:type="table" w:styleId="LightGrid">
+  <w:style w:type="table" w:styleId="Grilleclaire">
     <w:name w:val="Light Grid"/>
-    <w:basedOn w:val="TableNormal"/>
+    <w:basedOn w:val="TableauNormal"/>
     <w:uiPriority w:val="62"/>
     <w:rsid w:val="00CB0664"/>
     <w:pPr>
@@ -3811,9 +4506,9 @@
       </w:tcPr>
     </w:tblStylePr>
   </w:style>
-  <w:style w:type="table" w:styleId="LightGrid-Accent1">
+  <w:style w:type="table" w:styleId="Grilleclaire-Accent1">
     <w:name w:val="Light Grid Accent 1"/>
-    <w:basedOn w:val="TableNormal"/>
+    <w:basedOn w:val="TableauNormal"/>
     <w:uiPriority w:val="62"/>
     <w:rsid w:val="00CB0664"/>
     <w:pPr>
@@ -3934,9 +4629,9 @@
       </w:tcPr>
     </w:tblStylePr>
   </w:style>
-  <w:style w:type="table" w:styleId="LightGrid-Accent2">
+  <w:style w:type="table" w:styleId="Grilleclaire-Accent2">
     <w:name w:val="Light Grid Accent 2"/>
-    <w:basedOn w:val="TableNormal"/>
+    <w:basedOn w:val="TableauNormal"/>
     <w:uiPriority w:val="62"/>
     <w:rsid w:val="00CB0664"/>
     <w:pPr>
@@ -4057,9 +4752,9 @@
       </w:tcPr>
     </w:tblStylePr>
   </w:style>
-  <w:style w:type="table" w:styleId="LightGrid-Accent3">
+  <w:style w:type="table" w:styleId="Grilleclaire-Accent3">
     <w:name w:val="Light Grid Accent 3"/>
-    <w:basedOn w:val="TableNormal"/>
+    <w:basedOn w:val="TableauNormal"/>
     <w:uiPriority w:val="62"/>
     <w:rsid w:val="00CB0664"/>
     <w:pPr>
@@ -4180,9 +4875,9 @@
       </w:tcPr>
     </w:tblStylePr>
   </w:style>
-  <w:style w:type="table" w:styleId="LightGrid-Accent4">
+  <w:style w:type="table" w:styleId="Grilleclaire-Accent4">
     <w:name w:val="Light Grid Accent 4"/>
-    <w:basedOn w:val="TableNormal"/>
+    <w:basedOn w:val="TableauNormal"/>
     <w:uiPriority w:val="62"/>
     <w:rsid w:val="00CB0664"/>
     <w:pPr>
@@ -4303,9 +4998,9 @@
       </w:tcPr>
     </w:tblStylePr>
   </w:style>
-  <w:style w:type="table" w:styleId="LightGrid-Accent5">
+  <w:style w:type="table" w:styleId="Grilleclaire-Accent5">
     <w:name w:val="Light Grid Accent 5"/>
-    <w:basedOn w:val="TableNormal"/>
+    <w:basedOn w:val="TableauNormal"/>
     <w:uiPriority w:val="62"/>
     <w:rsid w:val="00CB0664"/>
     <w:pPr>
@@ -4426,9 +5121,9 @@
       </w:tcPr>
     </w:tblStylePr>
   </w:style>
-  <w:style w:type="table" w:styleId="LightGrid-Accent6">
+  <w:style w:type="table" w:styleId="Grilleclaire-Accent6">
     <w:name w:val="Light Grid Accent 6"/>
-    <w:basedOn w:val="TableNormal"/>
+    <w:basedOn w:val="TableauNormal"/>
     <w:uiPriority w:val="62"/>
     <w:rsid w:val="00CB0664"/>
     <w:pPr>
@@ -4549,9 +5244,9 @@
       </w:tcPr>
     </w:tblStylePr>
   </w:style>
-  <w:style w:type="table" w:styleId="MediumShading1">
+  <w:style w:type="table" w:styleId="Tramemoyenne1">
     <w:name w:val="Medium Shading 1"/>
-    <w:basedOn w:val="TableNormal"/>
+    <w:basedOn w:val="TableauNormal"/>
     <w:uiPriority w:val="63"/>
     <w:rsid w:val="00CB0664"/>
     <w:pPr>
@@ -4648,9 +5343,9 @@
       </w:tcPr>
     </w:tblStylePr>
   </w:style>
-  <w:style w:type="table" w:styleId="MediumShading1-Accent1">
+  <w:style w:type="table" w:styleId="Tramemoyenne1-Accent1">
     <w:name w:val="Medium Shading 1 Accent 1"/>
-    <w:basedOn w:val="TableNormal"/>
+    <w:basedOn w:val="TableauNormal"/>
     <w:uiPriority w:val="63"/>
     <w:rsid w:val="00CB0664"/>
     <w:pPr>
@@ -4747,9 +5442,9 @@
       </w:tcPr>
     </w:tblStylePr>
   </w:style>
-  <w:style w:type="table" w:styleId="MediumShading1-Accent2">
+  <w:style w:type="table" w:styleId="Tramemoyenne1-Accent2">
     <w:name w:val="Medium Shading 1 Accent 2"/>
-    <w:basedOn w:val="TableNormal"/>
+    <w:basedOn w:val="TableauNormal"/>
     <w:uiPriority w:val="63"/>
     <w:rsid w:val="00CB0664"/>
     <w:pPr>
@@ -4846,9 +5541,9 @@
       </w:tcPr>
     </w:tblStylePr>
   </w:style>
-  <w:style w:type="table" w:styleId="MediumShading1-Accent3">
+  <w:style w:type="table" w:styleId="Tramemoyenne1-Accent3">
     <w:name w:val="Medium Shading 1 Accent 3"/>
-    <w:basedOn w:val="TableNormal"/>
+    <w:basedOn w:val="TableauNormal"/>
     <w:uiPriority w:val="63"/>
     <w:rsid w:val="00CB0664"/>
     <w:pPr>
@@ -4945,9 +5640,9 @@
       </w:tcPr>
     </w:tblStylePr>
   </w:style>
-  <w:style w:type="table" w:styleId="MediumShading1-Accent4">
+  <w:style w:type="table" w:styleId="Tramemoyenne1-Accent4">
     <w:name w:val="Medium Shading 1 Accent 4"/>
-    <w:basedOn w:val="TableNormal"/>
+    <w:basedOn w:val="TableauNormal"/>
     <w:uiPriority w:val="63"/>
     <w:rsid w:val="00CB0664"/>
     <w:pPr>
@@ -5044,9 +5739,9 @@
       </w:tcPr>
     </w:tblStylePr>
   </w:style>
-  <w:style w:type="table" w:styleId="MediumShading1-Accent5">
+  <w:style w:type="table" w:styleId="Tramemoyenne1-Accent5">
     <w:name w:val="Medium Shading 1 Accent 5"/>
-    <w:basedOn w:val="TableNormal"/>
+    <w:basedOn w:val="TableauNormal"/>
     <w:uiPriority w:val="63"/>
     <w:rsid w:val="00CB0664"/>
     <w:pPr>
@@ -5143,9 +5838,9 @@
       </w:tcPr>
     </w:tblStylePr>
   </w:style>
-  <w:style w:type="table" w:styleId="MediumShading1-Accent6">
+  <w:style w:type="table" w:styleId="Tramemoyenne1-Accent6">
     <w:name w:val="Medium Shading 1 Accent 6"/>
-    <w:basedOn w:val="TableNormal"/>
+    <w:basedOn w:val="TableauNormal"/>
     <w:uiPriority w:val="63"/>
     <w:rsid w:val="00CB0664"/>
     <w:pPr>
@@ -5242,9 +5937,9 @@
       </w:tcPr>
     </w:tblStylePr>
   </w:style>
-  <w:style w:type="table" w:styleId="MediumShading2">
+  <w:style w:type="table" w:styleId="Tramemoyenne2">
     <w:name w:val="Medium Shading 2"/>
-    <w:basedOn w:val="TableNormal"/>
+    <w:basedOn w:val="TableauNormal"/>
     <w:uiPriority w:val="64"/>
     <w:rsid w:val="00CB0664"/>
     <w:pPr>
@@ -5384,9 +6079,9 @@
       </w:tcPr>
     </w:tblStylePr>
   </w:style>
-  <w:style w:type="table" w:styleId="MediumShading2-Accent1">
+  <w:style w:type="table" w:styleId="Tramemoyenne2-Accent1">
     <w:name w:val="Medium Shading 2 Accent 1"/>
-    <w:basedOn w:val="TableNormal"/>
+    <w:basedOn w:val="TableauNormal"/>
     <w:uiPriority w:val="64"/>
     <w:rsid w:val="00CB0664"/>
     <w:pPr>
@@ -5526,9 +6221,9 @@
       </w:tcPr>
     </w:tblStylePr>
   </w:style>
-  <w:style w:type="table" w:styleId="MediumShading2-Accent2">
+  <w:style w:type="table" w:styleId="Tramemoyenne2-Accent2">
     <w:name w:val="Medium Shading 2 Accent 2"/>
-    <w:basedOn w:val="TableNormal"/>
+    <w:basedOn w:val="TableauNormal"/>
     <w:uiPriority w:val="64"/>
     <w:rsid w:val="00CB0664"/>
     <w:pPr>
@@ -5668,9 +6363,9 @@
       </w:tcPr>
     </w:tblStylePr>
   </w:style>
-  <w:style w:type="table" w:styleId="MediumShading2-Accent3">
+  <w:style w:type="table" w:styleId="Tramemoyenne2-Accent3">
     <w:name w:val="Medium Shading 2 Accent 3"/>
-    <w:basedOn w:val="TableNormal"/>
+    <w:basedOn w:val="TableauNormal"/>
     <w:uiPriority w:val="64"/>
     <w:rsid w:val="00CB0664"/>
     <w:pPr>
@@ -5810,9 +6505,9 @@
       </w:tcPr>
     </w:tblStylePr>
   </w:style>
-  <w:style w:type="table" w:styleId="MediumShading2-Accent4">
+  <w:style w:type="table" w:styleId="Tramemoyenne2-Accent4">
     <w:name w:val="Medium Shading 2 Accent 4"/>
-    <w:basedOn w:val="TableNormal"/>
+    <w:basedOn w:val="TableauNormal"/>
     <w:uiPriority w:val="64"/>
     <w:rsid w:val="00CB0664"/>
     <w:pPr>
@@ -5952,9 +6647,9 @@
       </w:tcPr>
     </w:tblStylePr>
   </w:style>
-  <w:style w:type="table" w:styleId="MediumShading2-Accent5">
+  <w:style w:type="table" w:styleId="Tramemoyenne2-Accent5">
     <w:name w:val="Medium Shading 2 Accent 5"/>
-    <w:basedOn w:val="TableNormal"/>
+    <w:basedOn w:val="TableauNormal"/>
     <w:uiPriority w:val="64"/>
     <w:rsid w:val="00CB0664"/>
     <w:pPr>
@@ -6094,9 +6789,9 @@
       </w:tcPr>
     </w:tblStylePr>
   </w:style>
-  <w:style w:type="table" w:styleId="MediumShading2-Accent6">
+  <w:style w:type="table" w:styleId="Tramemoyenne2-Accent6">
     <w:name w:val="Medium Shading 2 Accent 6"/>
-    <w:basedOn w:val="TableNormal"/>
+    <w:basedOn w:val="TableauNormal"/>
     <w:uiPriority w:val="64"/>
     <w:rsid w:val="00CB0664"/>
     <w:pPr>
@@ -6236,9 +6931,9 @@
       </w:tcPr>
     </w:tblStylePr>
   </w:style>
-  <w:style w:type="table" w:styleId="MediumList1">
+  <w:style w:type="table" w:styleId="Listemoyenne1">
     <w:name w:val="Medium List 1"/>
-    <w:basedOn w:val="TableNormal"/>
+    <w:basedOn w:val="TableauNormal"/>
     <w:uiPriority w:val="65"/>
     <w:rsid w:val="00CB0664"/>
     <w:pPr>
@@ -6313,9 +7008,9 @@
       </w:tcPr>
     </w:tblStylePr>
   </w:style>
-  <w:style w:type="table" w:styleId="MediumList1-Accent1">
+  <w:style w:type="table" w:styleId="Listemoyenne1-Accent1">
     <w:name w:val="Medium List 1 Accent 1"/>
-    <w:basedOn w:val="TableNormal"/>
+    <w:basedOn w:val="TableauNormal"/>
     <w:uiPriority w:val="65"/>
     <w:rsid w:val="00CB0664"/>
     <w:pPr>
@@ -6390,9 +7085,9 @@
       </w:tcPr>
     </w:tblStylePr>
   </w:style>
-  <w:style w:type="table" w:styleId="MediumList1-Accent2">
+  <w:style w:type="table" w:styleId="Listemoyenne1-Accent2">
     <w:name w:val="Medium List 1 Accent 2"/>
-    <w:basedOn w:val="TableNormal"/>
+    <w:basedOn w:val="TableauNormal"/>
     <w:uiPriority w:val="65"/>
     <w:rsid w:val="00CB0664"/>
     <w:pPr>
@@ -6467,9 +7162,9 @@
       </w:tcPr>
     </w:tblStylePr>
   </w:style>
-  <w:style w:type="table" w:styleId="MediumList1-Accent3">
+  <w:style w:type="table" w:styleId="Listemoyenne1-Accent3">
     <w:name w:val="Medium List 1 Accent 3"/>
-    <w:basedOn w:val="TableNormal"/>
+    <w:basedOn w:val="TableauNormal"/>
     <w:uiPriority w:val="65"/>
     <w:rsid w:val="00CB0664"/>
     <w:pPr>
@@ -6544,9 +7239,9 @@
       </w:tcPr>
     </w:tblStylePr>
   </w:style>
-  <w:style w:type="table" w:styleId="MediumList1-Accent4">
+  <w:style w:type="table" w:styleId="Listemoyenne1-Accent4">
     <w:name w:val="Medium List 1 Accent 4"/>
-    <w:basedOn w:val="TableNormal"/>
+    <w:basedOn w:val="TableauNormal"/>
     <w:uiPriority w:val="65"/>
     <w:rsid w:val="00CB0664"/>
     <w:pPr>
@@ -6621,9 +7316,9 @@
       </w:tcPr>
     </w:tblStylePr>
   </w:style>
-  <w:style w:type="table" w:styleId="MediumList1-Accent5">
+  <w:style w:type="table" w:styleId="Listemoyenne1-Accent5">
     <w:name w:val="Medium List 1 Accent 5"/>
-    <w:basedOn w:val="TableNormal"/>
+    <w:basedOn w:val="TableauNormal"/>
     <w:uiPriority w:val="65"/>
     <w:rsid w:val="00CB0664"/>
     <w:pPr>
@@ -6698,9 +7393,9 @@
       </w:tcPr>
     </w:tblStylePr>
   </w:style>
-  <w:style w:type="table" w:styleId="MediumList1-Accent6">
+  <w:style w:type="table" w:styleId="Listemoyenne1-Accent6">
     <w:name w:val="Medium List 1 Accent 6"/>
-    <w:basedOn w:val="TableNormal"/>
+    <w:basedOn w:val="TableauNormal"/>
     <w:uiPriority w:val="65"/>
     <w:rsid w:val="00CB0664"/>
     <w:pPr>
@@ -6775,9 +7470,9 @@
       </w:tcPr>
     </w:tblStylePr>
   </w:style>
-  <w:style w:type="table" w:styleId="MediumList2">
+  <w:style w:type="table" w:styleId="Listemoyenne2">
     <w:name w:val="Medium List 2"/>
-    <w:basedOn w:val="TableNormal"/>
+    <w:basedOn w:val="TableauNormal"/>
     <w:uiPriority w:val="66"/>
     <w:rsid w:val="00CB0664"/>
     <w:pPr>
@@ -6896,9 +7591,9 @@
       </w:tcPr>
     </w:tblStylePr>
   </w:style>
-  <w:style w:type="table" w:styleId="MediumList2-Accent1">
+  <w:style w:type="table" w:styleId="Listemoyenne2-Accent1">
     <w:name w:val="Medium List 2 Accent 1"/>
-    <w:basedOn w:val="TableNormal"/>
+    <w:basedOn w:val="TableauNormal"/>
     <w:uiPriority w:val="66"/>
     <w:rsid w:val="00CB0664"/>
     <w:pPr>
@@ -7017,9 +7712,9 @@
       </w:tcPr>
     </w:tblStylePr>
   </w:style>
-  <w:style w:type="table" w:styleId="MediumList2-Accent2">
+  <w:style w:type="table" w:styleId="Listemoyenne2-Accent2">
     <w:name w:val="Medium List 2 Accent 2"/>
-    <w:basedOn w:val="TableNormal"/>
+    <w:basedOn w:val="TableauNormal"/>
     <w:uiPriority w:val="66"/>
     <w:rsid w:val="00CB0664"/>
     <w:pPr>
@@ -7138,9 +7833,9 @@
       </w:tcPr>
     </w:tblStylePr>
   </w:style>
-  <w:style w:type="table" w:styleId="MediumList2-Accent3">
+  <w:style w:type="table" w:styleId="Listemoyenne2-Accent3">
     <w:name w:val="Medium List 2 Accent 3"/>
-    <w:basedOn w:val="TableNormal"/>
+    <w:basedOn w:val="TableauNormal"/>
     <w:uiPriority w:val="66"/>
     <w:rsid w:val="00CB0664"/>
     <w:pPr>
@@ -7259,9 +7954,9 @@
       </w:tcPr>
     </w:tblStylePr>
   </w:style>
-  <w:style w:type="table" w:styleId="MediumList2-Accent4">
+  <w:style w:type="table" w:styleId="Listemoyenne2-Accent4">
     <w:name w:val="Medium List 2 Accent 4"/>
-    <w:basedOn w:val="TableNormal"/>
+    <w:basedOn w:val="TableauNormal"/>
     <w:uiPriority w:val="66"/>
     <w:rsid w:val="00CB0664"/>
     <w:pPr>
@@ -7380,9 +8075,9 @@
       </w:tcPr>
     </w:tblStylePr>
   </w:style>
-  <w:style w:type="table" w:styleId="MediumList2-Accent5">
+  <w:style w:type="table" w:styleId="Listemoyenne2-Accent5">
     <w:name w:val="Medium List 2 Accent 5"/>
-    <w:basedOn w:val="TableNormal"/>
+    <w:basedOn w:val="TableauNormal"/>
     <w:uiPriority w:val="66"/>
     <w:rsid w:val="00CB0664"/>
     <w:pPr>
@@ -7501,9 +8196,9 @@
       </w:tcPr>
     </w:tblStylePr>
   </w:style>
-  <w:style w:type="table" w:styleId="MediumList2-Accent6">
+  <w:style w:type="table" w:styleId="Listemoyenne2-Accent6">
     <w:name w:val="Medium List 2 Accent 6"/>
-    <w:basedOn w:val="TableNormal"/>
+    <w:basedOn w:val="TableauNormal"/>
     <w:uiPriority w:val="66"/>
     <w:rsid w:val="00CB0664"/>
     <w:pPr>
@@ -7622,9 +8317,9 @@
       </w:tcPr>
     </w:tblStylePr>
   </w:style>
-  <w:style w:type="table" w:styleId="MediumGrid1">
+  <w:style w:type="table" w:styleId="Grillemoyenne1">
     <w:name w:val="Medium Grid 1"/>
-    <w:basedOn w:val="TableNormal"/>
+    <w:basedOn w:val="TableauNormal"/>
     <w:uiPriority w:val="67"/>
     <w:rsid w:val="00CB0664"/>
     <w:pPr>
@@ -7688,9 +8383,9 @@
       </w:tcPr>
     </w:tblStylePr>
   </w:style>
-  <w:style w:type="table" w:styleId="MediumGrid1-Accent1">
+  <w:style w:type="table" w:styleId="Grillemoyenne1-Accent1">
     <w:name w:val="Medium Grid 1 Accent 1"/>
-    <w:basedOn w:val="TableNormal"/>
+    <w:basedOn w:val="TableauNormal"/>
     <w:uiPriority w:val="67"/>
     <w:rsid w:val="00CB0664"/>
     <w:pPr>
@@ -7754,9 +8449,9 @@
       </w:tcPr>
     </w:tblStylePr>
   </w:style>
-  <w:style w:type="table" w:styleId="MediumGrid1-Accent2">
+  <w:style w:type="table" w:styleId="Grillemoyenne1-Accent2">
     <w:name w:val="Medium Grid 1 Accent 2"/>
-    <w:basedOn w:val="TableNormal"/>
+    <w:basedOn w:val="TableauNormal"/>
     <w:uiPriority w:val="67"/>
     <w:rsid w:val="00CB0664"/>
     <w:pPr>
@@ -7820,9 +8515,9 @@
       </w:tcPr>
     </w:tblStylePr>
   </w:style>
-  <w:style w:type="table" w:styleId="MediumGrid1-Accent3">
+  <w:style w:type="table" w:styleId="Grillemoyenne1-Accent3">
     <w:name w:val="Medium Grid 1 Accent 3"/>
-    <w:basedOn w:val="TableNormal"/>
+    <w:basedOn w:val="TableauNormal"/>
     <w:uiPriority w:val="67"/>
     <w:rsid w:val="00CB0664"/>
     <w:pPr>
@@ -7886,9 +8581,9 @@
       </w:tcPr>
     </w:tblStylePr>
   </w:style>
-  <w:style w:type="table" w:styleId="MediumGrid1-Accent4">
+  <w:style w:type="table" w:styleId="Grillemoyenne1-Accent4">
     <w:name w:val="Medium Grid 1 Accent 4"/>
-    <w:basedOn w:val="TableNormal"/>
+    <w:basedOn w:val="TableauNormal"/>
     <w:uiPriority w:val="67"/>
     <w:rsid w:val="00CB0664"/>
     <w:pPr>
@@ -7952,9 +8647,9 @@
       </w:tcPr>
     </w:tblStylePr>
   </w:style>
-  <w:style w:type="table" w:styleId="MediumGrid1-Accent5">
+  <w:style w:type="table" w:styleId="Grillemoyenne1-Accent5">
     <w:name w:val="Medium Grid 1 Accent 5"/>
-    <w:basedOn w:val="TableNormal"/>
+    <w:basedOn w:val="TableauNormal"/>
     <w:uiPriority w:val="67"/>
     <w:rsid w:val="00CB0664"/>
     <w:pPr>
@@ -8018,9 +8713,9 @@
       </w:tcPr>
     </w:tblStylePr>
   </w:style>
-  <w:style w:type="table" w:styleId="MediumGrid1-Accent6">
+  <w:style w:type="table" w:styleId="Grillemoyenne1-Accent6">
     <w:name w:val="Medium Grid 1 Accent 6"/>
-    <w:basedOn w:val="TableNormal"/>
+    <w:basedOn w:val="TableauNormal"/>
     <w:uiPriority w:val="67"/>
     <w:rsid w:val="00CB0664"/>
     <w:pPr>
@@ -8084,9 +8779,9 @@
       </w:tcPr>
     </w:tblStylePr>
   </w:style>
-  <w:style w:type="table" w:styleId="MediumGrid2">
+  <w:style w:type="table" w:styleId="Grillemoyenne2">
     <w:name w:val="Medium Grid 2"/>
-    <w:basedOn w:val="TableNormal"/>
+    <w:basedOn w:val="TableauNormal"/>
     <w:uiPriority w:val="68"/>
     <w:rsid w:val="00CB0664"/>
     <w:pPr>
@@ -8202,9 +8897,9 @@
       </w:tcPr>
     </w:tblStylePr>
   </w:style>
-  <w:style w:type="table" w:styleId="MediumGrid2-Accent1">
+  <w:style w:type="table" w:styleId="Grillemoyenne2-Accent1">
     <w:name w:val="Medium Grid 2 Accent 1"/>
-    <w:basedOn w:val="TableNormal"/>
+    <w:basedOn w:val="TableauNormal"/>
     <w:uiPriority w:val="68"/>
     <w:rsid w:val="00CB0664"/>
     <w:pPr>
@@ -8320,9 +9015,9 @@
       </w:tcPr>
     </w:tblStylePr>
   </w:style>
-  <w:style w:type="table" w:styleId="MediumGrid2-Accent2">
+  <w:style w:type="table" w:styleId="Grillemoyenne2-Accent2">
     <w:name w:val="Medium Grid 2 Accent 2"/>
-    <w:basedOn w:val="TableNormal"/>
+    <w:basedOn w:val="TableauNormal"/>
     <w:uiPriority w:val="68"/>
     <w:rsid w:val="00CB0664"/>
     <w:pPr>
@@ -8438,9 +9133,9 @@
       </w:tcPr>
     </w:tblStylePr>
   </w:style>
-  <w:style w:type="table" w:styleId="MediumGrid2-Accent3">
+  <w:style w:type="table" w:styleId="Grillemoyenne2-Accent3">
     <w:name w:val="Medium Grid 2 Accent 3"/>
-    <w:basedOn w:val="TableNormal"/>
+    <w:basedOn w:val="TableauNormal"/>
     <w:uiPriority w:val="68"/>
     <w:rsid w:val="00CB0664"/>
     <w:pPr>
@@ -8556,9 +9251,9 @@
       </w:tcPr>
     </w:tblStylePr>
   </w:style>
-  <w:style w:type="table" w:styleId="MediumGrid2-Accent4">
+  <w:style w:type="table" w:styleId="Grillemoyenne2-Accent4">
     <w:name w:val="Medium Grid 2 Accent 4"/>
-    <w:basedOn w:val="TableNormal"/>
+    <w:basedOn w:val="TableauNormal"/>
     <w:uiPriority w:val="68"/>
     <w:rsid w:val="00CB0664"/>
     <w:pPr>
@@ -8674,9 +9369,9 @@
       </w:tcPr>
     </w:tblStylePr>
   </w:style>
-  <w:style w:type="table" w:styleId="MediumGrid2-Accent5">
+  <w:style w:type="table" w:styleId="Grillemoyenne2-Accent5">
     <w:name w:val="Medium Grid 2 Accent 5"/>
-    <w:basedOn w:val="TableNormal"/>
+    <w:basedOn w:val="TableauNormal"/>
     <w:uiPriority w:val="68"/>
     <w:rsid w:val="00CB0664"/>
     <w:pPr>
@@ -8792,9 +9487,9 @@
       </w:tcPr>
     </w:tblStylePr>
   </w:style>
-  <w:style w:type="table" w:styleId="MediumGrid2-Accent6">
+  <w:style w:type="table" w:styleId="Grillemoyenne2-Accent6">
     <w:name w:val="Medium Grid 2 Accent 6"/>
-    <w:basedOn w:val="TableNormal"/>
+    <w:basedOn w:val="TableauNormal"/>
     <w:uiPriority w:val="68"/>
     <w:rsid w:val="00CB0664"/>
     <w:pPr>
@@ -8910,9 +9605,9 @@
       </w:tcPr>
     </w:tblStylePr>
   </w:style>
-  <w:style w:type="table" w:styleId="MediumGrid3">
+  <w:style w:type="table" w:styleId="Grillemoyenne3">
     <w:name w:val="Medium Grid 3"/>
-    <w:basedOn w:val="TableNormal"/>
+    <w:basedOn w:val="TableauNormal"/>
     <w:uiPriority w:val="69"/>
     <w:rsid w:val="00CB0664"/>
     <w:pPr>
@@ -9044,9 +9739,9 @@
       </w:tcPr>
     </w:tblStylePr>
   </w:style>
-  <w:style w:type="table" w:styleId="MediumGrid3-Accent1">
+  <w:style w:type="table" w:styleId="Grillemoyenne3-Accent1">
     <w:name w:val="Medium Grid 3 Accent 1"/>
-    <w:basedOn w:val="TableNormal"/>
+    <w:basedOn w:val="TableauNormal"/>
     <w:uiPriority w:val="69"/>
     <w:rsid w:val="00CB0664"/>
     <w:pPr>
@@ -9178,9 +9873,9 @@
       </w:tcPr>
     </w:tblStylePr>
   </w:style>
-  <w:style w:type="table" w:styleId="MediumGrid3-Accent2">
+  <w:style w:type="table" w:styleId="Grillemoyenne3-Accent2">
     <w:name w:val="Medium Grid 3 Accent 2"/>
-    <w:basedOn w:val="TableNormal"/>
+    <w:basedOn w:val="TableauNormal"/>
     <w:uiPriority w:val="69"/>
     <w:rsid w:val="00CB0664"/>
     <w:pPr>
@@ -9312,9 +10007,9 @@
       </w:tcPr>
     </w:tblStylePr>
   </w:style>
-  <w:style w:type="table" w:styleId="MediumGrid3-Accent3">
+  <w:style w:type="table" w:styleId="Grillemoyenne3-Accent3">
     <w:name w:val="Medium Grid 3 Accent 3"/>
-    <w:basedOn w:val="TableNormal"/>
+    <w:basedOn w:val="TableauNormal"/>
     <w:uiPriority w:val="69"/>
     <w:rsid w:val="00CB0664"/>
     <w:pPr>
@@ -9446,9 +10141,9 @@
       </w:tcPr>
     </w:tblStylePr>
   </w:style>
-  <w:style w:type="table" w:styleId="MediumGrid3-Accent4">
+  <w:style w:type="table" w:styleId="Grillemoyenne3-Accent4">
     <w:name w:val="Medium Grid 3 Accent 4"/>
-    <w:basedOn w:val="TableNormal"/>
+    <w:basedOn w:val="TableauNormal"/>
     <w:uiPriority w:val="69"/>
     <w:rsid w:val="00CB0664"/>
     <w:pPr>
@@ -9580,9 +10275,9 @@
       </w:tcPr>
     </w:tblStylePr>
   </w:style>
-  <w:style w:type="table" w:styleId="MediumGrid3-Accent5">
+  <w:style w:type="table" w:styleId="Grillemoyenne3-Accent5">
     <w:name w:val="Medium Grid 3 Accent 5"/>
-    <w:basedOn w:val="TableNormal"/>
+    <w:basedOn w:val="TableauNormal"/>
     <w:uiPriority w:val="69"/>
     <w:rsid w:val="00CB0664"/>
     <w:pPr>
@@ -9714,9 +10409,9 @@
       </w:tcPr>
     </w:tblStylePr>
   </w:style>
-  <w:style w:type="table" w:styleId="MediumGrid3-Accent6">
+  <w:style w:type="table" w:styleId="Grillemoyenne3-Accent6">
     <w:name w:val="Medium Grid 3 Accent 6"/>
-    <w:basedOn w:val="TableNormal"/>
+    <w:basedOn w:val="TableauNormal"/>
     <w:uiPriority w:val="69"/>
     <w:rsid w:val="00CB0664"/>
     <w:pPr>
@@ -9848,9 +10543,9 @@
       </w:tcPr>
     </w:tblStylePr>
   </w:style>
-  <w:style w:type="table" w:styleId="DarkList">
+  <w:style w:type="table" w:styleId="Listefonce">
     <w:name w:val="Dark List"/>
-    <w:basedOn w:val="TableNormal"/>
+    <w:basedOn w:val="TableauNormal"/>
     <w:uiPriority w:val="70"/>
     <w:rsid w:val="00CB0664"/>
     <w:pPr>
@@ -9955,9 +10650,9 @@
       </w:tcPr>
     </w:tblStylePr>
   </w:style>
-  <w:style w:type="table" w:styleId="DarkList-Accent1">
+  <w:style w:type="table" w:styleId="Listefonce-Accent1">
     <w:name w:val="Dark List Accent 1"/>
-    <w:basedOn w:val="TableNormal"/>
+    <w:basedOn w:val="TableauNormal"/>
     <w:uiPriority w:val="70"/>
     <w:rsid w:val="00CB0664"/>
     <w:pPr>
@@ -10062,9 +10757,9 @@
       </w:tcPr>
     </w:tblStylePr>
   </w:style>
-  <w:style w:type="table" w:styleId="DarkList-Accent2">
+  <w:style w:type="table" w:styleId="Listefonce-Accent2">
     <w:name w:val="Dark List Accent 2"/>
-    <w:basedOn w:val="TableNormal"/>
+    <w:basedOn w:val="TableauNormal"/>
     <w:uiPriority w:val="70"/>
     <w:rsid w:val="00CB0664"/>
     <w:pPr>
@@ -10169,9 +10864,9 @@
       </w:tcPr>
     </w:tblStylePr>
   </w:style>
-  <w:style w:type="table" w:styleId="DarkList-Accent3">
+  <w:style w:type="table" w:styleId="Listefonce-Accent3">
     <w:name w:val="Dark List Accent 3"/>
-    <w:basedOn w:val="TableNormal"/>
+    <w:basedOn w:val="TableauNormal"/>
     <w:uiPriority w:val="70"/>
     <w:rsid w:val="00CB0664"/>
     <w:pPr>
@@ -10276,9 +10971,9 @@
       </w:tcPr>
     </w:tblStylePr>
   </w:style>
-  <w:style w:type="table" w:styleId="DarkList-Accent4">
+  <w:style w:type="table" w:styleId="Listefonce-Accent4">
     <w:name w:val="Dark List Accent 4"/>
-    <w:basedOn w:val="TableNormal"/>
+    <w:basedOn w:val="TableauNormal"/>
     <w:uiPriority w:val="70"/>
     <w:rsid w:val="00CB0664"/>
     <w:pPr>
@@ -10383,9 +11078,9 @@
       </w:tcPr>
     </w:tblStylePr>
   </w:style>
-  <w:style w:type="table" w:styleId="DarkList-Accent5">
+  <w:style w:type="table" w:styleId="Listefonce-Accent5">
     <w:name w:val="Dark List Accent 5"/>
-    <w:basedOn w:val="TableNormal"/>
+    <w:basedOn w:val="TableauNormal"/>
     <w:uiPriority w:val="70"/>
     <w:rsid w:val="00CB0664"/>
     <w:pPr>
@@ -10490,9 +11185,9 @@
       </w:tcPr>
     </w:tblStylePr>
   </w:style>
-  <w:style w:type="table" w:styleId="DarkList-Accent6">
+  <w:style w:type="table" w:styleId="Listefonce-Accent6">
     <w:name w:val="Dark List Accent 6"/>
-    <w:basedOn w:val="TableNormal"/>
+    <w:basedOn w:val="TableauNormal"/>
     <w:uiPriority w:val="70"/>
     <w:rsid w:val="00CB0664"/>
     <w:pPr>
@@ -10597,9 +11292,9 @@
       </w:tcPr>
     </w:tblStylePr>
   </w:style>
-  <w:style w:type="table" w:styleId="ColorfulShading">
+  <w:style w:type="table" w:styleId="Tramecouleur">
     <w:name w:val="Colorful Shading"/>
-    <w:basedOn w:val="TableNormal"/>
+    <w:basedOn w:val="TableauNormal"/>
     <w:uiPriority w:val="71"/>
     <w:rsid w:val="00CB0664"/>
     <w:pPr>
@@ -10712,9 +11407,9 @@
       </w:rPr>
     </w:tblStylePr>
   </w:style>
-  <w:style w:type="table" w:styleId="ColorfulShading-Accent1">
+  <w:style w:type="table" w:styleId="Tramecouleur-Accent1">
     <w:name w:val="Colorful Shading Accent 1"/>
-    <w:basedOn w:val="TableNormal"/>
+    <w:basedOn w:val="TableauNormal"/>
     <w:uiPriority w:val="71"/>
     <w:rsid w:val="00CB0664"/>
     <w:pPr>
@@ -10827,9 +11522,9 @@
       </w:rPr>
     </w:tblStylePr>
   </w:style>
-  <w:style w:type="table" w:styleId="ColorfulShading-Accent2">
+  <w:style w:type="table" w:styleId="Tramecouleur-Accent2">
     <w:name w:val="Colorful Shading Accent 2"/>
-    <w:basedOn w:val="TableNormal"/>
+    <w:basedOn w:val="TableauNormal"/>
     <w:uiPriority w:val="71"/>
     <w:rsid w:val="00CB0664"/>
     <w:pPr>
@@ -10942,9 +11637,9 @@
       </w:rPr>
     </w:tblStylePr>
   </w:style>
-  <w:style w:type="table" w:styleId="ColorfulShading-Accent3">
+  <w:style w:type="table" w:styleId="Tramecouleur-Accent3">
     <w:name w:val="Colorful Shading Accent 3"/>
-    <w:basedOn w:val="TableNormal"/>
+    <w:basedOn w:val="TableauNormal"/>
     <w:uiPriority w:val="71"/>
     <w:rsid w:val="00CB0664"/>
     <w:pPr>
@@ -11047,9 +11742,9 @@
       </w:tcPr>
     </w:tblStylePr>
   </w:style>
-  <w:style w:type="table" w:styleId="ColorfulShading-Accent4">
+  <w:style w:type="table" w:styleId="Tramecouleur-Accent4">
     <w:name w:val="Colorful Shading Accent 4"/>
-    <w:basedOn w:val="TableNormal"/>
+    <w:basedOn w:val="TableauNormal"/>
     <w:uiPriority w:val="71"/>
     <w:rsid w:val="00CB0664"/>
     <w:pPr>
@@ -11162,9 +11857,9 @@
       </w:rPr>
     </w:tblStylePr>
   </w:style>
-  <w:style w:type="table" w:styleId="ColorfulShading-Accent5">
+  <w:style w:type="table" w:styleId="Tramecouleur-Accent5">
     <w:name w:val="Colorful Shading Accent 5"/>
-    <w:basedOn w:val="TableNormal"/>
+    <w:basedOn w:val="TableauNormal"/>
     <w:uiPriority w:val="71"/>
     <w:rsid w:val="00CB0664"/>
     <w:pPr>
@@ -11277,9 +11972,9 @@
       </w:rPr>
     </w:tblStylePr>
   </w:style>
-  <w:style w:type="table" w:styleId="ColorfulShading-Accent6">
+  <w:style w:type="table" w:styleId="Tramecouleur-Accent6">
     <w:name w:val="Colorful Shading Accent 6"/>
-    <w:basedOn w:val="TableNormal"/>
+    <w:basedOn w:val="TableauNormal"/>
     <w:uiPriority w:val="71"/>
     <w:rsid w:val="00CB0664"/>
     <w:pPr>
@@ -11392,9 +12087,9 @@
       </w:rPr>
     </w:tblStylePr>
   </w:style>
-  <w:style w:type="table" w:styleId="ColorfulList">
+  <w:style w:type="table" w:styleId="Listecouleur">
     <w:name w:val="Colorful List"/>
-    <w:basedOn w:val="TableNormal"/>
+    <w:basedOn w:val="TableauNormal"/>
     <w:uiPriority w:val="72"/>
     <w:rsid w:val="00CB0664"/>
     <w:pPr>
@@ -11471,9 +12166,9 @@
       </w:tcPr>
     </w:tblStylePr>
   </w:style>
-  <w:style w:type="table" w:styleId="ColorfulList-Accent1">
+  <w:style w:type="table" w:styleId="Listecouleur-Accent1">
     <w:name w:val="Colorful List Accent 1"/>
-    <w:basedOn w:val="TableNormal"/>
+    <w:basedOn w:val="TableauNormal"/>
     <w:uiPriority w:val="72"/>
     <w:rsid w:val="00CB0664"/>
     <w:pPr>
@@ -11550,9 +12245,9 @@
       </w:tcPr>
     </w:tblStylePr>
   </w:style>
-  <w:style w:type="table" w:styleId="ColorfulList-Accent2">
+  <w:style w:type="table" w:styleId="Listecouleur-Accent2">
     <w:name w:val="Colorful List Accent 2"/>
-    <w:basedOn w:val="TableNormal"/>
+    <w:basedOn w:val="TableauNormal"/>
     <w:uiPriority w:val="72"/>
     <w:rsid w:val="00CB0664"/>
     <w:pPr>
@@ -11629,9 +12324,9 @@
       </w:tcPr>
     </w:tblStylePr>
   </w:style>
-  <w:style w:type="table" w:styleId="ColorfulList-Accent3">
+  <w:style w:type="table" w:styleId="Listecouleur-Accent3">
     <w:name w:val="Colorful List Accent 3"/>
-    <w:basedOn w:val="TableNormal"/>
+    <w:basedOn w:val="TableauNormal"/>
     <w:uiPriority w:val="72"/>
     <w:rsid w:val="00CB0664"/>
     <w:pPr>
@@ -11708,9 +12403,9 @@
       </w:tcPr>
     </w:tblStylePr>
   </w:style>
-  <w:style w:type="table" w:styleId="ColorfulList-Accent4">
+  <w:style w:type="table" w:styleId="Listecouleur-Accent4">
     <w:name w:val="Colorful List Accent 4"/>
-    <w:basedOn w:val="TableNormal"/>
+    <w:basedOn w:val="TableauNormal"/>
     <w:uiPriority w:val="72"/>
     <w:rsid w:val="00CB0664"/>
     <w:pPr>
@@ -11787,9 +12482,9 @@
       </w:tcPr>
     </w:tblStylePr>
   </w:style>
-  <w:style w:type="table" w:styleId="ColorfulList-Accent5">
+  <w:style w:type="table" w:styleId="Listecouleur-Accent5">
     <w:name w:val="Colorful List Accent 5"/>
-    <w:basedOn w:val="TableNormal"/>
+    <w:basedOn w:val="TableauNormal"/>
     <w:uiPriority w:val="72"/>
     <w:rsid w:val="00CB0664"/>
     <w:pPr>
@@ -11866,9 +12561,9 @@
       </w:tcPr>
     </w:tblStylePr>
   </w:style>
-  <w:style w:type="table" w:styleId="ColorfulList-Accent6">
+  <w:style w:type="table" w:styleId="Listecouleur-Accent6">
     <w:name w:val="Colorful List Accent 6"/>
-    <w:basedOn w:val="TableNormal"/>
+    <w:basedOn w:val="TableauNormal"/>
     <w:uiPriority w:val="72"/>
     <w:rsid w:val="00CB0664"/>
     <w:pPr>
@@ -11945,9 +12640,9 @@
       </w:tcPr>
     </w:tblStylePr>
   </w:style>
-  <w:style w:type="table" w:styleId="ColorfulGrid">
+  <w:style w:type="table" w:styleId="Grillecouleur">
     <w:name w:val="Colorful Grid"/>
-    <w:basedOn w:val="TableNormal"/>
+    <w:basedOn w:val="TableauNormal"/>
     <w:uiPriority w:val="73"/>
     <w:rsid w:val="00CB0664"/>
     <w:pPr>
@@ -12018,9 +12713,9 @@
       </w:tcPr>
     </w:tblStylePr>
   </w:style>
-  <w:style w:type="table" w:styleId="ColorfulGrid-Accent1">
+  <w:style w:type="table" w:styleId="Grillecouleur-Accent1">
     <w:name w:val="Colorful Grid Accent 1"/>
-    <w:basedOn w:val="TableNormal"/>
+    <w:basedOn w:val="TableauNormal"/>
     <w:uiPriority w:val="73"/>
     <w:rsid w:val="00CB0664"/>
     <w:pPr>
@@ -12091,9 +12786,9 @@
       </w:tcPr>
     </w:tblStylePr>
   </w:style>
-  <w:style w:type="table" w:styleId="ColorfulGrid-Accent2">
+  <w:style w:type="table" w:styleId="Grillecouleur-Accent2">
     <w:name w:val="Colorful Grid Accent 2"/>
-    <w:basedOn w:val="TableNormal"/>
+    <w:basedOn w:val="TableauNormal"/>
     <w:uiPriority w:val="73"/>
     <w:rsid w:val="00CB0664"/>
     <w:pPr>
@@ -12164,9 +12859,9 @@
       </w:tcPr>
     </w:tblStylePr>
   </w:style>
-  <w:style w:type="table" w:styleId="ColorfulGrid-Accent3">
+  <w:style w:type="table" w:styleId="Grillecouleur-Accent3">
     <w:name w:val="Colorful Grid Accent 3"/>
-    <w:basedOn w:val="TableNormal"/>
+    <w:basedOn w:val="TableauNormal"/>
     <w:uiPriority w:val="73"/>
     <w:rsid w:val="00CB0664"/>
     <w:pPr>
@@ -12237,9 +12932,9 @@
       </w:tcPr>
     </w:tblStylePr>
   </w:style>
-  <w:style w:type="table" w:styleId="ColorfulGrid-Accent4">
+  <w:style w:type="table" w:styleId="Grillecouleur-Accent4">
     <w:name w:val="Colorful Grid Accent 4"/>
-    <w:basedOn w:val="TableNormal"/>
+    <w:basedOn w:val="TableauNormal"/>
     <w:uiPriority w:val="73"/>
     <w:rsid w:val="00CB0664"/>
     <w:pPr>
@@ -12310,9 +13005,9 @@
       </w:tcPr>
     </w:tblStylePr>
   </w:style>
-  <w:style w:type="table" w:styleId="ColorfulGrid-Accent5">
+  <w:style w:type="table" w:styleId="Grillecouleur-Accent5">
     <w:name w:val="Colorful Grid Accent 5"/>
-    <w:basedOn w:val="TableNormal"/>
+    <w:basedOn w:val="TableauNormal"/>
     <w:uiPriority w:val="73"/>
     <w:rsid w:val="00CB0664"/>
     <w:pPr>
@@ -12383,9 +13078,9 @@
       </w:tcPr>
     </w:tblStylePr>
   </w:style>
-  <w:style w:type="table" w:styleId="ColorfulGrid-Accent6">
+  <w:style w:type="table" w:styleId="Grillecouleur-Accent6">
     <w:name w:val="Colorful Grid Accent 6"/>
-    <w:basedOn w:val="TableNormal"/>
+    <w:basedOn w:val="TableauNormal"/>
     <w:uiPriority w:val="73"/>
     <w:rsid w:val="00CB0664"/>
     <w:pPr>
@@ -12474,7 +13169,7 @@
   </w:style>
   <w:style w:type="character" w:customStyle="1" w:styleId="Title2Car">
     <w:name w:val="Title 2 Car"/>
-    <w:basedOn w:val="DefaultParagraphFont"/>
+    <w:basedOn w:val="Policepardfaut"/>
     <w:link w:val="Title2"/>
     <w:rsid w:val="00741173"/>
     <w:rPr>
@@ -12498,7 +13193,7 @@
   </w:style>
   <w:style w:type="character" w:customStyle="1" w:styleId="BodyCar">
     <w:name w:val="Body Car"/>
-    <w:basedOn w:val="DefaultParagraphFont"/>
+    <w:basedOn w:val="Policepardfaut"/>
     <w:link w:val="Body"/>
     <w:rsid w:val="00741173"/>
     <w:rPr>

</xml_diff>

<commit_message>
small changes process book
</commit_message>
<xml_diff>
--- a/milestones/Steaming_Dev_Gossip_Design_Process_Book.docx
+++ b/milestones/Steaming_Dev_Gossip_Design_Process_Book.docx
@@ -17,6 +17,7 @@
           <w:rFonts w:ascii="TT Octosquares Trial" w:hAnsi="TT Octosquares Trial"/>
           <w:b/>
           <w:bCs/>
+          <w:noProof/>
           <w:color w:val="121214"/>
           <w:sz w:val="72"/>
           <w:szCs w:val="24"/>
@@ -79,7 +80,7 @@
         <w:rPr>
           <w:lang w:val="en-US"/>
         </w:rPr>
-        <w:t>PROJECT OVERVIEW</w:t>
+        <w:t>Project Overview</w:t>
       </w:r>
     </w:p>
     <w:p>
@@ -93,49 +94,33 @@
         <w:rPr>
           <w:lang w:val="en-US"/>
         </w:rPr>
-        <w:t xml:space="preserve">The video game industry has become one of the most competitive sectors of the entertainment world, with thousands of titles released every year across a wide range of genres and budgets. At the center of PC game distribution stands Steam, Valve's dominant digital storefront, where a game's performance can be decisive for its commercial success. Yet with such a massive and ever-growing catalog, identifying what truly sets successful games apart is far from straightforward, and developers often lack the tools to make sense of these complex patterns </w:t>
+        <w:t>The video game industry has become one of the most competitive sectors of the entertainment world, with thousands of titles released every year across a wide range of genres and budgets. At the center of PC game distribution stands Steam, Valve's dominant digital storefront, where a game's performance can be decisive for its commercial success. Yet with such a massive and ever-growing catalog, identifying what truly sets successful games apart is far from straightforward, and developers often lack the tools to make sense of these complex patterns at a glance.</w:t>
       </w:r>
-      <w:proofErr w:type="gramStart"/>
+    </w:p>
+    <w:p>
+      <w:pPr>
+        <w:pStyle w:val="Body"/>
+        <w:rPr>
+          <w:lang w:val="en-US"/>
+        </w:rPr>
+      </w:pPr>
       <w:r>
         <w:rPr>
           <w:lang w:val="en-US"/>
         </w:rPr>
-        <w:t>at a glance</w:t>
+        <w:t xml:space="preserve">Our project aims to help game developers and publishers to better understand what makes a game successful on the Steam platform. To do so, we have scrapped a large amount of data from the Steam store, and we have built a web application that allows </w:t>
       </w:r>
-      <w:proofErr w:type="gramEnd"/>
       <w:r>
         <w:rPr>
           <w:lang w:val="en-US"/>
         </w:rPr>
-        <w:t>.</w:t>
+        <w:t xml:space="preserve">us </w:t>
       </w:r>
-    </w:p>
-    <w:p>
-      <w:pPr>
-        <w:pStyle w:val="Body"/>
-        <w:rPr>
-          <w:lang w:val="en-US"/>
-        </w:rPr>
-      </w:pPr>
       <w:r>
         <w:rPr>
           <w:lang w:val="en-US"/>
         </w:rPr>
-        <w:t xml:space="preserve">Our project aims to help game developers and publishers to better understand what makes a game successful on the Steam platform. To do so, we have scrapped a large amount of data from the Steam store, and we have built a web application that </w:t>
-      </w:r>
-      <w:proofErr w:type="gramStart"/>
-      <w:r>
-        <w:rPr>
-          <w:lang w:val="en-US"/>
-        </w:rPr>
-        <w:t>allows</w:t>
-      </w:r>
-      <w:proofErr w:type="gramEnd"/>
-      <w:r>
-        <w:rPr>
-          <w:lang w:val="en-US"/>
-        </w:rPr>
-        <w:t xml:space="preserve"> to explore this dataset through several complementary visualizations. Users can inspect individual games and their attributes, explore top rankings across various categories, analyze relationships between multiple game attributes simultaneously through a parallel coordinates plot, </w:t>
+        <w:t xml:space="preserve">to explore this dataset through several complementary visualizations. Users can inspect individual games and their attributes, explore top rankings across various categories, analyze relationships between multiple game attributes simultaneously through a parallel coordinates plot, </w:t>
       </w:r>
       <w:r>
         <w:t>and observe how the number of releases per genre has evolved over time through an animated chart race, reflecting the shifting dynamics of the game market.</w:t>
@@ -197,85 +182,19 @@
         </w:rPr>
         <w:t>(</w:t>
       </w:r>
-      <w:proofErr w:type="spellStart"/>
       <w:r>
         <w:rPr>
           <w:color w:val="000000" w:themeColor="text1"/>
           <w:lang w:val="en-US"/>
         </w:rPr>
-        <w:t>parler</w:t>
+        <w:t xml:space="preserve">parler de </w:t>
       </w:r>
-      <w:proofErr w:type="spellEnd"/>
       <w:r>
         <w:rPr>
           <w:color w:val="000000" w:themeColor="text1"/>
           <w:lang w:val="en-US"/>
         </w:rPr>
-        <w:t xml:space="preserve"> de </w:t>
-      </w:r>
-      <w:proofErr w:type="spellStart"/>
-      <w:r>
-        <w:rPr>
-          <w:color w:val="000000" w:themeColor="text1"/>
-          <w:lang w:val="en-US"/>
-        </w:rPr>
-        <w:t>Mekisnoi</w:t>
-      </w:r>
-      <w:proofErr w:type="spellEnd"/>
-      <w:r>
-        <w:rPr>
-          <w:color w:val="000000" w:themeColor="text1"/>
-          <w:lang w:val="en-US"/>
-        </w:rPr>
-        <w:t xml:space="preserve"> pour </w:t>
-      </w:r>
-      <w:proofErr w:type="spellStart"/>
-      <w:r>
-        <w:rPr>
-          <w:color w:val="000000" w:themeColor="text1"/>
-          <w:lang w:val="en-US"/>
-        </w:rPr>
-        <w:t>montrer</w:t>
-      </w:r>
-      <w:proofErr w:type="spellEnd"/>
-      <w:r>
-        <w:rPr>
-          <w:color w:val="000000" w:themeColor="text1"/>
-          <w:lang w:val="en-US"/>
-        </w:rPr>
-        <w:t xml:space="preserve"> </w:t>
-      </w:r>
-      <w:proofErr w:type="spellStart"/>
-      <w:r>
-        <w:rPr>
-          <w:color w:val="000000" w:themeColor="text1"/>
-          <w:lang w:val="en-US"/>
-        </w:rPr>
-        <w:t>que</w:t>
-      </w:r>
-      <w:proofErr w:type="spellEnd"/>
-      <w:r>
-        <w:rPr>
-          <w:color w:val="000000" w:themeColor="text1"/>
-          <w:lang w:val="en-US"/>
-        </w:rPr>
-        <w:t xml:space="preserve"> </w:t>
-      </w:r>
-      <w:proofErr w:type="spellStart"/>
-      <w:r>
-        <w:rPr>
-          <w:color w:val="000000" w:themeColor="text1"/>
-          <w:lang w:val="en-US"/>
-        </w:rPr>
-        <w:t>c’est</w:t>
-      </w:r>
-      <w:proofErr w:type="spellEnd"/>
-      <w:r>
-        <w:rPr>
-          <w:color w:val="000000" w:themeColor="text1"/>
-          <w:lang w:val="en-US"/>
-        </w:rPr>
-        <w:t xml:space="preserve"> personnel)</w:t>
+        <w:t>Mekisnoi pour montrer que c’est personnel)</w:t>
       </w:r>
     </w:p>
     <w:p>
@@ -295,23 +214,7 @@
           <w:color w:val="000000" w:themeColor="text1"/>
           <w:lang w:val="fr-CH"/>
         </w:rPr>
-        <w:t xml:space="preserve">Inspirations (Steam </w:t>
-      </w:r>
-      <w:proofErr w:type="spellStart"/>
-      <w:r>
-        <w:rPr>
-          <w:color w:val="000000" w:themeColor="text1"/>
-          <w:lang w:val="fr-CH"/>
-        </w:rPr>
-        <w:t>Database</w:t>
-      </w:r>
-      <w:proofErr w:type="spellEnd"/>
-      <w:r>
-        <w:rPr>
-          <w:color w:val="000000" w:themeColor="text1"/>
-          <w:lang w:val="fr-CH"/>
-        </w:rPr>
-        <w:t>)</w:t>
+        <w:t>Inspirations (Steam Database)</w:t>
       </w:r>
     </w:p>
     <w:p>
@@ -346,56 +249,15 @@
           <w:color w:val="000000" w:themeColor="text1"/>
           <w:lang w:val="en-US"/>
         </w:rPr>
-        <w:t xml:space="preserve">ed to see our </w:t>
-      </w:r>
-      <w:proofErr w:type="spellStart"/>
-      <w:r>
-        <w:rPr>
-          <w:color w:val="000000" w:themeColor="text1"/>
-          <w:lang w:val="en-US"/>
-        </w:rPr>
-        <w:t>favourite</w:t>
-      </w:r>
-      <w:proofErr w:type="spellEnd"/>
-      <w:r>
-        <w:rPr>
-          <w:color w:val="000000" w:themeColor="text1"/>
-          <w:lang w:val="en-US"/>
-        </w:rPr>
-        <w:t xml:space="preserve"> new games</w:t>
+        <w:t>ed to see our favourite new games</w:t>
       </w:r>
       <w:r>
         <w:rPr>
           <w:color w:val="000000" w:themeColor="text1"/>
           <w:lang w:val="en-US"/>
         </w:rPr>
-        <w:t xml:space="preserve">, like </w:t>
+        <w:t>, like clair obscur</w:t>
       </w:r>
-      <w:proofErr w:type="spellStart"/>
-      <w:r>
-        <w:rPr>
-          <w:color w:val="000000" w:themeColor="text1"/>
-          <w:lang w:val="en-US"/>
-        </w:rPr>
-        <w:t>clair</w:t>
-      </w:r>
-      <w:proofErr w:type="spellEnd"/>
-      <w:r>
-        <w:rPr>
-          <w:color w:val="000000" w:themeColor="text1"/>
-          <w:lang w:val="en-US"/>
-        </w:rPr>
-        <w:t xml:space="preserve"> </w:t>
-      </w:r>
-      <w:proofErr w:type="spellStart"/>
-      <w:r>
-        <w:rPr>
-          <w:color w:val="000000" w:themeColor="text1"/>
-          <w:lang w:val="en-US"/>
-        </w:rPr>
-        <w:t>obscur</w:t>
-      </w:r>
-      <w:proofErr w:type="spellEnd"/>
       <w:r>
         <w:rPr>
           <w:color w:val="000000" w:themeColor="text1"/>
@@ -431,87 +293,33 @@
         <w:rPr>
           <w:lang w:val="en-US"/>
         </w:rPr>
-        <w:t xml:space="preserve">Our dataset contains data on approximately 150'000 games. Each entry contains many attributes, such as the name of the game, </w:t>
-      </w:r>
-      <w:proofErr w:type="gramStart"/>
-      <w:r>
-        <w:rPr>
-          <w:lang w:val="en-US"/>
-        </w:rPr>
-        <w:t>it's</w:t>
-      </w:r>
-      <w:proofErr w:type="gramEnd"/>
-      <w:r>
-        <w:rPr>
-          <w:lang w:val="en-US"/>
-        </w:rPr>
-        <w:t xml:space="preserve"> release date, </w:t>
-      </w:r>
-      <w:proofErr w:type="gramStart"/>
-      <w:r>
-        <w:rPr>
-          <w:lang w:val="en-US"/>
-        </w:rPr>
-        <w:t>it's</w:t>
-      </w:r>
-      <w:proofErr w:type="gramEnd"/>
-      <w:r>
-        <w:rPr>
-          <w:lang w:val="en-US"/>
-        </w:rPr>
-        <w:t xml:space="preserve"> genre, </w:t>
-      </w:r>
-      <w:proofErr w:type="gramStart"/>
-      <w:r>
-        <w:rPr>
-          <w:lang w:val="en-US"/>
-        </w:rPr>
-        <w:t>it's</w:t>
-      </w:r>
-      <w:proofErr w:type="gramEnd"/>
-      <w:r>
-        <w:rPr>
-          <w:lang w:val="en-US"/>
-        </w:rPr>
-        <w:t xml:space="preserve"> price, </w:t>
-      </w:r>
-      <w:proofErr w:type="gramStart"/>
-      <w:r>
-        <w:rPr>
-          <w:lang w:val="en-US"/>
-        </w:rPr>
-        <w:t>it</w:t>
+        <w:t xml:space="preserve">Our dataset contains data on approximately 150'000 games. Each entry contains many attributes such as </w:t>
       </w:r>
       <w:r>
         <w:rPr>
           <w:lang w:val="en-US"/>
         </w:rPr>
-        <w:t>’</w:t>
+        <w:t>a game’s</w:t>
       </w:r>
       <w:r>
         <w:rPr>
           <w:lang w:val="en-US"/>
         </w:rPr>
-        <w:t>s</w:t>
+        <w:t xml:space="preserve"> name, release date, genre, price, positive and negative ratings, and many more. The dataset can be obtained and updated using the "Steam Game Scraper" developed by Martin Bustos, which is well integrated in the project repository. The raw dataset is stored as a heavy Json file.</w:t>
       </w:r>
-      <w:proofErr w:type="gramEnd"/>
+    </w:p>
+    <w:p>
+      <w:pPr>
+        <w:pStyle w:val="Body"/>
+        <w:rPr>
+          <w:lang w:val="en-US"/>
+        </w:rPr>
+      </w:pPr>
       <w:r>
         <w:rPr>
           <w:lang w:val="en-US"/>
         </w:rPr>
-        <w:t xml:space="preserve"> positive and negative ratings, and many more. The dataset can be obtained and updated using the "Steam Game Scraper" </w:t>
-      </w:r>
-      <w:r>
-        <w:rPr>
-          <w:lang w:val="en-US"/>
-        </w:rPr>
-        <w:t>developed</w:t>
-      </w:r>
-      <w:r>
-        <w:rPr>
-          <w:lang w:val="en-US"/>
-        </w:rPr>
-        <w:t xml:space="preserve"> by Martin Bustos, which is well integrated in the project repository. The raw dataset is stored as a heavy </w:t>
+        <w:t xml:space="preserve">To make it more manageable, we developed a preprocessing pipeline which transforms the raw Json file into a more compact format. The preprocessing pipeline loads the Json file, can (but does not) filter out the games that do not satisfy certain criteria, then removes unused attributes, and finally stores the resulting dataset in a MessagePack file, which is a more compact binary format. The processed dataset is about 10 times smaller than the raw </w:t>
       </w:r>
       <w:r>
         <w:rPr>
@@ -523,7 +331,7 @@
         <w:rPr>
           <w:lang w:val="en-US"/>
         </w:rPr>
-        <w:t xml:space="preserve"> file.</w:t>
+        <w:t xml:space="preserve"> file, and can be loaded much faster (but still takes too much time to load in practice).</w:t>
       </w:r>
     </w:p>
     <w:p>
@@ -537,99 +345,31 @@
         <w:rPr>
           <w:lang w:val="en-US"/>
         </w:rPr>
-        <w:t xml:space="preserve">To make it more manageable, we </w:t>
+        <w:t>With this dataset, we can perform various analys</w:t>
       </w:r>
       <w:r>
         <w:rPr>
           <w:lang w:val="en-US"/>
         </w:rPr>
-        <w:t>developed</w:t>
+        <w:t>i</w:t>
       </w:r>
       <w:r>
         <w:rPr>
           <w:lang w:val="en-US"/>
         </w:rPr>
-        <w:t xml:space="preserve"> a preprocessing pipeline which transforms the raw </w:t>
+        <w:t>s, mostly related to the relationship between prices, ratings, genre</w:t>
       </w:r>
       <w:r>
         <w:rPr>
           <w:lang w:val="en-US"/>
         </w:rPr>
-        <w:t>Json</w:t>
+        <w:t>s</w:t>
       </w:r>
       <w:r>
         <w:rPr>
           <w:lang w:val="en-US"/>
         </w:rPr>
-        <w:t xml:space="preserve"> file into a more compact format. The preprocessing pipeline loads the </w:t>
-      </w:r>
-      <w:r>
-        <w:rPr>
-          <w:lang w:val="en-US"/>
-        </w:rPr>
-        <w:t>Json</w:t>
-      </w:r>
-      <w:r>
-        <w:rPr>
-          <w:lang w:val="en-US"/>
-        </w:rPr>
-        <w:t xml:space="preserve"> file, can (but does not) filter out the games that do not satisfy certain criteria, then removes unused attributes, and finally stores the resulting dataset in a MessagePack file, which is a more compact binary format. The processed dataset is about 10 times smaller than the raw </w:t>
-      </w:r>
-      <w:proofErr w:type="spellStart"/>
-      <w:r>
-        <w:rPr>
-          <w:lang w:val="en-US"/>
-        </w:rPr>
-        <w:t>json</w:t>
-      </w:r>
-      <w:proofErr w:type="spellEnd"/>
-      <w:r>
-        <w:rPr>
-          <w:lang w:val="en-US"/>
-        </w:rPr>
-        <w:t xml:space="preserve"> </w:t>
-      </w:r>
-      <w:proofErr w:type="gramStart"/>
-      <w:r>
-        <w:rPr>
-          <w:lang w:val="en-US"/>
-        </w:rPr>
-        <w:t>file, and</w:t>
-      </w:r>
-      <w:proofErr w:type="gramEnd"/>
-      <w:r>
-        <w:rPr>
-          <w:lang w:val="en-US"/>
-        </w:rPr>
-        <w:t xml:space="preserve"> can be loaded much faster (but still takes too much time to load in practice).</w:t>
-      </w:r>
-    </w:p>
-    <w:p>
-      <w:pPr>
-        <w:pStyle w:val="Body"/>
-        <w:rPr>
-          <w:lang w:val="en-US"/>
-        </w:rPr>
-      </w:pPr>
-      <w:r>
-        <w:rPr>
-          <w:lang w:val="en-US"/>
-        </w:rPr>
-        <w:t xml:space="preserve">With this dataset, we can perform various analyses, mostly related to the relationship between prices, ratings, genre, and size of the playing community. This allows us to make informative visualizations that can exactly </w:t>
-      </w:r>
-      <w:proofErr w:type="gramStart"/>
-      <w:r>
-        <w:rPr>
-          <w:lang w:val="en-US"/>
-        </w:rPr>
-        <w:t>answer to</w:t>
-      </w:r>
-      <w:proofErr w:type="gramEnd"/>
-      <w:r>
-        <w:rPr>
-          <w:lang w:val="en-US"/>
-        </w:rPr>
-        <w:t xml:space="preserve"> our project's goal. </w:t>
+        <w:t xml:space="preserve">, and size of the playing community. This allows us to make informative visualizations that answer our project's goal. </w:t>
       </w:r>
     </w:p>
     <w:p>
@@ -723,61 +463,21 @@
         <w:rPr>
           <w:lang w:val="en-US"/>
         </w:rPr>
-        <w:t xml:space="preserve"> (</w:t>
+        <w:t xml:space="preserve"> (Valou)</w:t>
       </w:r>
-      <w:proofErr w:type="spellStart"/>
+    </w:p>
+    <w:p>
+      <w:pPr>
+        <w:pStyle w:val="Body"/>
+        <w:rPr>
+          <w:lang w:val="en-US"/>
+        </w:rPr>
+      </w:pPr>
       <w:r>
         <w:rPr>
           <w:lang w:val="en-US"/>
         </w:rPr>
-        <w:t>Valou</w:t>
-      </w:r>
-      <w:proofErr w:type="spellEnd"/>
-      <w:r>
-        <w:rPr>
-          <w:lang w:val="en-US"/>
-        </w:rPr>
-        <w:t>)</w:t>
-      </w:r>
-    </w:p>
-    <w:p>
-      <w:pPr>
-        <w:pStyle w:val="Body"/>
-        <w:rPr>
-          <w:lang w:val="en-US"/>
-        </w:rPr>
-      </w:pPr>
-      <w:r>
-        <w:rPr>
-          <w:lang w:val="en-US"/>
-        </w:rPr>
-        <w:t xml:space="preserve">The website is implemented using the D3.js library, which is a powerful tool for creating interactive data visualizations on the web. To guarantee </w:t>
-      </w:r>
-      <w:proofErr w:type="gramStart"/>
-      <w:r>
-        <w:rPr>
-          <w:lang w:val="en-US"/>
-        </w:rPr>
-        <w:t xml:space="preserve">a </w:t>
-      </w:r>
-      <w:r>
-        <w:rPr>
-          <w:lang w:val="en-US"/>
-        </w:rPr>
-        <w:t>long</w:t>
-      </w:r>
-      <w:proofErr w:type="gramEnd"/>
-      <w:r>
-        <w:rPr>
-          <w:lang w:val="en-US"/>
-        </w:rPr>
-        <w:t>-term</w:t>
-      </w:r>
-      <w:r>
-        <w:rPr>
-          <w:lang w:val="en-US"/>
-        </w:rPr>
-        <w:t xml:space="preserve"> availability of the website, we have implemented it as a static website, which can be easily hosted on GitHub Pages without the need for a backend server. The data is loaded directly from the MessagePack file, which is stored in the repository and can be updated regularly using the scrapper and the preprocessing pipeline.</w:t>
+        <w:t>The website is implemented using the D3.js library, which is a powerful tool for creating interactive data visualizations on the web. To guarantee a long-term availability of the website, we have implemented it as a static website, which can be easily hosted on GitHub Pages without the need for a backend server. The data is loaded directly from the MessagePack file, which is stored in the repository and can be updated regularly using the scrapper and the preprocessing pipeline.</w:t>
       </w:r>
     </w:p>
     <w:p>
@@ -805,49 +505,21 @@
         <w:rPr>
           <w:lang w:val="en-US"/>
         </w:rPr>
-        <w:t xml:space="preserve">The structure of the website is simple: it consists of a single HTML page that contains several sections, each dedicated to a specific visualization. Each visualization is implemented as a separate TypeScript </w:t>
+        <w:t>The structure of the website is simple: it consists of a single HTML page that contains several sections, each dedicated to a specific visualization. Each visualization is implemented as a separate TypeScript file and is then injected into the HTML page at load time.</w:t>
       </w:r>
+    </w:p>
+    <w:p>
+      <w:pPr>
+        <w:pStyle w:val="Body"/>
+        <w:rPr>
+          <w:lang w:val="en-US"/>
+        </w:rPr>
+      </w:pPr>
       <w:r>
         <w:rPr>
           <w:lang w:val="en-US"/>
         </w:rPr>
-        <w:t>file and</w:t>
-      </w:r>
-      <w:r>
-        <w:rPr>
-          <w:lang w:val="en-US"/>
-        </w:rPr>
-        <w:t xml:space="preserve"> is then injected into the HTML page at load time.</w:t>
-      </w:r>
-    </w:p>
-    <w:p>
-      <w:pPr>
-        <w:pStyle w:val="Body"/>
-        <w:rPr>
-          <w:lang w:val="en-US"/>
-        </w:rPr>
-      </w:pPr>
-      <w:r>
-        <w:rPr>
-          <w:lang w:val="en-US"/>
-        </w:rPr>
-        <w:t xml:space="preserve">The Vite build tool is used to bundle and optimize the TypeScript code, and to generate the final JavaScript files that can be loaded by the browser. The project environment also includes the </w:t>
-      </w:r>
-      <w:proofErr w:type="spellStart"/>
-      <w:proofErr w:type="gramStart"/>
-      <w:r>
-        <w:rPr>
-          <w:lang w:val="en-US"/>
-        </w:rPr>
-        <w:t>gh</w:t>
-      </w:r>
-      <w:proofErr w:type="spellEnd"/>
-      <w:proofErr w:type="gramEnd"/>
-      <w:r>
-        <w:rPr>
-          <w:lang w:val="en-US"/>
-        </w:rPr>
-        <w:t>-pages package, which allows us to easily deploy the website on GitHub Pages with a single command.</w:t>
+        <w:t>The Vite build tool is used to bundle and optimize the TypeScript code, and to generate the final JavaScript files that can be loaded by the browser. The project environment also includes the gh-pages package, which allows us to easily deploy the website on GitHub Pages with a single command.</w:t>
       </w:r>
     </w:p>
     <w:p>
@@ -943,21 +615,7 @@
         <w:rPr>
           <w:rFonts w:ascii="TT Octosquares Trial" w:hAnsi="TT Octosquares Trial"/>
         </w:rPr>
-        <w:t xml:space="preserve"> all relevant information about a single game. We have focused on data that helps bring together the identity of a game. </w:t>
-      </w:r>
-      <w:proofErr w:type="gramStart"/>
-      <w:r>
-        <w:rPr>
-          <w:rFonts w:ascii="TT Octosquares Trial" w:hAnsi="TT Octosquares Trial"/>
-        </w:rPr>
-        <w:t>In order to</w:t>
-      </w:r>
-      <w:proofErr w:type="gramEnd"/>
-      <w:r>
-        <w:rPr>
-          <w:rFonts w:ascii="TT Octosquares Trial" w:hAnsi="TT Octosquares Trial"/>
-        </w:rPr>
-        <w:t xml:space="preserve"> compare its popularity against similar games, the user can select as many filters as they want (including developers, publishers, genres and tags). A dropdown ranks by </w:t>
+        <w:t xml:space="preserve"> all relevant information about a single game. We have focused on data that helps bring together the identity of a game. In order to compare its popularity against similar games, the user can select as many filters as they want (including developers, publishers, genres and tags). A dropdown ranks by </w:t>
       </w:r>
       <w:r>
         <w:rPr>
@@ -1295,26 +953,14 @@
                 <w:rFonts w:ascii="TT Octosquares Trial" w:hAnsi="TT Octosquares Trial"/>
               </w:rPr>
             </w:pPr>
-            <w:proofErr w:type="spellStart"/>
-            <w:proofErr w:type="gramStart"/>
             <w:r>
               <w:rPr>
                 <w:rFonts w:ascii="TT Octosquares Trial" w:hAnsi="TT Octosquares Trial"/>
                 <w:color w:val="3F3F46"/>
                 <w:sz w:val="20"/>
               </w:rPr>
-              <w:t>Colors</w:t>
+              <w:t>Colors ?</w:t>
             </w:r>
-            <w:proofErr w:type="spellEnd"/>
-            <w:r>
-              <w:rPr>
-                <w:rFonts w:ascii="TT Octosquares Trial" w:hAnsi="TT Octosquares Trial"/>
-                <w:color w:val="3F3F46"/>
-                <w:sz w:val="20"/>
-              </w:rPr>
-              <w:t xml:space="preserve"> ?</w:t>
-            </w:r>
-            <w:proofErr w:type="gramEnd"/>
           </w:p>
         </w:tc>
       </w:tr>
@@ -1420,7 +1066,6 @@
                 <w:rFonts w:ascii="TT Octosquares Trial" w:hAnsi="TT Octosquares Trial"/>
               </w:rPr>
             </w:pPr>
-            <w:proofErr w:type="spellStart"/>
             <w:r>
               <w:rPr>
                 <w:rFonts w:ascii="TT Octosquares Trial" w:hAnsi="TT Octosquares Trial"/>
@@ -1429,7 +1074,6 @@
               </w:rPr>
               <w:t>Blabla</w:t>
             </w:r>
-            <w:proofErr w:type="spellEnd"/>
           </w:p>
         </w:tc>
       </w:tr>
@@ -1560,7 +1204,7 @@
 <w:ftr xmlns:wpc="http://schemas.microsoft.com/office/word/2010/wordprocessingCanvas" xmlns:cx="http://schemas.microsoft.com/office/drawing/2014/chartex" xmlns:cx1="http://schemas.microsoft.com/office/drawing/2015/9/8/chartex" xmlns:cx2="http://schemas.microsoft.com/office/drawing/2015/10/21/chartex" xmlns:cx3="http://schemas.microsoft.com/office/drawing/2016/5/9/chartex" xmlns:cx4="http://schemas.microsoft.com/office/drawing/2016/5/10/chartex" xmlns:cx5="http://schemas.microsoft.com/office/drawing/2016/5/11/chartex" xmlns:cx6="http://schemas.microsoft.com/office/drawing/2016/5/12/chartex" xmlns:cx7="http://schemas.microsoft.com/office/drawing/2016/5/13/chartex" xmlns:cx8="http://schemas.microsoft.com/office/drawing/2016/5/14/chartex" xmlns:mc="http://schemas.openxmlformats.org/markup-compatibility/2006" xmlns:aink="http://schemas.microsoft.com/office/drawing/2016/ink" xmlns:am3d="http://schemas.microsoft.com/office/drawing/2017/model3d" xmlns:o="urn:schemas-microsoft-com:office:office" xmlns:oel="http://schemas.microsoft.com/office/2019/extlst" xmlns:r="http://schemas.openxmlformats.org/officeDocument/2006/relationships" xmlns:m="http://schemas.openxmlformats.org/officeDocument/2006/math" xmlns:v="urn:schemas-microsoft-com:vml" xmlns:wp14="http://schemas.microsoft.com/office/word/2010/wordprocessingDrawing" xmlns:wp="http://schemas.openxmlformats.org/drawingml/2006/wordprocessingDrawing" xmlns:w10="urn:schemas-microsoft-com:office:word" xmlns:w="http://schemas.openxmlformats.org/wordprocessingml/2006/main" xmlns:w14="http://schemas.microsoft.com/office/word/2010/wordml" xmlns:w15="http://schemas.microsoft.com/office/word/2012/wordml" xmlns:w16cex="http://schemas.microsoft.com/office/word/2018/wordml/cex" xmlns:w16cid="http://schemas.microsoft.com/office/word/2016/wordml/cid" xmlns:w16="http://schemas.microsoft.com/office/word/2018/wordml" xmlns:w16du="http://schemas.microsoft.com/office/word/2023/wordml/word16du" xmlns:w16sdtdh="http://schemas.microsoft.com/office/word/2020/wordml/sdtdatahash" xmlns:w16sdtfl="http://schemas.microsoft.com/office/word/2024/wordml/sdtformatlock" xmlns:w16se="http://schemas.microsoft.com/office/word/2015/wordml/symex" xmlns:wpg="http://schemas.microsoft.com/office/word/2010/wordprocessingGroup" xmlns:wpi="http://schemas.microsoft.com/office/word/2010/wordprocessingInk" xmlns:wne="http://schemas.microsoft.com/office/word/2006/wordml" xmlns:wps="http://schemas.microsoft.com/office/word/2010/wordprocessingShape" mc:Ignorable="w14 w15 w16se w16cid w16 w16cex w16sdtdh w16sdtfl w16du wp14">
   <w:p>
     <w:pPr>
-      <w:pStyle w:val="Pieddepage"/>
+      <w:pStyle w:val="Footer"/>
       <w:jc w:val="right"/>
       <w:rPr>
         <w:rFonts w:ascii="TT Octosquares Trial" w:hAnsi="TT Octosquares Trial"/>
@@ -1676,7 +1320,7 @@
     <w:lvl w:ilvl="0">
       <w:start w:val="1"/>
       <w:numFmt w:val="decimal"/>
-      <w:pStyle w:val="Listenumros3"/>
+      <w:pStyle w:val="ListNumber3"/>
       <w:lvlText w:val="%1."/>
       <w:lvlJc w:val="left"/>
       <w:pPr>
@@ -1694,7 +1338,7 @@
     <w:lvl w:ilvl="0">
       <w:start w:val="1"/>
       <w:numFmt w:val="decimal"/>
-      <w:pStyle w:val="Listenumros2"/>
+      <w:pStyle w:val="ListNumber2"/>
       <w:lvlText w:val="%1."/>
       <w:lvlJc w:val="left"/>
       <w:pPr>
@@ -1732,7 +1376,7 @@
     <w:lvl w:ilvl="0">
       <w:start w:val="1"/>
       <w:numFmt w:val="bullet"/>
-      <w:pStyle w:val="Listepuces3"/>
+      <w:pStyle w:val="ListBullet3"/>
       <w:lvlText w:val=""/>
       <w:lvlJc w:val="left"/>
       <w:pPr>
@@ -1753,7 +1397,7 @@
     <w:lvl w:ilvl="0">
       <w:start w:val="1"/>
       <w:numFmt w:val="bullet"/>
-      <w:pStyle w:val="Listepuces2"/>
+      <w:pStyle w:val="ListBullet2"/>
       <w:lvlText w:val=""/>
       <w:lvlJc w:val="left"/>
       <w:pPr>
@@ -1774,7 +1418,7 @@
     <w:lvl w:ilvl="0">
       <w:start w:val="1"/>
       <w:numFmt w:val="decimal"/>
-      <w:pStyle w:val="Listenumros"/>
+      <w:pStyle w:val="ListNumber"/>
       <w:lvlText w:val="%1."/>
       <w:lvlJc w:val="left"/>
       <w:pPr>
@@ -1792,7 +1436,7 @@
     <w:lvl w:ilvl="0">
       <w:start w:val="1"/>
       <w:numFmt w:val="bullet"/>
-      <w:pStyle w:val="Listepuces"/>
+      <w:pStyle w:val="ListBullet"/>
       <w:lvlText w:val=""/>
       <w:lvlJc w:val="left"/>
       <w:pPr>
@@ -2462,11 +2106,11 @@
       <w:lang w:val="en-GB"/>
     </w:rPr>
   </w:style>
-  <w:style w:type="paragraph" w:styleId="Titre1">
+  <w:style w:type="paragraph" w:styleId="Heading1">
     <w:name w:val="heading 1"/>
     <w:basedOn w:val="Normal"/>
     <w:next w:val="Normal"/>
-    <w:link w:val="Titre1Car"/>
+    <w:link w:val="Heading1Char"/>
     <w:uiPriority w:val="9"/>
     <w:qFormat/>
     <w:rsid w:val="00FC693F"/>
@@ -2485,11 +2129,11 @@
       <w:szCs w:val="28"/>
     </w:rPr>
   </w:style>
-  <w:style w:type="paragraph" w:styleId="Titre2">
+  <w:style w:type="paragraph" w:styleId="Heading2">
     <w:name w:val="heading 2"/>
     <w:basedOn w:val="Normal"/>
     <w:next w:val="Normal"/>
-    <w:link w:val="Titre2Car"/>
+    <w:link w:val="Heading2Char"/>
     <w:uiPriority w:val="9"/>
     <w:unhideWhenUsed/>
     <w:qFormat/>
@@ -2509,11 +2153,11 @@
       <w:szCs w:val="26"/>
     </w:rPr>
   </w:style>
-  <w:style w:type="paragraph" w:styleId="Titre3">
+  <w:style w:type="paragraph" w:styleId="Heading3">
     <w:name w:val="heading 3"/>
     <w:basedOn w:val="Normal"/>
     <w:next w:val="Normal"/>
-    <w:link w:val="Titre3Car"/>
+    <w:link w:val="Heading3Char"/>
     <w:uiPriority w:val="9"/>
     <w:unhideWhenUsed/>
     <w:qFormat/>
@@ -2531,11 +2175,11 @@
       <w:color w:val="4F81BD" w:themeColor="accent1"/>
     </w:rPr>
   </w:style>
-  <w:style w:type="paragraph" w:styleId="Titre4">
+  <w:style w:type="paragraph" w:styleId="Heading4">
     <w:name w:val="heading 4"/>
     <w:basedOn w:val="Normal"/>
     <w:next w:val="Normal"/>
-    <w:link w:val="Titre4Car"/>
+    <w:link w:val="Heading4Char"/>
     <w:uiPriority w:val="9"/>
     <w:semiHidden/>
     <w:unhideWhenUsed/>
@@ -2556,11 +2200,11 @@
       <w:color w:val="4F81BD" w:themeColor="accent1"/>
     </w:rPr>
   </w:style>
-  <w:style w:type="paragraph" w:styleId="Titre5">
+  <w:style w:type="paragraph" w:styleId="Heading5">
     <w:name w:val="heading 5"/>
     <w:basedOn w:val="Normal"/>
     <w:next w:val="Normal"/>
-    <w:link w:val="Titre5Car"/>
+    <w:link w:val="Heading5Char"/>
     <w:uiPriority w:val="9"/>
     <w:semiHidden/>
     <w:unhideWhenUsed/>
@@ -2577,11 +2221,11 @@
       <w:color w:val="243F60" w:themeColor="accent1" w:themeShade="7F"/>
     </w:rPr>
   </w:style>
-  <w:style w:type="paragraph" w:styleId="Titre6">
+  <w:style w:type="paragraph" w:styleId="Heading6">
     <w:name w:val="heading 6"/>
     <w:basedOn w:val="Normal"/>
     <w:next w:val="Normal"/>
-    <w:link w:val="Titre6Car"/>
+    <w:link w:val="Heading6Char"/>
     <w:uiPriority w:val="9"/>
     <w:semiHidden/>
     <w:unhideWhenUsed/>
@@ -2600,11 +2244,11 @@
       <w:color w:val="243F60" w:themeColor="accent1" w:themeShade="7F"/>
     </w:rPr>
   </w:style>
-  <w:style w:type="paragraph" w:styleId="Titre7">
+  <w:style w:type="paragraph" w:styleId="Heading7">
     <w:name w:val="heading 7"/>
     <w:basedOn w:val="Normal"/>
     <w:next w:val="Normal"/>
-    <w:link w:val="Titre7Car"/>
+    <w:link w:val="Heading7Char"/>
     <w:uiPriority w:val="9"/>
     <w:semiHidden/>
     <w:unhideWhenUsed/>
@@ -2623,11 +2267,11 @@
       <w:color w:val="404040" w:themeColor="text1" w:themeTint="BF"/>
     </w:rPr>
   </w:style>
-  <w:style w:type="paragraph" w:styleId="Titre8">
+  <w:style w:type="paragraph" w:styleId="Heading8">
     <w:name w:val="heading 8"/>
     <w:basedOn w:val="Normal"/>
     <w:next w:val="Normal"/>
-    <w:link w:val="Titre8Car"/>
+    <w:link w:val="Heading8Char"/>
     <w:uiPriority w:val="9"/>
     <w:semiHidden/>
     <w:unhideWhenUsed/>
@@ -2646,11 +2290,11 @@
       <w:szCs w:val="20"/>
     </w:rPr>
   </w:style>
-  <w:style w:type="paragraph" w:styleId="Titre9">
+  <w:style w:type="paragraph" w:styleId="Heading9">
     <w:name w:val="heading 9"/>
     <w:basedOn w:val="Normal"/>
     <w:next w:val="Normal"/>
-    <w:link w:val="Titre9Car"/>
+    <w:link w:val="Heading9Char"/>
     <w:uiPriority w:val="9"/>
     <w:semiHidden/>
     <w:unhideWhenUsed/>
@@ -2671,12 +2315,13 @@
       <w:szCs w:val="20"/>
     </w:rPr>
   </w:style>
-  <w:style w:type="character" w:default="1" w:styleId="Policepardfaut">
+  <w:style w:type="character" w:default="1" w:styleId="DefaultParagraphFont">
     <w:name w:val="Default Paragraph Font"/>
     <w:uiPriority w:val="1"/>
+    <w:semiHidden/>
     <w:unhideWhenUsed/>
   </w:style>
-  <w:style w:type="table" w:default="1" w:styleId="TableauNormal">
+  <w:style w:type="table" w:default="1" w:styleId="TableNormal">
     <w:name w:val="Normal Table"/>
     <w:uiPriority w:val="99"/>
     <w:semiHidden/>
@@ -2691,16 +2336,16 @@
       </w:tblCellMar>
     </w:tblPr>
   </w:style>
-  <w:style w:type="numbering" w:default="1" w:styleId="Aucuneliste">
+  <w:style w:type="numbering" w:default="1" w:styleId="NoList">
     <w:name w:val="No List"/>
     <w:uiPriority w:val="99"/>
     <w:semiHidden/>
     <w:unhideWhenUsed/>
   </w:style>
-  <w:style w:type="paragraph" w:styleId="En-tte">
+  <w:style w:type="paragraph" w:styleId="Header">
     <w:name w:val="header"/>
     <w:basedOn w:val="Normal"/>
-    <w:link w:val="En-tteCar"/>
+    <w:link w:val="HeaderChar"/>
     <w:uiPriority w:val="99"/>
     <w:unhideWhenUsed/>
     <w:rsid w:val="00E618BF"/>
@@ -2712,17 +2357,17 @@
       <w:spacing w:after="0" w:line="240" w:lineRule="auto"/>
     </w:pPr>
   </w:style>
-  <w:style w:type="character" w:customStyle="1" w:styleId="En-tteCar">
-    <w:name w:val="En-tête Car"/>
-    <w:basedOn w:val="Policepardfaut"/>
-    <w:link w:val="En-tte"/>
+  <w:style w:type="character" w:customStyle="1" w:styleId="HeaderChar">
+    <w:name w:val="Header Char"/>
+    <w:basedOn w:val="DefaultParagraphFont"/>
+    <w:link w:val="Header"/>
     <w:uiPriority w:val="99"/>
     <w:rsid w:val="00E618BF"/>
   </w:style>
-  <w:style w:type="paragraph" w:styleId="Pieddepage">
+  <w:style w:type="paragraph" w:styleId="Footer">
     <w:name w:val="footer"/>
     <w:basedOn w:val="Normal"/>
-    <w:link w:val="PieddepageCar"/>
+    <w:link w:val="FooterChar"/>
     <w:uiPriority w:val="99"/>
     <w:unhideWhenUsed/>
     <w:rsid w:val="00E618BF"/>
@@ -2734,14 +2379,14 @@
       <w:spacing w:after="0" w:line="240" w:lineRule="auto"/>
     </w:pPr>
   </w:style>
-  <w:style w:type="character" w:customStyle="1" w:styleId="PieddepageCar">
-    <w:name w:val="Pied de page Car"/>
-    <w:basedOn w:val="Policepardfaut"/>
-    <w:link w:val="Pieddepage"/>
+  <w:style w:type="character" w:customStyle="1" w:styleId="FooterChar">
+    <w:name w:val="Footer Char"/>
+    <w:basedOn w:val="DefaultParagraphFont"/>
+    <w:link w:val="Footer"/>
     <w:uiPriority w:val="99"/>
     <w:rsid w:val="00E618BF"/>
   </w:style>
-  <w:style w:type="paragraph" w:styleId="Sansinterligne">
+  <w:style w:type="paragraph" w:styleId="NoSpacing">
     <w:name w:val="No Spacing"/>
     <w:uiPriority w:val="1"/>
     <w:qFormat/>
@@ -2750,10 +2395,10 @@
       <w:spacing w:after="0" w:line="240" w:lineRule="auto"/>
     </w:pPr>
   </w:style>
-  <w:style w:type="character" w:customStyle="1" w:styleId="Titre1Car">
-    <w:name w:val="Titre 1 Car"/>
-    <w:basedOn w:val="Policepardfaut"/>
-    <w:link w:val="Titre1"/>
+  <w:style w:type="character" w:customStyle="1" w:styleId="Heading1Char">
+    <w:name w:val="Heading 1 Char"/>
+    <w:basedOn w:val="DefaultParagraphFont"/>
+    <w:link w:val="Heading1"/>
     <w:uiPriority w:val="9"/>
     <w:rsid w:val="00FC693F"/>
     <w:rPr>
@@ -2765,10 +2410,10 @@
       <w:szCs w:val="28"/>
     </w:rPr>
   </w:style>
-  <w:style w:type="character" w:customStyle="1" w:styleId="Titre2Car">
-    <w:name w:val="Titre 2 Car"/>
-    <w:basedOn w:val="Policepardfaut"/>
-    <w:link w:val="Titre2"/>
+  <w:style w:type="character" w:customStyle="1" w:styleId="Heading2Char">
+    <w:name w:val="Heading 2 Char"/>
+    <w:basedOn w:val="DefaultParagraphFont"/>
+    <w:link w:val="Heading2"/>
     <w:uiPriority w:val="9"/>
     <w:rsid w:val="00FC693F"/>
     <w:rPr>
@@ -2780,10 +2425,10 @@
       <w:szCs w:val="26"/>
     </w:rPr>
   </w:style>
-  <w:style w:type="character" w:customStyle="1" w:styleId="Titre3Car">
-    <w:name w:val="Titre 3 Car"/>
-    <w:basedOn w:val="Policepardfaut"/>
-    <w:link w:val="Titre3"/>
+  <w:style w:type="character" w:customStyle="1" w:styleId="Heading3Char">
+    <w:name w:val="Heading 3 Char"/>
+    <w:basedOn w:val="DefaultParagraphFont"/>
+    <w:link w:val="Heading3"/>
     <w:uiPriority w:val="9"/>
     <w:rsid w:val="00FC693F"/>
     <w:rPr>
@@ -2793,11 +2438,11 @@
       <w:color w:val="4F81BD" w:themeColor="accent1"/>
     </w:rPr>
   </w:style>
-  <w:style w:type="paragraph" w:styleId="Titre">
+  <w:style w:type="paragraph" w:styleId="Title">
     <w:name w:val="Title"/>
     <w:basedOn w:val="Normal"/>
     <w:next w:val="Normal"/>
-    <w:link w:val="TitreCar"/>
+    <w:link w:val="TitleChar"/>
     <w:uiPriority w:val="10"/>
     <w:qFormat/>
     <w:rsid w:val="00FC693F"/>
@@ -2817,10 +2462,10 @@
       <w:szCs w:val="52"/>
     </w:rPr>
   </w:style>
-  <w:style w:type="character" w:customStyle="1" w:styleId="TitreCar">
-    <w:name w:val="Titre Car"/>
-    <w:basedOn w:val="Policepardfaut"/>
-    <w:link w:val="Titre"/>
+  <w:style w:type="character" w:customStyle="1" w:styleId="TitleChar">
+    <w:name w:val="Title Char"/>
+    <w:basedOn w:val="DefaultParagraphFont"/>
+    <w:link w:val="Title"/>
     <w:uiPriority w:val="10"/>
     <w:rsid w:val="00FC693F"/>
     <w:rPr>
@@ -2832,11 +2477,11 @@
       <w:szCs w:val="52"/>
     </w:rPr>
   </w:style>
-  <w:style w:type="paragraph" w:styleId="Sous-titre">
+  <w:style w:type="paragraph" w:styleId="Subtitle">
     <w:name w:val="Subtitle"/>
     <w:basedOn w:val="Normal"/>
     <w:next w:val="Normal"/>
-    <w:link w:val="Sous-titreCar"/>
+    <w:link w:val="SubtitleChar"/>
     <w:uiPriority w:val="11"/>
     <w:qFormat/>
     <w:rsid w:val="00FC693F"/>
@@ -2855,10 +2500,10 @@
       <w:szCs w:val="24"/>
     </w:rPr>
   </w:style>
-  <w:style w:type="character" w:customStyle="1" w:styleId="Sous-titreCar">
-    <w:name w:val="Sous-titre Car"/>
-    <w:basedOn w:val="Policepardfaut"/>
-    <w:link w:val="Sous-titre"/>
+  <w:style w:type="character" w:customStyle="1" w:styleId="SubtitleChar">
+    <w:name w:val="Subtitle Char"/>
+    <w:basedOn w:val="DefaultParagraphFont"/>
+    <w:link w:val="Subtitle"/>
     <w:uiPriority w:val="11"/>
     <w:rsid w:val="00FC693F"/>
     <w:rPr>
@@ -2871,7 +2516,7 @@
       <w:szCs w:val="24"/>
     </w:rPr>
   </w:style>
-  <w:style w:type="paragraph" w:styleId="Paragraphedeliste">
+  <w:style w:type="paragraph" w:styleId="ListParagraph">
     <w:name w:val="List Paragraph"/>
     <w:basedOn w:val="Normal"/>
     <w:uiPriority w:val="34"/>
@@ -2882,10 +2527,10 @@
       <w:contextualSpacing/>
     </w:pPr>
   </w:style>
-  <w:style w:type="paragraph" w:styleId="Corpsdetexte">
+  <w:style w:type="paragraph" w:styleId="BodyText">
     <w:name w:val="Body Text"/>
     <w:basedOn w:val="Normal"/>
-    <w:link w:val="CorpsdetexteCar"/>
+    <w:link w:val="BodyTextChar"/>
     <w:uiPriority w:val="99"/>
     <w:unhideWhenUsed/>
     <w:rsid w:val="00AA1D8D"/>
@@ -2893,17 +2538,17 @@
       <w:spacing w:after="120"/>
     </w:pPr>
   </w:style>
-  <w:style w:type="character" w:customStyle="1" w:styleId="CorpsdetexteCar">
-    <w:name w:val="Corps de texte Car"/>
-    <w:basedOn w:val="Policepardfaut"/>
-    <w:link w:val="Corpsdetexte"/>
+  <w:style w:type="character" w:customStyle="1" w:styleId="BodyTextChar">
+    <w:name w:val="Body Text Char"/>
+    <w:basedOn w:val="DefaultParagraphFont"/>
+    <w:link w:val="BodyText"/>
     <w:uiPriority w:val="99"/>
     <w:rsid w:val="00AA1D8D"/>
   </w:style>
-  <w:style w:type="paragraph" w:styleId="Corpsdetexte2">
+  <w:style w:type="paragraph" w:styleId="BodyText2">
     <w:name w:val="Body Text 2"/>
     <w:basedOn w:val="Normal"/>
-    <w:link w:val="Corpsdetexte2Car"/>
+    <w:link w:val="BodyText2Char"/>
     <w:uiPriority w:val="99"/>
     <w:unhideWhenUsed/>
     <w:rsid w:val="00AA1D8D"/>
@@ -2911,17 +2556,17 @@
       <w:spacing w:after="120" w:line="480" w:lineRule="auto"/>
     </w:pPr>
   </w:style>
-  <w:style w:type="character" w:customStyle="1" w:styleId="Corpsdetexte2Car">
-    <w:name w:val="Corps de texte 2 Car"/>
-    <w:basedOn w:val="Policepardfaut"/>
-    <w:link w:val="Corpsdetexte2"/>
+  <w:style w:type="character" w:customStyle="1" w:styleId="BodyText2Char">
+    <w:name w:val="Body Text 2 Char"/>
+    <w:basedOn w:val="DefaultParagraphFont"/>
+    <w:link w:val="BodyText2"/>
     <w:uiPriority w:val="99"/>
     <w:rsid w:val="00AA1D8D"/>
   </w:style>
-  <w:style w:type="paragraph" w:styleId="Corpsdetexte3">
+  <w:style w:type="paragraph" w:styleId="BodyText3">
     <w:name w:val="Body Text 3"/>
     <w:basedOn w:val="Normal"/>
-    <w:link w:val="Corpsdetexte3Car"/>
+    <w:link w:val="BodyText3Char"/>
     <w:uiPriority w:val="99"/>
     <w:unhideWhenUsed/>
     <w:rsid w:val="00AA1D8D"/>
@@ -2933,10 +2578,10 @@
       <w:szCs w:val="16"/>
     </w:rPr>
   </w:style>
-  <w:style w:type="character" w:customStyle="1" w:styleId="Corpsdetexte3Car">
-    <w:name w:val="Corps de texte 3 Car"/>
-    <w:basedOn w:val="Policepardfaut"/>
-    <w:link w:val="Corpsdetexte3"/>
+  <w:style w:type="character" w:customStyle="1" w:styleId="BodyText3Char">
+    <w:name w:val="Body Text 3 Char"/>
+    <w:basedOn w:val="DefaultParagraphFont"/>
+    <w:link w:val="BodyText3"/>
     <w:uiPriority w:val="99"/>
     <w:rsid w:val="00AA1D8D"/>
     <w:rPr>
@@ -2944,7 +2589,7 @@
       <w:szCs w:val="16"/>
     </w:rPr>
   </w:style>
-  <w:style w:type="paragraph" w:styleId="Liste">
+  <w:style w:type="paragraph" w:styleId="List">
     <w:name w:val="List"/>
     <w:basedOn w:val="Normal"/>
     <w:uiPriority w:val="99"/>
@@ -2955,7 +2600,7 @@
       <w:contextualSpacing/>
     </w:pPr>
   </w:style>
-  <w:style w:type="paragraph" w:styleId="Liste2">
+  <w:style w:type="paragraph" w:styleId="List2">
     <w:name w:val="List 2"/>
     <w:basedOn w:val="Normal"/>
     <w:uiPriority w:val="99"/>
@@ -2966,7 +2611,7 @@
       <w:contextualSpacing/>
     </w:pPr>
   </w:style>
-  <w:style w:type="paragraph" w:styleId="Liste3">
+  <w:style w:type="paragraph" w:styleId="List3">
     <w:name w:val="List 3"/>
     <w:basedOn w:val="Normal"/>
     <w:uiPriority w:val="99"/>
@@ -2977,7 +2622,7 @@
       <w:contextualSpacing/>
     </w:pPr>
   </w:style>
-  <w:style w:type="paragraph" w:styleId="Listepuces">
+  <w:style w:type="paragraph" w:styleId="ListBullet">
     <w:name w:val="List Bullet"/>
     <w:basedOn w:val="Normal"/>
     <w:uiPriority w:val="99"/>
@@ -2990,7 +2635,7 @@
       <w:contextualSpacing/>
     </w:pPr>
   </w:style>
-  <w:style w:type="paragraph" w:styleId="Listepuces2">
+  <w:style w:type="paragraph" w:styleId="ListBullet2">
     <w:name w:val="List Bullet 2"/>
     <w:basedOn w:val="Normal"/>
     <w:uiPriority w:val="99"/>
@@ -3003,7 +2648,7 @@
       <w:contextualSpacing/>
     </w:pPr>
   </w:style>
-  <w:style w:type="paragraph" w:styleId="Listepuces3">
+  <w:style w:type="paragraph" w:styleId="ListBullet3">
     <w:name w:val="List Bullet 3"/>
     <w:basedOn w:val="Normal"/>
     <w:uiPriority w:val="99"/>
@@ -3016,7 +2661,7 @@
       <w:contextualSpacing/>
     </w:pPr>
   </w:style>
-  <w:style w:type="paragraph" w:styleId="Listenumros">
+  <w:style w:type="paragraph" w:styleId="ListNumber">
     <w:name w:val="List Number"/>
     <w:basedOn w:val="Normal"/>
     <w:uiPriority w:val="99"/>
@@ -3029,7 +2674,7 @@
       <w:contextualSpacing/>
     </w:pPr>
   </w:style>
-  <w:style w:type="paragraph" w:styleId="Listenumros2">
+  <w:style w:type="paragraph" w:styleId="ListNumber2">
     <w:name w:val="List Number 2"/>
     <w:basedOn w:val="Normal"/>
     <w:uiPriority w:val="99"/>
@@ -3042,7 +2687,7 @@
       <w:contextualSpacing/>
     </w:pPr>
   </w:style>
-  <w:style w:type="paragraph" w:styleId="Listenumros3">
+  <w:style w:type="paragraph" w:styleId="ListNumber3">
     <w:name w:val="List Number 3"/>
     <w:basedOn w:val="Normal"/>
     <w:uiPriority w:val="99"/>
@@ -3055,7 +2700,7 @@
       <w:contextualSpacing/>
     </w:pPr>
   </w:style>
-  <w:style w:type="paragraph" w:styleId="Listecontinue">
+  <w:style w:type="paragraph" w:styleId="ListContinue">
     <w:name w:val="List Continue"/>
     <w:basedOn w:val="Normal"/>
     <w:uiPriority w:val="99"/>
@@ -3067,7 +2712,7 @@
       <w:contextualSpacing/>
     </w:pPr>
   </w:style>
-  <w:style w:type="paragraph" w:styleId="Listecontinue2">
+  <w:style w:type="paragraph" w:styleId="ListContinue2">
     <w:name w:val="List Continue 2"/>
     <w:basedOn w:val="Normal"/>
     <w:uiPriority w:val="99"/>
@@ -3079,7 +2724,7 @@
       <w:contextualSpacing/>
     </w:pPr>
   </w:style>
-  <w:style w:type="paragraph" w:styleId="Listecontinue3">
+  <w:style w:type="paragraph" w:styleId="ListContinue3">
     <w:name w:val="List Continue 3"/>
     <w:basedOn w:val="Normal"/>
     <w:uiPriority w:val="99"/>
@@ -3091,9 +2736,9 @@
       <w:contextualSpacing/>
     </w:pPr>
   </w:style>
-  <w:style w:type="paragraph" w:styleId="Textedemacro">
+  <w:style w:type="paragraph" w:styleId="MacroText">
     <w:name w:val="macro"/>
-    <w:link w:val="TextedemacroCar"/>
+    <w:link w:val="MacroTextChar"/>
     <w:uiPriority w:val="99"/>
     <w:unhideWhenUsed/>
     <w:rsid w:val="0029639D"/>
@@ -3114,10 +2759,10 @@
       <w:szCs w:val="20"/>
     </w:rPr>
   </w:style>
-  <w:style w:type="character" w:customStyle="1" w:styleId="TextedemacroCar">
-    <w:name w:val="Texte de macro Car"/>
-    <w:basedOn w:val="Policepardfaut"/>
-    <w:link w:val="Textedemacro"/>
+  <w:style w:type="character" w:customStyle="1" w:styleId="MacroTextChar">
+    <w:name w:val="Macro Text Char"/>
+    <w:basedOn w:val="DefaultParagraphFont"/>
+    <w:link w:val="MacroText"/>
     <w:uiPriority w:val="99"/>
     <w:rsid w:val="0029639D"/>
     <w:rPr>
@@ -3126,11 +2771,11 @@
       <w:szCs w:val="20"/>
     </w:rPr>
   </w:style>
-  <w:style w:type="paragraph" w:styleId="Citation">
+  <w:style w:type="paragraph" w:styleId="Quote">
     <w:name w:val="Quote"/>
     <w:basedOn w:val="Normal"/>
     <w:next w:val="Normal"/>
-    <w:link w:val="CitationCar"/>
+    <w:link w:val="QuoteChar"/>
     <w:uiPriority w:val="29"/>
     <w:qFormat/>
     <w:rsid w:val="00FC693F"/>
@@ -3140,10 +2785,10 @@
       <w:color w:val="000000" w:themeColor="text1"/>
     </w:rPr>
   </w:style>
-  <w:style w:type="character" w:customStyle="1" w:styleId="CitationCar">
-    <w:name w:val="Citation Car"/>
-    <w:basedOn w:val="Policepardfaut"/>
-    <w:link w:val="Citation"/>
+  <w:style w:type="character" w:customStyle="1" w:styleId="QuoteChar">
+    <w:name w:val="Quote Char"/>
+    <w:basedOn w:val="DefaultParagraphFont"/>
+    <w:link w:val="Quote"/>
     <w:uiPriority w:val="29"/>
     <w:rsid w:val="00FC693F"/>
     <w:rPr>
@@ -3152,10 +2797,10 @@
       <w:color w:val="000000" w:themeColor="text1"/>
     </w:rPr>
   </w:style>
-  <w:style w:type="character" w:customStyle="1" w:styleId="Titre4Car">
-    <w:name w:val="Titre 4 Car"/>
-    <w:basedOn w:val="Policepardfaut"/>
-    <w:link w:val="Titre4"/>
+  <w:style w:type="character" w:customStyle="1" w:styleId="Heading4Char">
+    <w:name w:val="Heading 4 Char"/>
+    <w:basedOn w:val="DefaultParagraphFont"/>
+    <w:link w:val="Heading4"/>
     <w:uiPriority w:val="9"/>
     <w:semiHidden/>
     <w:rsid w:val="00FC693F"/>
@@ -3168,10 +2813,10 @@
       <w:color w:val="4F81BD" w:themeColor="accent1"/>
     </w:rPr>
   </w:style>
-  <w:style w:type="character" w:customStyle="1" w:styleId="Titre5Car">
-    <w:name w:val="Titre 5 Car"/>
-    <w:basedOn w:val="Policepardfaut"/>
-    <w:link w:val="Titre5"/>
+  <w:style w:type="character" w:customStyle="1" w:styleId="Heading5Char">
+    <w:name w:val="Heading 5 Char"/>
+    <w:basedOn w:val="DefaultParagraphFont"/>
+    <w:link w:val="Heading5"/>
     <w:uiPriority w:val="9"/>
     <w:semiHidden/>
     <w:rsid w:val="00FC693F"/>
@@ -3180,10 +2825,10 @@
       <w:color w:val="243F60" w:themeColor="accent1" w:themeShade="7F"/>
     </w:rPr>
   </w:style>
-  <w:style w:type="character" w:customStyle="1" w:styleId="Titre6Car">
-    <w:name w:val="Titre 6 Car"/>
-    <w:basedOn w:val="Policepardfaut"/>
-    <w:link w:val="Titre6"/>
+  <w:style w:type="character" w:customStyle="1" w:styleId="Heading6Char">
+    <w:name w:val="Heading 6 Char"/>
+    <w:basedOn w:val="DefaultParagraphFont"/>
+    <w:link w:val="Heading6"/>
     <w:uiPriority w:val="9"/>
     <w:semiHidden/>
     <w:rsid w:val="00FC693F"/>
@@ -3194,10 +2839,10 @@
       <w:color w:val="243F60" w:themeColor="accent1" w:themeShade="7F"/>
     </w:rPr>
   </w:style>
-  <w:style w:type="character" w:customStyle="1" w:styleId="Titre7Car">
-    <w:name w:val="Titre 7 Car"/>
-    <w:basedOn w:val="Policepardfaut"/>
-    <w:link w:val="Titre7"/>
+  <w:style w:type="character" w:customStyle="1" w:styleId="Heading7Char">
+    <w:name w:val="Heading 7 Char"/>
+    <w:basedOn w:val="DefaultParagraphFont"/>
+    <w:link w:val="Heading7"/>
     <w:uiPriority w:val="9"/>
     <w:semiHidden/>
     <w:rsid w:val="00FC693F"/>
@@ -3208,10 +2853,10 @@
       <w:color w:val="404040" w:themeColor="text1" w:themeTint="BF"/>
     </w:rPr>
   </w:style>
-  <w:style w:type="character" w:customStyle="1" w:styleId="Titre8Car">
-    <w:name w:val="Titre 8 Car"/>
-    <w:basedOn w:val="Policepardfaut"/>
-    <w:link w:val="Titre8"/>
+  <w:style w:type="character" w:customStyle="1" w:styleId="Heading8Char">
+    <w:name w:val="Heading 8 Char"/>
+    <w:basedOn w:val="DefaultParagraphFont"/>
+    <w:link w:val="Heading8"/>
     <w:uiPriority w:val="9"/>
     <w:semiHidden/>
     <w:rsid w:val="00FC693F"/>
@@ -3222,10 +2867,10 @@
       <w:szCs w:val="20"/>
     </w:rPr>
   </w:style>
-  <w:style w:type="character" w:customStyle="1" w:styleId="Titre9Car">
-    <w:name w:val="Titre 9 Car"/>
-    <w:basedOn w:val="Policepardfaut"/>
-    <w:link w:val="Titre9"/>
+  <w:style w:type="character" w:customStyle="1" w:styleId="Heading9Char">
+    <w:name w:val="Heading 9 Char"/>
+    <w:basedOn w:val="DefaultParagraphFont"/>
+    <w:link w:val="Heading9"/>
     <w:uiPriority w:val="9"/>
     <w:semiHidden/>
     <w:rsid w:val="00FC693F"/>
@@ -3238,7 +2883,7 @@
       <w:szCs w:val="20"/>
     </w:rPr>
   </w:style>
-  <w:style w:type="paragraph" w:styleId="Lgende">
+  <w:style w:type="paragraph" w:styleId="Caption">
     <w:name w:val="caption"/>
     <w:basedOn w:val="Normal"/>
     <w:next w:val="Normal"/>
@@ -3258,9 +2903,9 @@
       <w:szCs w:val="18"/>
     </w:rPr>
   </w:style>
-  <w:style w:type="character" w:styleId="lev">
+  <w:style w:type="character" w:styleId="Strong">
     <w:name w:val="Strong"/>
-    <w:basedOn w:val="Policepardfaut"/>
+    <w:basedOn w:val="DefaultParagraphFont"/>
     <w:uiPriority w:val="22"/>
     <w:qFormat/>
     <w:rsid w:val="00FC693F"/>
@@ -3269,9 +2914,9 @@
       <w:bCs/>
     </w:rPr>
   </w:style>
-  <w:style w:type="character" w:styleId="Accentuation">
+  <w:style w:type="character" w:styleId="Emphasis">
     <w:name w:val="Emphasis"/>
-    <w:basedOn w:val="Policepardfaut"/>
+    <w:basedOn w:val="DefaultParagraphFont"/>
     <w:uiPriority w:val="20"/>
     <w:qFormat/>
     <w:rsid w:val="00FC693F"/>
@@ -3280,11 +2925,11 @@
       <w:iCs/>
     </w:rPr>
   </w:style>
-  <w:style w:type="paragraph" w:styleId="Citationintense">
+  <w:style w:type="paragraph" w:styleId="IntenseQuote">
     <w:name w:val="Intense Quote"/>
     <w:basedOn w:val="Normal"/>
     <w:next w:val="Normal"/>
-    <w:link w:val="CitationintenseCar"/>
+    <w:link w:val="IntenseQuoteChar"/>
     <w:uiPriority w:val="30"/>
     <w:qFormat/>
     <w:rsid w:val="00FC693F"/>
@@ -3303,10 +2948,10 @@
       <w:color w:val="4F81BD" w:themeColor="accent1"/>
     </w:rPr>
   </w:style>
-  <w:style w:type="character" w:customStyle="1" w:styleId="CitationintenseCar">
-    <w:name w:val="Citation intense Car"/>
-    <w:basedOn w:val="Policepardfaut"/>
-    <w:link w:val="Citationintense"/>
+  <w:style w:type="character" w:customStyle="1" w:styleId="IntenseQuoteChar">
+    <w:name w:val="Intense Quote Char"/>
+    <w:basedOn w:val="DefaultParagraphFont"/>
+    <w:link w:val="IntenseQuote"/>
     <w:uiPriority w:val="30"/>
     <w:rsid w:val="00FC693F"/>
     <w:rPr>
@@ -3317,9 +2962,9 @@
       <w:color w:val="4F81BD" w:themeColor="accent1"/>
     </w:rPr>
   </w:style>
-  <w:style w:type="character" w:styleId="Accentuationlgre">
+  <w:style w:type="character" w:styleId="SubtleEmphasis">
     <w:name w:val="Subtle Emphasis"/>
-    <w:basedOn w:val="Policepardfaut"/>
+    <w:basedOn w:val="DefaultParagraphFont"/>
     <w:uiPriority w:val="19"/>
     <w:qFormat/>
     <w:rsid w:val="00FC693F"/>
@@ -3329,9 +2974,9 @@
       <w:color w:val="808080" w:themeColor="text1" w:themeTint="7F"/>
     </w:rPr>
   </w:style>
-  <w:style w:type="character" w:styleId="Accentuationintense">
+  <w:style w:type="character" w:styleId="IntenseEmphasis">
     <w:name w:val="Intense Emphasis"/>
-    <w:basedOn w:val="Policepardfaut"/>
+    <w:basedOn w:val="DefaultParagraphFont"/>
     <w:uiPriority w:val="21"/>
     <w:qFormat/>
     <w:rsid w:val="00FC693F"/>
@@ -3343,9 +2988,9 @@
       <w:color w:val="4F81BD" w:themeColor="accent1"/>
     </w:rPr>
   </w:style>
-  <w:style w:type="character" w:styleId="Rfrencelgre">
+  <w:style w:type="character" w:styleId="SubtleReference">
     <w:name w:val="Subtle Reference"/>
-    <w:basedOn w:val="Policepardfaut"/>
+    <w:basedOn w:val="DefaultParagraphFont"/>
     <w:uiPriority w:val="31"/>
     <w:qFormat/>
     <w:rsid w:val="00FC693F"/>
@@ -3355,9 +3000,9 @@
       <w:u w:val="single"/>
     </w:rPr>
   </w:style>
-  <w:style w:type="character" w:styleId="Rfrenceintense">
+  <w:style w:type="character" w:styleId="IntenseReference">
     <w:name w:val="Intense Reference"/>
-    <w:basedOn w:val="Policepardfaut"/>
+    <w:basedOn w:val="DefaultParagraphFont"/>
     <w:uiPriority w:val="32"/>
     <w:qFormat/>
     <w:rsid w:val="00FC693F"/>
@@ -3370,9 +3015,9 @@
       <w:u w:val="single"/>
     </w:rPr>
   </w:style>
-  <w:style w:type="character" w:styleId="Titredulivre">
+  <w:style w:type="character" w:styleId="BookTitle">
     <w:name w:val="Book Title"/>
-    <w:basedOn w:val="Policepardfaut"/>
+    <w:basedOn w:val="DefaultParagraphFont"/>
     <w:uiPriority w:val="33"/>
     <w:qFormat/>
     <w:rsid w:val="00FC693F"/>
@@ -3383,9 +3028,9 @@
       <w:spacing w:val="5"/>
     </w:rPr>
   </w:style>
-  <w:style w:type="paragraph" w:styleId="En-ttedetabledesmatires">
+  <w:style w:type="paragraph" w:styleId="TOCHeading">
     <w:name w:val="TOC Heading"/>
-    <w:basedOn w:val="Titre1"/>
+    <w:basedOn w:val="Heading1"/>
     <w:next w:val="Normal"/>
     <w:uiPriority w:val="39"/>
     <w:semiHidden/>
@@ -3396,9 +3041,9 @@
       <w:outlineLvl w:val="9"/>
     </w:pPr>
   </w:style>
-  <w:style w:type="table" w:styleId="Grilledutableau">
+  <w:style w:type="table" w:styleId="TableGrid">
     <w:name w:val="Table Grid"/>
-    <w:basedOn w:val="TableauNormal"/>
+    <w:basedOn w:val="TableNormal"/>
     <w:uiPriority w:val="59"/>
     <w:rsid w:val="00FC693F"/>
     <w:pPr>
@@ -3415,9 +3060,9 @@
       </w:tblBorders>
     </w:tblPr>
   </w:style>
-  <w:style w:type="table" w:styleId="Ombrageclair">
+  <w:style w:type="table" w:styleId="LightShading">
     <w:name w:val="Light Shading"/>
-    <w:basedOn w:val="TableauNormal"/>
+    <w:basedOn w:val="TableNormal"/>
     <w:uiPriority w:val="60"/>
     <w:rsid w:val="00FC693F"/>
     <w:pPr>
@@ -3511,9 +3156,9 @@
       </w:tcPr>
     </w:tblStylePr>
   </w:style>
-  <w:style w:type="table" w:styleId="Trameclaire-Accent1">
+  <w:style w:type="table" w:styleId="LightShading-Accent1">
     <w:name w:val="Light Shading Accent 1"/>
-    <w:basedOn w:val="TableauNormal"/>
+    <w:basedOn w:val="TableNormal"/>
     <w:uiPriority w:val="60"/>
     <w:rsid w:val="00FC693F"/>
     <w:pPr>
@@ -3607,9 +3252,9 @@
       </w:tcPr>
     </w:tblStylePr>
   </w:style>
-  <w:style w:type="table" w:styleId="Trameclaire-Accent2">
+  <w:style w:type="table" w:styleId="LightShading-Accent2">
     <w:name w:val="Light Shading Accent 2"/>
-    <w:basedOn w:val="TableauNormal"/>
+    <w:basedOn w:val="TableNormal"/>
     <w:uiPriority w:val="60"/>
     <w:rsid w:val="00FC693F"/>
     <w:pPr>
@@ -3703,9 +3348,9 @@
       </w:tcPr>
     </w:tblStylePr>
   </w:style>
-  <w:style w:type="table" w:styleId="Trameclaire-Accent3">
+  <w:style w:type="table" w:styleId="LightShading-Accent3">
     <w:name w:val="Light Shading Accent 3"/>
-    <w:basedOn w:val="TableauNormal"/>
+    <w:basedOn w:val="TableNormal"/>
     <w:uiPriority w:val="60"/>
     <w:rsid w:val="00FC693F"/>
     <w:pPr>
@@ -3799,9 +3444,9 @@
       </w:tcPr>
     </w:tblStylePr>
   </w:style>
-  <w:style w:type="table" w:styleId="Trameclaire-Accent4">
+  <w:style w:type="table" w:styleId="LightShading-Accent4">
     <w:name w:val="Light Shading Accent 4"/>
-    <w:basedOn w:val="TableauNormal"/>
+    <w:basedOn w:val="TableNormal"/>
     <w:uiPriority w:val="60"/>
     <w:rsid w:val="00FC693F"/>
     <w:pPr>
@@ -3895,9 +3540,9 @@
       </w:tcPr>
     </w:tblStylePr>
   </w:style>
-  <w:style w:type="table" w:styleId="Trameclaire-Accent5">
+  <w:style w:type="table" w:styleId="LightShading-Accent5">
     <w:name w:val="Light Shading Accent 5"/>
-    <w:basedOn w:val="TableauNormal"/>
+    <w:basedOn w:val="TableNormal"/>
     <w:uiPriority w:val="60"/>
     <w:rsid w:val="00FC693F"/>
     <w:pPr>
@@ -3991,9 +3636,9 @@
       </w:tcPr>
     </w:tblStylePr>
   </w:style>
-  <w:style w:type="table" w:styleId="Trameclaire-Accent6">
+  <w:style w:type="table" w:styleId="LightShading-Accent6">
     <w:name w:val="Light Shading Accent 6"/>
-    <w:basedOn w:val="TableauNormal"/>
+    <w:basedOn w:val="TableNormal"/>
     <w:uiPriority w:val="60"/>
     <w:rsid w:val="00FC693F"/>
     <w:pPr>
@@ -4087,9 +3732,9 @@
       </w:tcPr>
     </w:tblStylePr>
   </w:style>
-  <w:style w:type="table" w:styleId="Listeclaire">
+  <w:style w:type="table" w:styleId="LightList">
     <w:name w:val="Light List"/>
-    <w:basedOn w:val="TableauNormal"/>
+    <w:basedOn w:val="TableNormal"/>
     <w:uiPriority w:val="61"/>
     <w:rsid w:val="00FC693F"/>
     <w:pPr>
@@ -4172,9 +3817,9 @@
       </w:tcPr>
     </w:tblStylePr>
   </w:style>
-  <w:style w:type="table" w:styleId="Listeclaire-Accent1">
+  <w:style w:type="table" w:styleId="LightList-Accent1">
     <w:name w:val="Light List Accent 1"/>
-    <w:basedOn w:val="TableauNormal"/>
+    <w:basedOn w:val="TableNormal"/>
     <w:uiPriority w:val="61"/>
     <w:rsid w:val="00FC693F"/>
     <w:pPr>
@@ -4257,9 +3902,9 @@
       </w:tcPr>
     </w:tblStylePr>
   </w:style>
-  <w:style w:type="table" w:styleId="Listeclaire-Accent2">
+  <w:style w:type="table" w:styleId="LightList-Accent2">
     <w:name w:val="Light List Accent 2"/>
-    <w:basedOn w:val="TableauNormal"/>
+    <w:basedOn w:val="TableNormal"/>
     <w:uiPriority w:val="61"/>
     <w:rsid w:val="00CB0664"/>
     <w:pPr>
@@ -4342,9 +3987,9 @@
       </w:tcPr>
     </w:tblStylePr>
   </w:style>
-  <w:style w:type="table" w:styleId="Listeclaire-Accent3">
+  <w:style w:type="table" w:styleId="LightList-Accent3">
     <w:name w:val="Light List Accent 3"/>
-    <w:basedOn w:val="TableauNormal"/>
+    <w:basedOn w:val="TableNormal"/>
     <w:uiPriority w:val="61"/>
     <w:rsid w:val="00CB0664"/>
     <w:pPr>
@@ -4427,9 +4072,9 @@
       </w:tcPr>
     </w:tblStylePr>
   </w:style>
-  <w:style w:type="table" w:styleId="Listeclaire-Accent4">
+  <w:style w:type="table" w:styleId="LightList-Accent4">
     <w:name w:val="Light List Accent 4"/>
-    <w:basedOn w:val="TableauNormal"/>
+    <w:basedOn w:val="TableNormal"/>
     <w:uiPriority w:val="61"/>
     <w:rsid w:val="00CB0664"/>
     <w:pPr>
@@ -4512,9 +4157,9 @@
       </w:tcPr>
     </w:tblStylePr>
   </w:style>
-  <w:style w:type="table" w:styleId="Listeclaire-Accent5">
+  <w:style w:type="table" w:styleId="LightList-Accent5">
     <w:name w:val="Light List Accent 5"/>
-    <w:basedOn w:val="TableauNormal"/>
+    <w:basedOn w:val="TableNormal"/>
     <w:uiPriority w:val="61"/>
     <w:rsid w:val="00CB0664"/>
     <w:pPr>
@@ -4597,9 +4242,9 @@
       </w:tcPr>
     </w:tblStylePr>
   </w:style>
-  <w:style w:type="table" w:styleId="Listeclaire-Accent6">
+  <w:style w:type="table" w:styleId="LightList-Accent6">
     <w:name w:val="Light List Accent 6"/>
-    <w:basedOn w:val="TableauNormal"/>
+    <w:basedOn w:val="TableNormal"/>
     <w:uiPriority w:val="61"/>
     <w:rsid w:val="00CB0664"/>
     <w:pPr>
@@ -4682,9 +4327,9 @@
       </w:tcPr>
     </w:tblStylePr>
   </w:style>
-  <w:style w:type="table" w:styleId="Grilleclaire">
+  <w:style w:type="table" w:styleId="LightGrid">
     <w:name w:val="Light Grid"/>
-    <w:basedOn w:val="TableauNormal"/>
+    <w:basedOn w:val="TableNormal"/>
     <w:uiPriority w:val="62"/>
     <w:rsid w:val="00CB0664"/>
     <w:pPr>
@@ -4805,9 +4450,9 @@
       </w:tcPr>
     </w:tblStylePr>
   </w:style>
-  <w:style w:type="table" w:styleId="Grilleclaire-Accent1">
+  <w:style w:type="table" w:styleId="LightGrid-Accent1">
     <w:name w:val="Light Grid Accent 1"/>
-    <w:basedOn w:val="TableauNormal"/>
+    <w:basedOn w:val="TableNormal"/>
     <w:uiPriority w:val="62"/>
     <w:rsid w:val="00CB0664"/>
     <w:pPr>
@@ -4928,9 +4573,9 @@
       </w:tcPr>
     </w:tblStylePr>
   </w:style>
-  <w:style w:type="table" w:styleId="Grilleclaire-Accent2">
+  <w:style w:type="table" w:styleId="LightGrid-Accent2">
     <w:name w:val="Light Grid Accent 2"/>
-    <w:basedOn w:val="TableauNormal"/>
+    <w:basedOn w:val="TableNormal"/>
     <w:uiPriority w:val="62"/>
     <w:rsid w:val="00CB0664"/>
     <w:pPr>
@@ -5051,9 +4696,9 @@
       </w:tcPr>
     </w:tblStylePr>
   </w:style>
-  <w:style w:type="table" w:styleId="Grilleclaire-Accent3">
+  <w:style w:type="table" w:styleId="LightGrid-Accent3">
     <w:name w:val="Light Grid Accent 3"/>
-    <w:basedOn w:val="TableauNormal"/>
+    <w:basedOn w:val="TableNormal"/>
     <w:uiPriority w:val="62"/>
     <w:rsid w:val="00CB0664"/>
     <w:pPr>
@@ -5174,9 +4819,9 @@
       </w:tcPr>
     </w:tblStylePr>
   </w:style>
-  <w:style w:type="table" w:styleId="Grilleclaire-Accent4">
+  <w:style w:type="table" w:styleId="LightGrid-Accent4">
     <w:name w:val="Light Grid Accent 4"/>
-    <w:basedOn w:val="TableauNormal"/>
+    <w:basedOn w:val="TableNormal"/>
     <w:uiPriority w:val="62"/>
     <w:rsid w:val="00CB0664"/>
     <w:pPr>
@@ -5297,9 +4942,9 @@
       </w:tcPr>
     </w:tblStylePr>
   </w:style>
-  <w:style w:type="table" w:styleId="Grilleclaire-Accent5">
+  <w:style w:type="table" w:styleId="LightGrid-Accent5">
     <w:name w:val="Light Grid Accent 5"/>
-    <w:basedOn w:val="TableauNormal"/>
+    <w:basedOn w:val="TableNormal"/>
     <w:uiPriority w:val="62"/>
     <w:rsid w:val="00CB0664"/>
     <w:pPr>
@@ -5420,9 +5065,9 @@
       </w:tcPr>
     </w:tblStylePr>
   </w:style>
-  <w:style w:type="table" w:styleId="Grilleclaire-Accent6">
+  <w:style w:type="table" w:styleId="LightGrid-Accent6">
     <w:name w:val="Light Grid Accent 6"/>
-    <w:basedOn w:val="TableauNormal"/>
+    <w:basedOn w:val="TableNormal"/>
     <w:uiPriority w:val="62"/>
     <w:rsid w:val="00CB0664"/>
     <w:pPr>
@@ -5543,9 +5188,9 @@
       </w:tcPr>
     </w:tblStylePr>
   </w:style>
-  <w:style w:type="table" w:styleId="Tramemoyenne1">
+  <w:style w:type="table" w:styleId="MediumShading1">
     <w:name w:val="Medium Shading 1"/>
-    <w:basedOn w:val="TableauNormal"/>
+    <w:basedOn w:val="TableNormal"/>
     <w:uiPriority w:val="63"/>
     <w:rsid w:val="00CB0664"/>
     <w:pPr>
@@ -5642,9 +5287,9 @@
       </w:tcPr>
     </w:tblStylePr>
   </w:style>
-  <w:style w:type="table" w:styleId="Tramemoyenne1-Accent1">
+  <w:style w:type="table" w:styleId="MediumShading1-Accent1">
     <w:name w:val="Medium Shading 1 Accent 1"/>
-    <w:basedOn w:val="TableauNormal"/>
+    <w:basedOn w:val="TableNormal"/>
     <w:uiPriority w:val="63"/>
     <w:rsid w:val="00CB0664"/>
     <w:pPr>
@@ -5741,9 +5386,9 @@
       </w:tcPr>
     </w:tblStylePr>
   </w:style>
-  <w:style w:type="table" w:styleId="Tramemoyenne1-Accent2">
+  <w:style w:type="table" w:styleId="MediumShading1-Accent2">
     <w:name w:val="Medium Shading 1 Accent 2"/>
-    <w:basedOn w:val="TableauNormal"/>
+    <w:basedOn w:val="TableNormal"/>
     <w:uiPriority w:val="63"/>
     <w:rsid w:val="00CB0664"/>
     <w:pPr>
@@ -5840,9 +5485,9 @@
       </w:tcPr>
     </w:tblStylePr>
   </w:style>
-  <w:style w:type="table" w:styleId="Tramemoyenne1-Accent3">
+  <w:style w:type="table" w:styleId="MediumShading1-Accent3">
     <w:name w:val="Medium Shading 1 Accent 3"/>
-    <w:basedOn w:val="TableauNormal"/>
+    <w:basedOn w:val="TableNormal"/>
     <w:uiPriority w:val="63"/>
     <w:rsid w:val="00CB0664"/>
     <w:pPr>
@@ -5939,9 +5584,9 @@
       </w:tcPr>
     </w:tblStylePr>
   </w:style>
-  <w:style w:type="table" w:styleId="Tramemoyenne1-Accent4">
+  <w:style w:type="table" w:styleId="MediumShading1-Accent4">
     <w:name w:val="Medium Shading 1 Accent 4"/>
-    <w:basedOn w:val="TableauNormal"/>
+    <w:basedOn w:val="TableNormal"/>
     <w:uiPriority w:val="63"/>
     <w:rsid w:val="00CB0664"/>
     <w:pPr>
@@ -6038,9 +5683,9 @@
       </w:tcPr>
     </w:tblStylePr>
   </w:style>
-  <w:style w:type="table" w:styleId="Tramemoyenne1-Accent5">
+  <w:style w:type="table" w:styleId="MediumShading1-Accent5">
     <w:name w:val="Medium Shading 1 Accent 5"/>
-    <w:basedOn w:val="TableauNormal"/>
+    <w:basedOn w:val="TableNormal"/>
     <w:uiPriority w:val="63"/>
     <w:rsid w:val="00CB0664"/>
     <w:pPr>
@@ -6137,9 +5782,9 @@
       </w:tcPr>
     </w:tblStylePr>
   </w:style>
-  <w:style w:type="table" w:styleId="Tramemoyenne1-Accent6">
+  <w:style w:type="table" w:styleId="MediumShading1-Accent6">
     <w:name w:val="Medium Shading 1 Accent 6"/>
-    <w:basedOn w:val="TableauNormal"/>
+    <w:basedOn w:val="TableNormal"/>
     <w:uiPriority w:val="63"/>
     <w:rsid w:val="00CB0664"/>
     <w:pPr>
@@ -6236,9 +5881,9 @@
       </w:tcPr>
     </w:tblStylePr>
   </w:style>
-  <w:style w:type="table" w:styleId="Tramemoyenne2">
+  <w:style w:type="table" w:styleId="MediumShading2">
     <w:name w:val="Medium Shading 2"/>
-    <w:basedOn w:val="TableauNormal"/>
+    <w:basedOn w:val="TableNormal"/>
     <w:uiPriority w:val="64"/>
     <w:rsid w:val="00CB0664"/>
     <w:pPr>
@@ -6378,9 +6023,9 @@
       </w:tcPr>
     </w:tblStylePr>
   </w:style>
-  <w:style w:type="table" w:styleId="Tramemoyenne2-Accent1">
+  <w:style w:type="table" w:styleId="MediumShading2-Accent1">
     <w:name w:val="Medium Shading 2 Accent 1"/>
-    <w:basedOn w:val="TableauNormal"/>
+    <w:basedOn w:val="TableNormal"/>
     <w:uiPriority w:val="64"/>
     <w:rsid w:val="00CB0664"/>
     <w:pPr>
@@ -6520,9 +6165,9 @@
       </w:tcPr>
     </w:tblStylePr>
   </w:style>
-  <w:style w:type="table" w:styleId="Tramemoyenne2-Accent2">
+  <w:style w:type="table" w:styleId="MediumShading2-Accent2">
     <w:name w:val="Medium Shading 2 Accent 2"/>
-    <w:basedOn w:val="TableauNormal"/>
+    <w:basedOn w:val="TableNormal"/>
     <w:uiPriority w:val="64"/>
     <w:rsid w:val="00CB0664"/>
     <w:pPr>
@@ -6662,9 +6307,9 @@
       </w:tcPr>
     </w:tblStylePr>
   </w:style>
-  <w:style w:type="table" w:styleId="Tramemoyenne2-Accent3">
+  <w:style w:type="table" w:styleId="MediumShading2-Accent3">
     <w:name w:val="Medium Shading 2 Accent 3"/>
-    <w:basedOn w:val="TableauNormal"/>
+    <w:basedOn w:val="TableNormal"/>
     <w:uiPriority w:val="64"/>
     <w:rsid w:val="00CB0664"/>
     <w:pPr>
@@ -6804,9 +6449,9 @@
       </w:tcPr>
     </w:tblStylePr>
   </w:style>
-  <w:style w:type="table" w:styleId="Tramemoyenne2-Accent4">
+  <w:style w:type="table" w:styleId="MediumShading2-Accent4">
     <w:name w:val="Medium Shading 2 Accent 4"/>
-    <w:basedOn w:val="TableauNormal"/>
+    <w:basedOn w:val="TableNormal"/>
     <w:uiPriority w:val="64"/>
     <w:rsid w:val="00CB0664"/>
     <w:pPr>
@@ -6946,9 +6591,9 @@
       </w:tcPr>
     </w:tblStylePr>
   </w:style>
-  <w:style w:type="table" w:styleId="Tramemoyenne2-Accent5">
+  <w:style w:type="table" w:styleId="MediumShading2-Accent5">
     <w:name w:val="Medium Shading 2 Accent 5"/>
-    <w:basedOn w:val="TableauNormal"/>
+    <w:basedOn w:val="TableNormal"/>
     <w:uiPriority w:val="64"/>
     <w:rsid w:val="00CB0664"/>
     <w:pPr>
@@ -7088,9 +6733,9 @@
       </w:tcPr>
     </w:tblStylePr>
   </w:style>
-  <w:style w:type="table" w:styleId="Tramemoyenne2-Accent6">
+  <w:style w:type="table" w:styleId="MediumShading2-Accent6">
     <w:name w:val="Medium Shading 2 Accent 6"/>
-    <w:basedOn w:val="TableauNormal"/>
+    <w:basedOn w:val="TableNormal"/>
     <w:uiPriority w:val="64"/>
     <w:rsid w:val="00CB0664"/>
     <w:pPr>
@@ -7230,9 +6875,9 @@
       </w:tcPr>
     </w:tblStylePr>
   </w:style>
-  <w:style w:type="table" w:styleId="Listemoyenne1">
+  <w:style w:type="table" w:styleId="MediumList1">
     <w:name w:val="Medium List 1"/>
-    <w:basedOn w:val="TableauNormal"/>
+    <w:basedOn w:val="TableNormal"/>
     <w:uiPriority w:val="65"/>
     <w:rsid w:val="00CB0664"/>
     <w:pPr>
@@ -7307,9 +6952,9 @@
       </w:tcPr>
     </w:tblStylePr>
   </w:style>
-  <w:style w:type="table" w:styleId="Listemoyenne1-Accent1">
+  <w:style w:type="table" w:styleId="MediumList1-Accent1">
     <w:name w:val="Medium List 1 Accent 1"/>
-    <w:basedOn w:val="TableauNormal"/>
+    <w:basedOn w:val="TableNormal"/>
     <w:uiPriority w:val="65"/>
     <w:rsid w:val="00CB0664"/>
     <w:pPr>
@@ -7384,9 +7029,9 @@
       </w:tcPr>
     </w:tblStylePr>
   </w:style>
-  <w:style w:type="table" w:styleId="Listemoyenne1-Accent2">
+  <w:style w:type="table" w:styleId="MediumList1-Accent2">
     <w:name w:val="Medium List 1 Accent 2"/>
-    <w:basedOn w:val="TableauNormal"/>
+    <w:basedOn w:val="TableNormal"/>
     <w:uiPriority w:val="65"/>
     <w:rsid w:val="00CB0664"/>
     <w:pPr>
@@ -7461,9 +7106,9 @@
       </w:tcPr>
     </w:tblStylePr>
   </w:style>
-  <w:style w:type="table" w:styleId="Listemoyenne1-Accent3">
+  <w:style w:type="table" w:styleId="MediumList1-Accent3">
     <w:name w:val="Medium List 1 Accent 3"/>
-    <w:basedOn w:val="TableauNormal"/>
+    <w:basedOn w:val="TableNormal"/>
     <w:uiPriority w:val="65"/>
     <w:rsid w:val="00CB0664"/>
     <w:pPr>
@@ -7538,9 +7183,9 @@
       </w:tcPr>
     </w:tblStylePr>
   </w:style>
-  <w:style w:type="table" w:styleId="Listemoyenne1-Accent4">
+  <w:style w:type="table" w:styleId="MediumList1-Accent4">
     <w:name w:val="Medium List 1 Accent 4"/>
-    <w:basedOn w:val="TableauNormal"/>
+    <w:basedOn w:val="TableNormal"/>
     <w:uiPriority w:val="65"/>
     <w:rsid w:val="00CB0664"/>
     <w:pPr>
@@ -7615,9 +7260,9 @@
       </w:tcPr>
     </w:tblStylePr>
   </w:style>
-  <w:style w:type="table" w:styleId="Listemoyenne1-Accent5">
+  <w:style w:type="table" w:styleId="MediumList1-Accent5">
     <w:name w:val="Medium List 1 Accent 5"/>
-    <w:basedOn w:val="TableauNormal"/>
+    <w:basedOn w:val="TableNormal"/>
     <w:uiPriority w:val="65"/>
     <w:rsid w:val="00CB0664"/>
     <w:pPr>
@@ -7692,9 +7337,9 @@
       </w:tcPr>
     </w:tblStylePr>
   </w:style>
-  <w:style w:type="table" w:styleId="Listemoyenne1-Accent6">
+  <w:style w:type="table" w:styleId="MediumList1-Accent6">
     <w:name w:val="Medium List 1 Accent 6"/>
-    <w:basedOn w:val="TableauNormal"/>
+    <w:basedOn w:val="TableNormal"/>
     <w:uiPriority w:val="65"/>
     <w:rsid w:val="00CB0664"/>
     <w:pPr>
@@ -7769,9 +7414,9 @@
       </w:tcPr>
     </w:tblStylePr>
   </w:style>
-  <w:style w:type="table" w:styleId="Listemoyenne2">
+  <w:style w:type="table" w:styleId="MediumList2">
     <w:name w:val="Medium List 2"/>
-    <w:basedOn w:val="TableauNormal"/>
+    <w:basedOn w:val="TableNormal"/>
     <w:uiPriority w:val="66"/>
     <w:rsid w:val="00CB0664"/>
     <w:pPr>
@@ -7890,9 +7535,9 @@
       </w:tcPr>
     </w:tblStylePr>
   </w:style>
-  <w:style w:type="table" w:styleId="Listemoyenne2-Accent1">
+  <w:style w:type="table" w:styleId="MediumList2-Accent1">
     <w:name w:val="Medium List 2 Accent 1"/>
-    <w:basedOn w:val="TableauNormal"/>
+    <w:basedOn w:val="TableNormal"/>
     <w:uiPriority w:val="66"/>
     <w:rsid w:val="00CB0664"/>
     <w:pPr>
@@ -8011,9 +7656,9 @@
       </w:tcPr>
     </w:tblStylePr>
   </w:style>
-  <w:style w:type="table" w:styleId="Listemoyenne2-Accent2">
+  <w:style w:type="table" w:styleId="MediumList2-Accent2">
     <w:name w:val="Medium List 2 Accent 2"/>
-    <w:basedOn w:val="TableauNormal"/>
+    <w:basedOn w:val="TableNormal"/>
     <w:uiPriority w:val="66"/>
     <w:rsid w:val="00CB0664"/>
     <w:pPr>
@@ -8132,9 +7777,9 @@
       </w:tcPr>
     </w:tblStylePr>
   </w:style>
-  <w:style w:type="table" w:styleId="Listemoyenne2-Accent3">
+  <w:style w:type="table" w:styleId="MediumList2-Accent3">
     <w:name w:val="Medium List 2 Accent 3"/>
-    <w:basedOn w:val="TableauNormal"/>
+    <w:basedOn w:val="TableNormal"/>
     <w:uiPriority w:val="66"/>
     <w:rsid w:val="00CB0664"/>
     <w:pPr>
@@ -8253,9 +7898,9 @@
       </w:tcPr>
     </w:tblStylePr>
   </w:style>
-  <w:style w:type="table" w:styleId="Listemoyenne2-Accent4">
+  <w:style w:type="table" w:styleId="MediumList2-Accent4">
     <w:name w:val="Medium List 2 Accent 4"/>
-    <w:basedOn w:val="TableauNormal"/>
+    <w:basedOn w:val="TableNormal"/>
     <w:uiPriority w:val="66"/>
     <w:rsid w:val="00CB0664"/>
     <w:pPr>
@@ -8374,9 +8019,9 @@
       </w:tcPr>
     </w:tblStylePr>
   </w:style>
-  <w:style w:type="table" w:styleId="Listemoyenne2-Accent5">
+  <w:style w:type="table" w:styleId="MediumList2-Accent5">
     <w:name w:val="Medium List 2 Accent 5"/>
-    <w:basedOn w:val="TableauNormal"/>
+    <w:basedOn w:val="TableNormal"/>
     <w:uiPriority w:val="66"/>
     <w:rsid w:val="00CB0664"/>
     <w:pPr>
@@ -8495,9 +8140,9 @@
       </w:tcPr>
     </w:tblStylePr>
   </w:style>
-  <w:style w:type="table" w:styleId="Listemoyenne2-Accent6">
+  <w:style w:type="table" w:styleId="MediumList2-Accent6">
     <w:name w:val="Medium List 2 Accent 6"/>
-    <w:basedOn w:val="TableauNormal"/>
+    <w:basedOn w:val="TableNormal"/>
     <w:uiPriority w:val="66"/>
     <w:rsid w:val="00CB0664"/>
     <w:pPr>
@@ -8616,9 +8261,9 @@
       </w:tcPr>
     </w:tblStylePr>
   </w:style>
-  <w:style w:type="table" w:styleId="Grillemoyenne1">
+  <w:style w:type="table" w:styleId="MediumGrid1">
     <w:name w:val="Medium Grid 1"/>
-    <w:basedOn w:val="TableauNormal"/>
+    <w:basedOn w:val="TableNormal"/>
     <w:uiPriority w:val="67"/>
     <w:rsid w:val="00CB0664"/>
     <w:pPr>
@@ -8682,9 +8327,9 @@
       </w:tcPr>
     </w:tblStylePr>
   </w:style>
-  <w:style w:type="table" w:styleId="Grillemoyenne1-Accent1">
+  <w:style w:type="table" w:styleId="MediumGrid1-Accent1">
     <w:name w:val="Medium Grid 1 Accent 1"/>
-    <w:basedOn w:val="TableauNormal"/>
+    <w:basedOn w:val="TableNormal"/>
     <w:uiPriority w:val="67"/>
     <w:rsid w:val="00CB0664"/>
     <w:pPr>
@@ -8748,9 +8393,9 @@
       </w:tcPr>
     </w:tblStylePr>
   </w:style>
-  <w:style w:type="table" w:styleId="Grillemoyenne1-Accent2">
+  <w:style w:type="table" w:styleId="MediumGrid1-Accent2">
     <w:name w:val="Medium Grid 1 Accent 2"/>
-    <w:basedOn w:val="TableauNormal"/>
+    <w:basedOn w:val="TableNormal"/>
     <w:uiPriority w:val="67"/>
     <w:rsid w:val="00CB0664"/>
     <w:pPr>
@@ -8814,9 +8459,9 @@
       </w:tcPr>
     </w:tblStylePr>
   </w:style>
-  <w:style w:type="table" w:styleId="Grillemoyenne1-Accent3">
+  <w:style w:type="table" w:styleId="MediumGrid1-Accent3">
     <w:name w:val="Medium Grid 1 Accent 3"/>
-    <w:basedOn w:val="TableauNormal"/>
+    <w:basedOn w:val="TableNormal"/>
     <w:uiPriority w:val="67"/>
     <w:rsid w:val="00CB0664"/>
     <w:pPr>
@@ -8880,9 +8525,9 @@
       </w:tcPr>
     </w:tblStylePr>
   </w:style>
-  <w:style w:type="table" w:styleId="Grillemoyenne1-Accent4">
+  <w:style w:type="table" w:styleId="MediumGrid1-Accent4">
     <w:name w:val="Medium Grid 1 Accent 4"/>
-    <w:basedOn w:val="TableauNormal"/>
+    <w:basedOn w:val="TableNormal"/>
     <w:uiPriority w:val="67"/>
     <w:rsid w:val="00CB0664"/>
     <w:pPr>
@@ -8946,9 +8591,9 @@
       </w:tcPr>
     </w:tblStylePr>
   </w:style>
-  <w:style w:type="table" w:styleId="Grillemoyenne1-Accent5">
+  <w:style w:type="table" w:styleId="MediumGrid1-Accent5">
     <w:name w:val="Medium Grid 1 Accent 5"/>
-    <w:basedOn w:val="TableauNormal"/>
+    <w:basedOn w:val="TableNormal"/>
     <w:uiPriority w:val="67"/>
     <w:rsid w:val="00CB0664"/>
     <w:pPr>
@@ -9012,9 +8657,9 @@
       </w:tcPr>
     </w:tblStylePr>
   </w:style>
-  <w:style w:type="table" w:styleId="Grillemoyenne1-Accent6">
+  <w:style w:type="table" w:styleId="MediumGrid1-Accent6">
     <w:name w:val="Medium Grid 1 Accent 6"/>
-    <w:basedOn w:val="TableauNormal"/>
+    <w:basedOn w:val="TableNormal"/>
     <w:uiPriority w:val="67"/>
     <w:rsid w:val="00CB0664"/>
     <w:pPr>
@@ -9078,9 +8723,9 @@
       </w:tcPr>
     </w:tblStylePr>
   </w:style>
-  <w:style w:type="table" w:styleId="Grillemoyenne2">
+  <w:style w:type="table" w:styleId="MediumGrid2">
     <w:name w:val="Medium Grid 2"/>
-    <w:basedOn w:val="TableauNormal"/>
+    <w:basedOn w:val="TableNormal"/>
     <w:uiPriority w:val="68"/>
     <w:rsid w:val="00CB0664"/>
     <w:pPr>
@@ -9196,9 +8841,9 @@
       </w:tcPr>
     </w:tblStylePr>
   </w:style>
-  <w:style w:type="table" w:styleId="Grillemoyenne2-Accent1">
+  <w:style w:type="table" w:styleId="MediumGrid2-Accent1">
     <w:name w:val="Medium Grid 2 Accent 1"/>
-    <w:basedOn w:val="TableauNormal"/>
+    <w:basedOn w:val="TableNormal"/>
     <w:uiPriority w:val="68"/>
     <w:rsid w:val="00CB0664"/>
     <w:pPr>
@@ -9314,9 +8959,9 @@
       </w:tcPr>
     </w:tblStylePr>
   </w:style>
-  <w:style w:type="table" w:styleId="Grillemoyenne2-Accent2">
+  <w:style w:type="table" w:styleId="MediumGrid2-Accent2">
     <w:name w:val="Medium Grid 2 Accent 2"/>
-    <w:basedOn w:val="TableauNormal"/>
+    <w:basedOn w:val="TableNormal"/>
     <w:uiPriority w:val="68"/>
     <w:rsid w:val="00CB0664"/>
     <w:pPr>
@@ -9432,9 +9077,9 @@
       </w:tcPr>
     </w:tblStylePr>
   </w:style>
-  <w:style w:type="table" w:styleId="Grillemoyenne2-Accent3">
+  <w:style w:type="table" w:styleId="MediumGrid2-Accent3">
     <w:name w:val="Medium Grid 2 Accent 3"/>
-    <w:basedOn w:val="TableauNormal"/>
+    <w:basedOn w:val="TableNormal"/>
     <w:uiPriority w:val="68"/>
     <w:rsid w:val="00CB0664"/>
     <w:pPr>
@@ -9550,9 +9195,9 @@
       </w:tcPr>
     </w:tblStylePr>
   </w:style>
-  <w:style w:type="table" w:styleId="Grillemoyenne2-Accent4">
+  <w:style w:type="table" w:styleId="MediumGrid2-Accent4">
     <w:name w:val="Medium Grid 2 Accent 4"/>
-    <w:basedOn w:val="TableauNormal"/>
+    <w:basedOn w:val="TableNormal"/>
     <w:uiPriority w:val="68"/>
     <w:rsid w:val="00CB0664"/>
     <w:pPr>
@@ -9668,9 +9313,9 @@
       </w:tcPr>
     </w:tblStylePr>
   </w:style>
-  <w:style w:type="table" w:styleId="Grillemoyenne2-Accent5">
+  <w:style w:type="table" w:styleId="MediumGrid2-Accent5">
     <w:name w:val="Medium Grid 2 Accent 5"/>
-    <w:basedOn w:val="TableauNormal"/>
+    <w:basedOn w:val="TableNormal"/>
     <w:uiPriority w:val="68"/>
     <w:rsid w:val="00CB0664"/>
     <w:pPr>
@@ -9786,9 +9431,9 @@
       </w:tcPr>
     </w:tblStylePr>
   </w:style>
-  <w:style w:type="table" w:styleId="Grillemoyenne2-Accent6">
+  <w:style w:type="table" w:styleId="MediumGrid2-Accent6">
     <w:name w:val="Medium Grid 2 Accent 6"/>
-    <w:basedOn w:val="TableauNormal"/>
+    <w:basedOn w:val="TableNormal"/>
     <w:uiPriority w:val="68"/>
     <w:rsid w:val="00CB0664"/>
     <w:pPr>
@@ -9904,9 +9549,9 @@
       </w:tcPr>
     </w:tblStylePr>
   </w:style>
-  <w:style w:type="table" w:styleId="Grillemoyenne3">
+  <w:style w:type="table" w:styleId="MediumGrid3">
     <w:name w:val="Medium Grid 3"/>
-    <w:basedOn w:val="TableauNormal"/>
+    <w:basedOn w:val="TableNormal"/>
     <w:uiPriority w:val="69"/>
     <w:rsid w:val="00CB0664"/>
     <w:pPr>
@@ -10038,9 +9683,9 @@
       </w:tcPr>
     </w:tblStylePr>
   </w:style>
-  <w:style w:type="table" w:styleId="Grillemoyenne3-Accent1">
+  <w:style w:type="table" w:styleId="MediumGrid3-Accent1">
     <w:name w:val="Medium Grid 3 Accent 1"/>
-    <w:basedOn w:val="TableauNormal"/>
+    <w:basedOn w:val="TableNormal"/>
     <w:uiPriority w:val="69"/>
     <w:rsid w:val="00CB0664"/>
     <w:pPr>
@@ -10172,9 +9817,9 @@
       </w:tcPr>
     </w:tblStylePr>
   </w:style>
-  <w:style w:type="table" w:styleId="Grillemoyenne3-Accent2">
+  <w:style w:type="table" w:styleId="MediumGrid3-Accent2">
     <w:name w:val="Medium Grid 3 Accent 2"/>
-    <w:basedOn w:val="TableauNormal"/>
+    <w:basedOn w:val="TableNormal"/>
     <w:uiPriority w:val="69"/>
     <w:rsid w:val="00CB0664"/>
     <w:pPr>
@@ -10306,9 +9951,9 @@
       </w:tcPr>
     </w:tblStylePr>
   </w:style>
-  <w:style w:type="table" w:styleId="Grillemoyenne3-Accent3">
+  <w:style w:type="table" w:styleId="MediumGrid3-Accent3">
     <w:name w:val="Medium Grid 3 Accent 3"/>
-    <w:basedOn w:val="TableauNormal"/>
+    <w:basedOn w:val="TableNormal"/>
     <w:uiPriority w:val="69"/>
     <w:rsid w:val="00CB0664"/>
     <w:pPr>
@@ -10440,9 +10085,9 @@
       </w:tcPr>
     </w:tblStylePr>
   </w:style>
-  <w:style w:type="table" w:styleId="Grillemoyenne3-Accent4">
+  <w:style w:type="table" w:styleId="MediumGrid3-Accent4">
     <w:name w:val="Medium Grid 3 Accent 4"/>
-    <w:basedOn w:val="TableauNormal"/>
+    <w:basedOn w:val="TableNormal"/>
     <w:uiPriority w:val="69"/>
     <w:rsid w:val="00CB0664"/>
     <w:pPr>
@@ -10574,9 +10219,9 @@
       </w:tcPr>
     </w:tblStylePr>
   </w:style>
-  <w:style w:type="table" w:styleId="Grillemoyenne3-Accent5">
+  <w:style w:type="table" w:styleId="MediumGrid3-Accent5">
     <w:name w:val="Medium Grid 3 Accent 5"/>
-    <w:basedOn w:val="TableauNormal"/>
+    <w:basedOn w:val="TableNormal"/>
     <w:uiPriority w:val="69"/>
     <w:rsid w:val="00CB0664"/>
     <w:pPr>
@@ -10708,9 +10353,9 @@
       </w:tcPr>
     </w:tblStylePr>
   </w:style>
-  <w:style w:type="table" w:styleId="Grillemoyenne3-Accent6">
+  <w:style w:type="table" w:styleId="MediumGrid3-Accent6">
     <w:name w:val="Medium Grid 3 Accent 6"/>
-    <w:basedOn w:val="TableauNormal"/>
+    <w:basedOn w:val="TableNormal"/>
     <w:uiPriority w:val="69"/>
     <w:rsid w:val="00CB0664"/>
     <w:pPr>
@@ -10842,9 +10487,9 @@
       </w:tcPr>
     </w:tblStylePr>
   </w:style>
-  <w:style w:type="table" w:styleId="Listefonce">
+  <w:style w:type="table" w:styleId="DarkList">
     <w:name w:val="Dark List"/>
-    <w:basedOn w:val="TableauNormal"/>
+    <w:basedOn w:val="TableNormal"/>
     <w:uiPriority w:val="70"/>
     <w:rsid w:val="00CB0664"/>
     <w:pPr>
@@ -10949,9 +10594,9 @@
       </w:tcPr>
     </w:tblStylePr>
   </w:style>
-  <w:style w:type="table" w:styleId="Listefonce-Accent1">
+  <w:style w:type="table" w:styleId="DarkList-Accent1">
     <w:name w:val="Dark List Accent 1"/>
-    <w:basedOn w:val="TableauNormal"/>
+    <w:basedOn w:val="TableNormal"/>
     <w:uiPriority w:val="70"/>
     <w:rsid w:val="00CB0664"/>
     <w:pPr>
@@ -11056,9 +10701,9 @@
       </w:tcPr>
     </w:tblStylePr>
   </w:style>
-  <w:style w:type="table" w:styleId="Listefonce-Accent2">
+  <w:style w:type="table" w:styleId="DarkList-Accent2">
     <w:name w:val="Dark List Accent 2"/>
-    <w:basedOn w:val="TableauNormal"/>
+    <w:basedOn w:val="TableNormal"/>
     <w:uiPriority w:val="70"/>
     <w:rsid w:val="00CB0664"/>
     <w:pPr>
@@ -11163,9 +10808,9 @@
       </w:tcPr>
     </w:tblStylePr>
   </w:style>
-  <w:style w:type="table" w:styleId="Listefonce-Accent3">
+  <w:style w:type="table" w:styleId="DarkList-Accent3">
     <w:name w:val="Dark List Accent 3"/>
-    <w:basedOn w:val="TableauNormal"/>
+    <w:basedOn w:val="TableNormal"/>
     <w:uiPriority w:val="70"/>
     <w:rsid w:val="00CB0664"/>
     <w:pPr>
@@ -11270,9 +10915,9 @@
       </w:tcPr>
     </w:tblStylePr>
   </w:style>
-  <w:style w:type="table" w:styleId="Listefonce-Accent4">
+  <w:style w:type="table" w:styleId="DarkList-Accent4">
     <w:name w:val="Dark List Accent 4"/>
-    <w:basedOn w:val="TableauNormal"/>
+    <w:basedOn w:val="TableNormal"/>
     <w:uiPriority w:val="70"/>
     <w:rsid w:val="00CB0664"/>
     <w:pPr>
@@ -11377,9 +11022,9 @@
       </w:tcPr>
     </w:tblStylePr>
   </w:style>
-  <w:style w:type="table" w:styleId="Listefonce-Accent5">
+  <w:style w:type="table" w:styleId="DarkList-Accent5">
     <w:name w:val="Dark List Accent 5"/>
-    <w:basedOn w:val="TableauNormal"/>
+    <w:basedOn w:val="TableNormal"/>
     <w:uiPriority w:val="70"/>
     <w:rsid w:val="00CB0664"/>
     <w:pPr>
@@ -11484,9 +11129,9 @@
       </w:tcPr>
     </w:tblStylePr>
   </w:style>
-  <w:style w:type="table" w:styleId="Listefonce-Accent6">
+  <w:style w:type="table" w:styleId="DarkList-Accent6">
     <w:name w:val="Dark List Accent 6"/>
-    <w:basedOn w:val="TableauNormal"/>
+    <w:basedOn w:val="TableNormal"/>
     <w:uiPriority w:val="70"/>
     <w:rsid w:val="00CB0664"/>
     <w:pPr>
@@ -11591,9 +11236,9 @@
       </w:tcPr>
     </w:tblStylePr>
   </w:style>
-  <w:style w:type="table" w:styleId="Tramecouleur">
+  <w:style w:type="table" w:styleId="ColorfulShading">
     <w:name w:val="Colorful Shading"/>
-    <w:basedOn w:val="TableauNormal"/>
+    <w:basedOn w:val="TableNormal"/>
     <w:uiPriority w:val="71"/>
     <w:rsid w:val="00CB0664"/>
     <w:pPr>
@@ -11706,9 +11351,9 @@
       </w:rPr>
     </w:tblStylePr>
   </w:style>
-  <w:style w:type="table" w:styleId="Tramecouleur-Accent1">
+  <w:style w:type="table" w:styleId="ColorfulShading-Accent1">
     <w:name w:val="Colorful Shading Accent 1"/>
-    <w:basedOn w:val="TableauNormal"/>
+    <w:basedOn w:val="TableNormal"/>
     <w:uiPriority w:val="71"/>
     <w:rsid w:val="00CB0664"/>
     <w:pPr>
@@ -11821,9 +11466,9 @@
       </w:rPr>
     </w:tblStylePr>
   </w:style>
-  <w:style w:type="table" w:styleId="Tramecouleur-Accent2">
+  <w:style w:type="table" w:styleId="ColorfulShading-Accent2">
     <w:name w:val="Colorful Shading Accent 2"/>
-    <w:basedOn w:val="TableauNormal"/>
+    <w:basedOn w:val="TableNormal"/>
     <w:uiPriority w:val="71"/>
     <w:rsid w:val="00CB0664"/>
     <w:pPr>
@@ -11936,9 +11581,9 @@
       </w:rPr>
     </w:tblStylePr>
   </w:style>
-  <w:style w:type="table" w:styleId="Tramecouleur-Accent3">
+  <w:style w:type="table" w:styleId="ColorfulShading-Accent3">
     <w:name w:val="Colorful Shading Accent 3"/>
-    <w:basedOn w:val="TableauNormal"/>
+    <w:basedOn w:val="TableNormal"/>
     <w:uiPriority w:val="71"/>
     <w:rsid w:val="00CB0664"/>
     <w:pPr>
@@ -12041,9 +11686,9 @@
       </w:tcPr>
     </w:tblStylePr>
   </w:style>
-  <w:style w:type="table" w:styleId="Tramecouleur-Accent4">
+  <w:style w:type="table" w:styleId="ColorfulShading-Accent4">
     <w:name w:val="Colorful Shading Accent 4"/>
-    <w:basedOn w:val="TableauNormal"/>
+    <w:basedOn w:val="TableNormal"/>
     <w:uiPriority w:val="71"/>
     <w:rsid w:val="00CB0664"/>
     <w:pPr>
@@ -12156,9 +11801,9 @@
       </w:rPr>
     </w:tblStylePr>
   </w:style>
-  <w:style w:type="table" w:styleId="Tramecouleur-Accent5">
+  <w:style w:type="table" w:styleId="ColorfulShading-Accent5">
     <w:name w:val="Colorful Shading Accent 5"/>
-    <w:basedOn w:val="TableauNormal"/>
+    <w:basedOn w:val="TableNormal"/>
     <w:uiPriority w:val="71"/>
     <w:rsid w:val="00CB0664"/>
     <w:pPr>
@@ -12271,9 +11916,9 @@
       </w:rPr>
     </w:tblStylePr>
   </w:style>
-  <w:style w:type="table" w:styleId="Tramecouleur-Accent6">
+  <w:style w:type="table" w:styleId="ColorfulShading-Accent6">
     <w:name w:val="Colorful Shading Accent 6"/>
-    <w:basedOn w:val="TableauNormal"/>
+    <w:basedOn w:val="TableNormal"/>
     <w:uiPriority w:val="71"/>
     <w:rsid w:val="00CB0664"/>
     <w:pPr>
@@ -12386,9 +12031,9 @@
       </w:rPr>
     </w:tblStylePr>
   </w:style>
-  <w:style w:type="table" w:styleId="Listecouleur">
+  <w:style w:type="table" w:styleId="ColorfulList">
     <w:name w:val="Colorful List"/>
-    <w:basedOn w:val="TableauNormal"/>
+    <w:basedOn w:val="TableNormal"/>
     <w:uiPriority w:val="72"/>
     <w:rsid w:val="00CB0664"/>
     <w:pPr>
@@ -12465,9 +12110,9 @@
       </w:tcPr>
     </w:tblStylePr>
   </w:style>
-  <w:style w:type="table" w:styleId="Listecouleur-Accent1">
+  <w:style w:type="table" w:styleId="ColorfulList-Accent1">
     <w:name w:val="Colorful List Accent 1"/>
-    <w:basedOn w:val="TableauNormal"/>
+    <w:basedOn w:val="TableNormal"/>
     <w:uiPriority w:val="72"/>
     <w:rsid w:val="00CB0664"/>
     <w:pPr>
@@ -12544,9 +12189,9 @@
       </w:tcPr>
     </w:tblStylePr>
   </w:style>
-  <w:style w:type="table" w:styleId="Listecouleur-Accent2">
+  <w:style w:type="table" w:styleId="ColorfulList-Accent2">
     <w:name w:val="Colorful List Accent 2"/>
-    <w:basedOn w:val="TableauNormal"/>
+    <w:basedOn w:val="TableNormal"/>
     <w:uiPriority w:val="72"/>
     <w:rsid w:val="00CB0664"/>
     <w:pPr>
@@ -12623,9 +12268,9 @@
       </w:tcPr>
     </w:tblStylePr>
   </w:style>
-  <w:style w:type="table" w:styleId="Listecouleur-Accent3">
+  <w:style w:type="table" w:styleId="ColorfulList-Accent3">
     <w:name w:val="Colorful List Accent 3"/>
-    <w:basedOn w:val="TableauNormal"/>
+    <w:basedOn w:val="TableNormal"/>
     <w:uiPriority w:val="72"/>
     <w:rsid w:val="00CB0664"/>
     <w:pPr>
@@ -12702,9 +12347,9 @@
       </w:tcPr>
     </w:tblStylePr>
   </w:style>
-  <w:style w:type="table" w:styleId="Listecouleur-Accent4">
+  <w:style w:type="table" w:styleId="ColorfulList-Accent4">
     <w:name w:val="Colorful List Accent 4"/>
-    <w:basedOn w:val="TableauNormal"/>
+    <w:basedOn w:val="TableNormal"/>
     <w:uiPriority w:val="72"/>
     <w:rsid w:val="00CB0664"/>
     <w:pPr>
@@ -12781,9 +12426,9 @@
       </w:tcPr>
     </w:tblStylePr>
   </w:style>
-  <w:style w:type="table" w:styleId="Listecouleur-Accent5">
+  <w:style w:type="table" w:styleId="ColorfulList-Accent5">
     <w:name w:val="Colorful List Accent 5"/>
-    <w:basedOn w:val="TableauNormal"/>
+    <w:basedOn w:val="TableNormal"/>
     <w:uiPriority w:val="72"/>
     <w:rsid w:val="00CB0664"/>
     <w:pPr>
@@ -12860,9 +12505,9 @@
       </w:tcPr>
     </w:tblStylePr>
   </w:style>
-  <w:style w:type="table" w:styleId="Listecouleur-Accent6">
+  <w:style w:type="table" w:styleId="ColorfulList-Accent6">
     <w:name w:val="Colorful List Accent 6"/>
-    <w:basedOn w:val="TableauNormal"/>
+    <w:basedOn w:val="TableNormal"/>
     <w:uiPriority w:val="72"/>
     <w:rsid w:val="00CB0664"/>
     <w:pPr>
@@ -12939,9 +12584,9 @@
       </w:tcPr>
     </w:tblStylePr>
   </w:style>
-  <w:style w:type="table" w:styleId="Grillecouleur">
+  <w:style w:type="table" w:styleId="ColorfulGrid">
     <w:name w:val="Colorful Grid"/>
-    <w:basedOn w:val="TableauNormal"/>
+    <w:basedOn w:val="TableNormal"/>
     <w:uiPriority w:val="73"/>
     <w:rsid w:val="00CB0664"/>
     <w:pPr>
@@ -13012,9 +12657,9 @@
       </w:tcPr>
     </w:tblStylePr>
   </w:style>
-  <w:style w:type="table" w:styleId="Grillecouleur-Accent1">
+  <w:style w:type="table" w:styleId="ColorfulGrid-Accent1">
     <w:name w:val="Colorful Grid Accent 1"/>
-    <w:basedOn w:val="TableauNormal"/>
+    <w:basedOn w:val="TableNormal"/>
     <w:uiPriority w:val="73"/>
     <w:rsid w:val="00CB0664"/>
     <w:pPr>
@@ -13085,9 +12730,9 @@
       </w:tcPr>
     </w:tblStylePr>
   </w:style>
-  <w:style w:type="table" w:styleId="Grillecouleur-Accent2">
+  <w:style w:type="table" w:styleId="ColorfulGrid-Accent2">
     <w:name w:val="Colorful Grid Accent 2"/>
-    <w:basedOn w:val="TableauNormal"/>
+    <w:basedOn w:val="TableNormal"/>
     <w:uiPriority w:val="73"/>
     <w:rsid w:val="00CB0664"/>
     <w:pPr>
@@ -13158,9 +12803,9 @@
       </w:tcPr>
     </w:tblStylePr>
   </w:style>
-  <w:style w:type="table" w:styleId="Grillecouleur-Accent3">
+  <w:style w:type="table" w:styleId="ColorfulGrid-Accent3">
     <w:name w:val="Colorful Grid Accent 3"/>
-    <w:basedOn w:val="TableauNormal"/>
+    <w:basedOn w:val="TableNormal"/>
     <w:uiPriority w:val="73"/>
     <w:rsid w:val="00CB0664"/>
     <w:pPr>
@@ -13231,9 +12876,9 @@
       </w:tcPr>
     </w:tblStylePr>
   </w:style>
-  <w:style w:type="table" w:styleId="Grillecouleur-Accent4">
+  <w:style w:type="table" w:styleId="ColorfulGrid-Accent4">
     <w:name w:val="Colorful Grid Accent 4"/>
-    <w:basedOn w:val="TableauNormal"/>
+    <w:basedOn w:val="TableNormal"/>
     <w:uiPriority w:val="73"/>
     <w:rsid w:val="00CB0664"/>
     <w:pPr>
@@ -13304,9 +12949,9 @@
       </w:tcPr>
     </w:tblStylePr>
   </w:style>
-  <w:style w:type="table" w:styleId="Grillecouleur-Accent5">
+  <w:style w:type="table" w:styleId="ColorfulGrid-Accent5">
     <w:name w:val="Colorful Grid Accent 5"/>
-    <w:basedOn w:val="TableauNormal"/>
+    <w:basedOn w:val="TableNormal"/>
     <w:uiPriority w:val="73"/>
     <w:rsid w:val="00CB0664"/>
     <w:pPr>
@@ -13377,9 +13022,9 @@
       </w:tcPr>
     </w:tblStylePr>
   </w:style>
-  <w:style w:type="table" w:styleId="Grillecouleur-Accent6">
+  <w:style w:type="table" w:styleId="ColorfulGrid-Accent6">
     <w:name w:val="Colorful Grid Accent 6"/>
-    <w:basedOn w:val="TableauNormal"/>
+    <w:basedOn w:val="TableNormal"/>
     <w:uiPriority w:val="73"/>
     <w:rsid w:val="00CB0664"/>
     <w:pPr>
@@ -13468,7 +13113,7 @@
   </w:style>
   <w:style w:type="character" w:customStyle="1" w:styleId="Title2Car">
     <w:name w:val="Title 2 Car"/>
-    <w:basedOn w:val="Policepardfaut"/>
+    <w:basedOn w:val="DefaultParagraphFont"/>
     <w:link w:val="Title2"/>
     <w:rsid w:val="00741173"/>
     <w:rPr>
@@ -13492,7 +13137,7 @@
   </w:style>
   <w:style w:type="character" w:customStyle="1" w:styleId="BodyCar">
     <w:name w:val="Body Car"/>
-    <w:basedOn w:val="Policepardfaut"/>
+    <w:basedOn w:val="DefaultParagraphFont"/>
     <w:link w:val="Body"/>
     <w:rsid w:val="00741173"/>
     <w:rPr>

</xml_diff>